<commit_message>
Petição Daniela Braga: fonte Lora Medium e ajuste da citação do art. 18 do CDC
Co-Authored-By: Claude Opus 5.5 <noreply@anthropic.com>
Claude-Session: https://claude.ai/code/session_01HhnpasVshMdx9Pz9yR41Yv
</commit_message>
<xml_diff>
--- a/Petição inicial - Daniela Braga/Petição inicial revisada - Daniela Braga Pereira.docx
+++ b/Petição inicial - Daniela Braga/Petição inicial revisada - Daniela Braga Pereira.docx
@@ -33,7 +33,7 @@
       </w:r>
       <w:r>
         <w:rPr>
-          <w:rFonts w:ascii="Lora SemiBold" w:hAnsi="Lora SemiBold" w:cs="Lora SemiBold" w:eastAsia="Lora SemiBold"/>
+          <w:rFonts w:ascii="Lora Medium" w:hAnsi="Lora Medium" w:cs="Lora Medium" w:eastAsia="Lora Medium"/>
         </w:rPr>
         <w:t xml:space="preserve">, inscrita no CPF nº </w:t>
       </w:r>
@@ -47,7 +47,7 @@
       </w:r>
       <w:r>
         <w:rPr>
-          <w:rFonts w:ascii="Lora SemiBold" w:hAnsi="Lora SemiBold" w:cs="Lora SemiBold" w:eastAsia="Lora SemiBold"/>
+          <w:rFonts w:ascii="Lora Medium" w:hAnsi="Lora Medium" w:cs="Lora Medium" w:eastAsia="Lora Medium"/>
         </w:rPr>
         <w:t xml:space="preserve">, residente e domiciliada na </w:t>
       </w:r>
@@ -61,7 +61,7 @@
       </w:r>
       <w:r>
         <w:rPr>
-          <w:rFonts w:ascii="Lora SemiBold" w:hAnsi="Lora SemiBold" w:cs="Lora SemiBold" w:eastAsia="Lora SemiBold"/>
+          <w:rFonts w:ascii="Lora Medium" w:hAnsi="Lora Medium" w:cs="Lora Medium" w:eastAsia="Lora Medium"/>
         </w:rPr>
         <w:t xml:space="preserve">, telefone </w:t>
       </w:r>
@@ -75,13 +75,13 @@
       </w:r>
       <w:r>
         <w:rPr>
-          <w:rFonts w:ascii="Lora SemiBold" w:hAnsi="Lora SemiBold" w:cs="Lora SemiBold" w:eastAsia="Lora SemiBold"/>
+          <w:rFonts w:ascii="Lora Medium" w:hAnsi="Lora Medium" w:cs="Lora Medium" w:eastAsia="Lora Medium"/>
         </w:rPr>
         <w:t xml:space="preserve">, por intermédio de seu advogado, constituído mediante procuração em anexo, cujo endereço físico está situado na Rua Rio Grande do Sul, nº 1641, Bairro São Miguel, Miguel Alves-PI, CEP nº: 64.130-000 e eletrônico: </w:t>
       </w:r>
       <w:r>
         <w:rPr>
-          <w:rFonts w:ascii="Lora SemiBold" w:hAnsi="Lora SemiBold" w:cs="Lora SemiBold" w:eastAsia="Lora SemiBold"/>
+          <w:rFonts w:ascii="Lora Medium" w:hAnsi="Lora Medium" w:cs="Lora Medium" w:eastAsia="Lora Medium"/>
           <w:i/>
           <w:iCs/>
         </w:rPr>
@@ -89,13 +89,13 @@
       </w:r>
       <w:r>
         <w:rPr>
-          <w:rFonts w:ascii="Lora SemiBold" w:hAnsi="Lora SemiBold" w:cs="Lora SemiBold" w:eastAsia="Lora SemiBold"/>
+          <w:rFonts w:ascii="Lora Medium" w:hAnsi="Lora Medium" w:cs="Lora Medium" w:eastAsia="Lora Medium"/>
         </w:rPr>
         <w:t xml:space="preserve">, </w:t>
       </w:r>
       <w:r>
         <w:rPr>
-          <w:rFonts w:ascii="Lora SemiBold" w:hAnsi="Lora SemiBold" w:cs="Lora SemiBold" w:eastAsia="Lora SemiBold"/>
+          <w:rFonts w:ascii="Lora Medium" w:hAnsi="Lora Medium" w:cs="Lora Medium" w:eastAsia="Lora Medium"/>
         </w:rPr>
         <w:t xml:space="preserve">vem, respeitosamente, à presença de Vossa Excelência, com fundamento nos arts. 5º, V e X, da Constituição Federal, arts. 186 e 927 do Código Civil, e, especialmente, nos arts. 4º, I, 6º, III, IV, VI e VIII, 7º, parágrafo único, 18 e demais dispositivos aplicáveis do Código de Defesa do Consumidor, propor a presente</w:t>
       </w:r>
@@ -130,7 +130,7 @@
       </w:r>
       <w:r>
         <w:rPr>
-          <w:rFonts w:ascii="Lora SemiBold" w:hAnsi="Lora SemiBold" w:cs="Lora SemiBold" w:eastAsia="Lora SemiBold"/>
+          <w:rFonts w:ascii="Lora Medium" w:hAnsi="Lora Medium" w:cs="Lora Medium" w:eastAsia="Lora Medium"/>
         </w:rPr>
         <w:t xml:space="preserve">, pessoa jurídica de direito privado, inscrita no CNPJ sob nº </w:t>
       </w:r>
@@ -144,7 +144,7 @@
       </w:r>
       <w:r>
         <w:rPr>
-          <w:rFonts w:ascii="Lora SemiBold" w:hAnsi="Lora SemiBold" w:cs="Lora SemiBold" w:eastAsia="Lora SemiBold"/>
+          <w:rFonts w:ascii="Lora Medium" w:hAnsi="Lora Medium" w:cs="Lora Medium" w:eastAsia="Lora Medium"/>
         </w:rPr>
         <w:t xml:space="preserve">, com endereço na Rua Manoel Cesar de Melo, s/n, Condomínio CBI-LOG, Galpão Sul, Módulos 4, 5 e 6, Distrito Industrial, Alhandra/PB, CEP 58320-000, endereço que consta da documentação fiscal; e</w:t>
       </w:r>
@@ -165,7 +165,7 @@
       </w:r>
       <w:r>
         <w:rPr>
-          <w:rFonts w:ascii="Lora SemiBold" w:hAnsi="Lora SemiBold" w:cs="Lora SemiBold" w:eastAsia="Lora SemiBold"/>
+          <w:rFonts w:ascii="Lora Medium" w:hAnsi="Lora Medium" w:cs="Lora Medium" w:eastAsia="Lora Medium"/>
         </w:rPr>
         <w:t xml:space="preserve">pessoa jurídica de direito privado, inscrita no CNPJ sob nº </w:t>
       </w:r>
@@ -179,7 +179,7 @@
       </w:r>
       <w:r>
         <w:rPr>
-          <w:rFonts w:ascii="Lora SemiBold" w:hAnsi="Lora SemiBold" w:cs="Lora SemiBold" w:eastAsia="Lora SemiBold"/>
+          <w:rFonts w:ascii="Lora Medium" w:hAnsi="Lora Medium" w:cs="Lora Medium" w:eastAsia="Lora Medium"/>
         </w:rPr>
         <w:t xml:space="preserve">, com endereço na Rua Olympia Semeraro, Nº 675, Jardim Santa Emília, São Paulo/SP, CEP 04183-090, fabricante dos produtos da marca </w:t>
       </w:r>
@@ -193,7 +193,7 @@
       </w:r>
       <w:r>
         <w:rPr>
-          <w:rFonts w:ascii="Lora SemiBold" w:hAnsi="Lora SemiBold" w:cs="Lora SemiBold" w:eastAsia="Lora SemiBold"/>
+          <w:rFonts w:ascii="Lora Medium" w:hAnsi="Lora Medium" w:cs="Lora Medium" w:eastAsia="Lora Medium"/>
         </w:rPr>
         <w:t xml:space="preserve">, pelos fatos e fundamentos jurídicos a seguir expostos.</w:t>
       </w:r>
@@ -250,7 +250,7 @@
       </w:pPr>
       <w:r>
         <w:rPr>
-          <w:rFonts w:ascii="Lora SemiBold" w:hAnsi="Lora SemiBold" w:cs="Lora SemiBold" w:eastAsia="Lora SemiBold"/>
+          <w:rFonts w:ascii="Lora Medium" w:hAnsi="Lora Medium" w:cs="Lora Medium" w:eastAsia="Lora Medium"/>
         </w:rPr>
         <w:t xml:space="preserve">A Autora não possui condições de arcar com as custas e despesas processuais sem prejuízo do próprio sustento e de sua família, razão pela qual requer, desde já, os benefícios da gratuidade da justiça, nos termos do art. 5º, LXXIV, da Constituição Federal e dos arts. 98 e 99 do Código de Processo Civil, </w:t>
       </w:r>
@@ -264,7 +264,7 @@
       </w:r>
       <w:r>
         <w:rPr>
-          <w:rFonts w:ascii="Lora SemiBold" w:hAnsi="Lora SemiBold" w:cs="Lora SemiBold" w:eastAsia="Lora SemiBold"/>
+          <w:rFonts w:ascii="Lora Medium" w:hAnsi="Lora Medium" w:cs="Lora Medium" w:eastAsia="Lora Medium"/>
         </w:rPr>
         <w:t xml:space="preserve"> </w:t>
       </w:r>
@@ -279,7 +279,7 @@
       </w:r>
       <w:r>
         <w:rPr>
-          <w:rFonts w:ascii="Lora SemiBold" w:hAnsi="Lora SemiBold" w:cs="Lora SemiBold" w:eastAsia="Lora SemiBold"/>
+          <w:rFonts w:ascii="Lora Medium" w:hAnsi="Lora Medium" w:cs="Lora Medium" w:eastAsia="Lora Medium"/>
         </w:rPr>
         <w:t xml:space="preserve">.</w:t>
       </w:r>
@@ -292,7 +292,7 @@
       </w:pPr>
       <w:r>
         <w:rPr>
-          <w:rFonts w:ascii="Lora SemiBold" w:hAnsi="Lora SemiBold" w:cs="Lora SemiBold" w:eastAsia="Lora SemiBold"/>
+          <w:rFonts w:ascii="Lora Medium" w:hAnsi="Lora Medium" w:cs="Lora Medium" w:eastAsia="Lora Medium"/>
         </w:rPr>
         <w:t xml:space="preserve">Embora o acesso aos Juizados Especiais independa, em primeiro grau, do pagamento de custas (art. 54 da Lei nº 9.099/1995), o pedido é formulado desde logo em razão do preparo exigido para eventual recurso, que compreende todas as despesas processuais, inclusive as dispensadas em primeiro grau (art. 54, parágrafo único, da mesma lei).</w:t>
       </w:r>
@@ -327,7 +327,7 @@
       </w:pPr>
       <w:r>
         <w:rPr>
-          <w:rFonts w:ascii="Lora SemiBold" w:hAnsi="Lora SemiBold" w:cs="Lora SemiBold" w:eastAsia="Lora SemiBold"/>
+          <w:rFonts w:ascii="Lora Medium" w:hAnsi="Lora Medium" w:cs="Lora Medium" w:eastAsia="Lora Medium"/>
         </w:rPr>
         <w:t xml:space="preserve">A parte autora manifesta interesse na realização de audiência de conciliação, nos termos do art. 319, VII, do Código de Processo Civil e do art. 21 da Lei nº 9.099/1995.</w:t>
       </w:r>
@@ -362,7 +362,7 @@
       </w:pPr>
       <w:r>
         <w:rPr>
-          <w:rFonts w:ascii="Lora SemiBold" w:hAnsi="Lora SemiBold" w:cs="Lora SemiBold" w:eastAsia="Lora SemiBold"/>
+          <w:rFonts w:ascii="Lora Medium" w:hAnsi="Lora Medium" w:cs="Lora Medium" w:eastAsia="Lora Medium"/>
         </w:rPr>
         <w:t xml:space="preserve">A presente demanda decorre de relação de consumo e tem por objeto a reparação dos danos decorrentes de vício de produto adquirido pela Autora na condição de destinatária final. Nos termos do art. 101, I, do Código de Defesa do Consumidor, a ação de responsabilidade civil do fornecedor pode ser proposta no </w:t>
       </w:r>
@@ -376,7 +376,7 @@
       </w:r>
       <w:r>
         <w:rPr>
-          <w:rFonts w:ascii="Lora SemiBold" w:hAnsi="Lora SemiBold" w:cs="Lora SemiBold" w:eastAsia="Lora SemiBold"/>
+          <w:rFonts w:ascii="Lora Medium" w:hAnsi="Lora Medium" w:cs="Lora Medium" w:eastAsia="Lora Medium"/>
         </w:rPr>
         <w:t xml:space="preserve">. </w:t>
       </w:r>
@@ -389,7 +389,7 @@
       </w:pPr>
       <w:r>
         <w:rPr>
-          <w:rFonts w:ascii="Lora SemiBold" w:hAnsi="Lora SemiBold" w:cs="Lora SemiBold" w:eastAsia="Lora SemiBold"/>
+          <w:rFonts w:ascii="Lora Medium" w:hAnsi="Lora Medium" w:cs="Lora Medium" w:eastAsia="Lora Medium"/>
         </w:rPr>
         <w:t xml:space="preserve">Assim, considerando que a Autora reside em </w:t>
       </w:r>
@@ -403,7 +403,7 @@
       </w:r>
       <w:r>
         <w:rPr>
-          <w:rFonts w:ascii="Lora SemiBold" w:hAnsi="Lora SemiBold" w:cs="Lora SemiBold" w:eastAsia="Lora SemiBold"/>
+          <w:rFonts w:ascii="Lora Medium" w:hAnsi="Lora Medium" w:cs="Lora Medium" w:eastAsia="Lora Medium"/>
         </w:rPr>
         <w:t xml:space="preserve">, é competente o Juízo da Comarca de Miguel Alves para processamento e julgamento da presente demanda.</w:t>
       </w:r>
@@ -416,7 +416,7 @@
       </w:pPr>
       <w:r>
         <w:rPr>
-          <w:rFonts w:ascii="Lora SemiBold" w:hAnsi="Lora SemiBold" w:cs="Lora SemiBold" w:eastAsia="Lora SemiBold"/>
+          <w:rFonts w:ascii="Lora Medium" w:hAnsi="Lora Medium" w:cs="Lora Medium" w:eastAsia="Lora Medium"/>
         </w:rPr>
         <w:t xml:space="preserve">No âmbito do Tribunal de Justiça do Estado do Piauí, a Vara Única da Comarca de Miguel Alves acumula competência para processamento de demandas submetidas ao procedimento dos Juizados Especiais, conforme registros oficiais do próprio Tribunal. </w:t>
       </w:r>
@@ -451,7 +451,7 @@
       </w:pPr>
       <w:r>
         <w:rPr>
-          <w:rFonts w:ascii="Lora SemiBold" w:hAnsi="Lora SemiBold" w:cs="Lora SemiBold" w:eastAsia="Lora SemiBold"/>
+          <w:rFonts w:ascii="Lora Medium" w:hAnsi="Lora Medium" w:cs="Lora Medium" w:eastAsia="Lora Medium"/>
         </w:rPr>
         <w:t xml:space="preserve">Em 03 de junho de 2025, a Autora adquiriu, por meio do site magazineluiza.com.br (pedido nº 1441970456788957), um refrigerador doméstico 2 portas, 386 L, 220V, marca Consul, modelo CRM44AKBNA, </w:t>
       </w:r>
@@ -465,7 +465,7 @@
       </w:r>
       <w:r>
         <w:rPr>
-          <w:rFonts w:ascii="Lora SemiBold" w:hAnsi="Lora SemiBold" w:cs="Lora SemiBold" w:eastAsia="Lora SemiBold"/>
+          <w:rFonts w:ascii="Lora Medium" w:hAnsi="Lora Medium" w:cs="Lora Medium" w:eastAsia="Lora Medium"/>
         </w:rPr>
         <w:t xml:space="preserve"> </w:t>
       </w:r>
@@ -480,7 +480,7 @@
       </w:r>
       <w:r>
         <w:rPr>
-          <w:rFonts w:ascii="Lora SemiBold" w:hAnsi="Lora SemiBold" w:cs="Lora SemiBold" w:eastAsia="Lora SemiBold"/>
+          <w:rFonts w:ascii="Lora Medium" w:hAnsi="Lora Medium" w:cs="Lora Medium" w:eastAsia="Lora Medium"/>
         </w:rPr>
         <w:t xml:space="preserve">.</w:t>
       </w:r>
@@ -493,7 +493,7 @@
       </w:pPr>
       <w:r>
         <w:rPr>
-          <w:rFonts w:ascii="Lora SemiBold" w:hAnsi="Lora SemiBold" w:cs="Lora SemiBold" w:eastAsia="Lora SemiBold"/>
+          <w:rFonts w:ascii="Lora Medium" w:hAnsi="Lora Medium" w:cs="Lora Medium" w:eastAsia="Lora Medium"/>
         </w:rPr>
         <w:t xml:space="preserve">A Nota Fiscal Eletrônica nº 000.496.852 foi emitida pela 1ª Ré, BUD Comércio de Eletrodomésticos Ltda., em 06 de junho de 2025, no valor total de </w:t>
       </w:r>
@@ -507,7 +507,7 @@
       </w:r>
       <w:r>
         <w:rPr>
-          <w:rFonts w:ascii="Lora SemiBold" w:hAnsi="Lora SemiBold" w:cs="Lora SemiBold" w:eastAsia="Lora SemiBold"/>
+          <w:rFonts w:ascii="Lora Medium" w:hAnsi="Lora Medium" w:cs="Lora Medium" w:eastAsia="Lora Medium"/>
         </w:rPr>
         <w:t xml:space="preserve"> (R$ 3.329,00 do produto e R$ 109,90 de frete), chave de acesso 2525 0662 0583 1800 1233 5500 1000 4968 5219 8186 8756 </w:t>
       </w:r>
@@ -522,7 +522,7 @@
       </w:r>
       <w:r>
         <w:rPr>
-          <w:rFonts w:ascii="Lora SemiBold" w:hAnsi="Lora SemiBold" w:cs="Lora SemiBold" w:eastAsia="Lora SemiBold"/>
+          <w:rFonts w:ascii="Lora Medium" w:hAnsi="Lora Medium" w:cs="Lora Medium" w:eastAsia="Lora Medium"/>
         </w:rPr>
         <w:t xml:space="preserve">.</w:t>
       </w:r>
@@ -535,7 +535,7 @@
       </w:pPr>
       <w:r>
         <w:rPr>
-          <w:rFonts w:ascii="Lora SemiBold" w:hAnsi="Lora SemiBold" w:cs="Lora SemiBold" w:eastAsia="Lora SemiBold"/>
+          <w:rFonts w:ascii="Lora Medium" w:hAnsi="Lora Medium" w:cs="Lora Medium" w:eastAsia="Lora Medium"/>
         </w:rPr>
         <w:t xml:space="preserve">Com pouco tempo de uso, o refrigerador </w:t>
       </w:r>
@@ -549,7 +549,7 @@
       </w:r>
       <w:r>
         <w:rPr>
-          <w:rFonts w:ascii="Lora SemiBold" w:hAnsi="Lora SemiBold" w:cs="Lora SemiBold" w:eastAsia="Lora SemiBold"/>
+          <w:rFonts w:ascii="Lora Medium" w:hAnsi="Lora Medium" w:cs="Lora Medium" w:eastAsia="Lora Medium"/>
         </w:rPr>
         <w:t xml:space="preserve"> e, em 23 de outubro de 2025, foi encaminhado à assistência técnica indicada pela fabricante, a autorizada Jainara da Rocha Saraiva Ltda. A visita técnica foi realizada, mas o defeito persistiu, e o produto não foi consertado no prazo de 30 dias previsto no art. 18, §1º, do CDC.</w:t>
       </w:r>
@@ -562,7 +562,7 @@
       </w:pPr>
       <w:r>
         <w:rPr>
-          <w:rFonts w:ascii="Lora SemiBold" w:hAnsi="Lora SemiBold" w:cs="Lora SemiBold" w:eastAsia="Lora SemiBold"/>
+          <w:rFonts w:ascii="Lora Medium" w:hAnsi="Lora Medium" w:cs="Lora Medium" w:eastAsia="Lora Medium"/>
         </w:rPr>
         <w:t xml:space="preserve">Em 26 de novembro de 2025, a Autora registrou reclamação no PROCON/ALEPI (atendimento nº 25.11.0023.001.00431-3) contra a autorizada, a Magazine Luiza S.A. e a Whirlpool S.A., pedindo a substituição do produto </w:t>
       </w:r>
@@ -577,7 +577,7 @@
       </w:r>
       <w:r>
         <w:rPr>
-          <w:rFonts w:ascii="Lora SemiBold" w:hAnsi="Lora SemiBold" w:cs="Lora SemiBold" w:eastAsia="Lora SemiBold"/>
+          <w:rFonts w:ascii="Lora Medium" w:hAnsi="Lora Medium" w:cs="Lora Medium" w:eastAsia="Lora Medium"/>
         </w:rPr>
         <w:t xml:space="preserve">.</w:t>
       </w:r>
@@ -590,7 +590,7 @@
       </w:pPr>
       <w:r>
         <w:rPr>
-          <w:rFonts w:ascii="Lora SemiBold" w:hAnsi="Lora SemiBold" w:cs="Lora SemiBold" w:eastAsia="Lora SemiBold"/>
+          <w:rFonts w:ascii="Lora Medium" w:hAnsi="Lora Medium" w:cs="Lora Medium" w:eastAsia="Lora Medium"/>
         </w:rPr>
         <w:t xml:space="preserve">Em resposta datada de 03 de dezembro de 2025, a Whirlpool S.A. </w:t>
       </w:r>
@@ -604,7 +604,7 @@
       </w:r>
       <w:r>
         <w:rPr>
-          <w:rFonts w:ascii="Lora SemiBold" w:hAnsi="Lora SemiBold" w:cs="Lora SemiBold" w:eastAsia="Lora SemiBold"/>
+          <w:rFonts w:ascii="Lora Medium" w:hAnsi="Lora Medium" w:cs="Lora Medium" w:eastAsia="Lora Medium"/>
         </w:rPr>
         <w:t xml:space="preserve">, informando que a troca estava em análise </w:t>
       </w:r>
@@ -619,7 +619,7 @@
       </w:r>
       <w:r>
         <w:rPr>
-          <w:rFonts w:ascii="Lora SemiBold" w:hAnsi="Lora SemiBold" w:cs="Lora SemiBold" w:eastAsia="Lora SemiBold"/>
+          <w:rFonts w:ascii="Lora Medium" w:hAnsi="Lora Medium" w:cs="Lora Medium" w:eastAsia="Lora Medium"/>
         </w:rPr>
         <w:t xml:space="preserve">.</w:t>
       </w:r>
@@ -632,7 +632,7 @@
       </w:pPr>
       <w:r>
         <w:rPr>
-          <w:rFonts w:ascii="Lora SemiBold" w:hAnsi="Lora SemiBold" w:cs="Lora SemiBold" w:eastAsia="Lora SemiBold"/>
+          <w:rFonts w:ascii="Lora Medium" w:hAnsi="Lora Medium" w:cs="Lora Medium" w:eastAsia="Lora Medium"/>
         </w:rPr>
         <w:t xml:space="preserve">Em 11 de dezembro de 2025, a 2ª Ré realizou a troca, na modalidade “coleta simultânea”: recolheu o aparelho da Autora e entregou outra unidade do mesmo modelo. A operação está documentada na NF-e nº 000.263.479, emitida pela Whirlpool S.A. (CNPJ 59.105.999/0039-59), que registra o recolhimento do refrigerador CRM44AKBNA com o motivo expresso </w:t>
       </w:r>
@@ -646,7 +646,7 @@
       </w:r>
       <w:r>
         <w:rPr>
-          <w:rFonts w:ascii="Lora SemiBold" w:hAnsi="Lora SemiBold" w:cs="Lora SemiBold" w:eastAsia="Lora SemiBold"/>
+          <w:rFonts w:ascii="Lora Medium" w:hAnsi="Lora Medium" w:cs="Lora Medium" w:eastAsia="Lora Medium"/>
         </w:rPr>
         <w:t xml:space="preserve"> e faz referência à nota de entrega do novo produto, NF nº 005064874-1 </w:t>
       </w:r>
@@ -661,7 +661,7 @@
       </w:r>
       <w:r>
         <w:rPr>
-          <w:rFonts w:ascii="Lora SemiBold" w:hAnsi="Lora SemiBold" w:cs="Lora SemiBold" w:eastAsia="Lora SemiBold"/>
+          <w:rFonts w:ascii="Lora Medium" w:hAnsi="Lora Medium" w:cs="Lora Medium" w:eastAsia="Lora Medium"/>
         </w:rPr>
         <w:t xml:space="preserve">.</w:t>
       </w:r>
@@ -674,7 +674,7 @@
       </w:pPr>
       <w:r>
         <w:rPr>
-          <w:rFonts w:ascii="Lora SemiBold" w:hAnsi="Lora SemiBold" w:cs="Lora SemiBold" w:eastAsia="Lora SemiBold"/>
+          <w:rFonts w:ascii="Lora Medium" w:hAnsi="Lora Medium" w:cs="Lora Medium" w:eastAsia="Lora Medium"/>
         </w:rPr>
         <w:t xml:space="preserve">O aparelho entregue nessa troca, contudo, não era novo: apresentava amassados e deformações na chapa da porta, ruptura da borda junto à dobradiça e resíduos de cola e vedante aplicados nas junções, características de equipamento recuperado, conforme as fotografias abaixo </w:t>
       </w:r>
@@ -689,7 +689,7 @@
       </w:r>
       <w:r>
         <w:rPr>
-          <w:rFonts w:ascii="Lora SemiBold" w:hAnsi="Lora SemiBold" w:cs="Lora SemiBold" w:eastAsia="Lora SemiBold"/>
+          <w:rFonts w:ascii="Lora Medium" w:hAnsi="Lora Medium" w:cs="Lora Medium" w:eastAsia="Lora Medium"/>
         </w:rPr>
         <w:t xml:space="preserve">:</w:t>
       </w:r>
@@ -941,7 +941,7 @@
       </w:pPr>
       <w:r>
         <w:rPr>
-          <w:rFonts w:ascii="Lora SemiBold" w:hAnsi="Lora SemiBold" w:cs="Lora SemiBold" w:eastAsia="Lora SemiBold"/>
+          <w:rFonts w:ascii="Lora Medium" w:hAnsi="Lora Medium" w:cs="Lora Medium" w:eastAsia="Lora Medium"/>
         </w:rPr>
         <w:t xml:space="preserve">Tais condições são incompatíveis com produto novo e com a exigência legal de substituição por outro da mesma espécie </w:t>
       </w:r>
@@ -955,7 +955,7 @@
       </w:r>
       <w:r>
         <w:rPr>
-          <w:rFonts w:ascii="Lora SemiBold" w:hAnsi="Lora SemiBold" w:cs="Lora SemiBold" w:eastAsia="Lora SemiBold"/>
+          <w:rFonts w:ascii="Lora Medium" w:hAnsi="Lora Medium" w:cs="Lora Medium" w:eastAsia="Lora Medium"/>
         </w:rPr>
         <w:t xml:space="preserve"> (art. 18, §1º, I, do CDC). A reclamação prosseguiu no PROCON, que designou audiência de conciliação para 03 de março de 2026.</w:t>
       </w:r>
@@ -968,7 +968,7 @@
       </w:pPr>
       <w:r>
         <w:rPr>
-          <w:rFonts w:ascii="Lora SemiBold" w:hAnsi="Lora SemiBold" w:cs="Lora SemiBold" w:eastAsia="Lora SemiBold"/>
+          <w:rFonts w:ascii="Lora Medium" w:hAnsi="Lora Medium" w:cs="Lora Medium" w:eastAsia="Lora Medium"/>
         </w:rPr>
         <w:t xml:space="preserve">Na audiência, a 2ª Ré propôs, e a Autora aceitou, a troca do produto pelo modelo superior </w:t>
       </w:r>
@@ -982,7 +982,7 @@
       </w:r>
       <w:r>
         <w:rPr>
-          <w:rFonts w:ascii="Lora SemiBold" w:hAnsi="Lora SemiBold" w:cs="Lora SemiBold" w:eastAsia="Lora SemiBold"/>
+          <w:rFonts w:ascii="Lora Medium" w:hAnsi="Lora Medium" w:cs="Lora Medium" w:eastAsia="Lora Medium"/>
         </w:rPr>
         <w:t xml:space="preserve">, a ser entregue em até 30 dias úteis, com recolhimento do aparelho anterior </w:t>
       </w:r>
@@ -997,7 +997,7 @@
       </w:r>
       <w:r>
         <w:rPr>
-          <w:rFonts w:ascii="Lora SemiBold" w:hAnsi="Lora SemiBold" w:cs="Lora SemiBold" w:eastAsia="Lora SemiBold"/>
+          <w:rFonts w:ascii="Lora Medium" w:hAnsi="Lora Medium" w:cs="Lora Medium" w:eastAsia="Lora Medium"/>
         </w:rPr>
         <w:t xml:space="preserve">. O termo limitou-se a essa obrigação de troca e não conferiu quitação a qualquer das partes. O acordo foi homologado pelo CEJUSC da Comarca de Teresina em 08 de março de 2026 (processo nº 0812504-87.2026.8.18.0140) </w:t>
       </w:r>
@@ -1012,7 +1012,7 @@
       </w:r>
       <w:r>
         <w:rPr>
-          <w:rFonts w:ascii="Lora SemiBold" w:hAnsi="Lora SemiBold" w:cs="Lora SemiBold" w:eastAsia="Lora SemiBold"/>
+          <w:rFonts w:ascii="Lora Medium" w:hAnsi="Lora Medium" w:cs="Lora Medium" w:eastAsia="Lora Medium"/>
         </w:rPr>
         <w:t xml:space="preserve">.</w:t>
       </w:r>
@@ -1025,7 +1025,7 @@
       </w:pPr>
       <w:r>
         <w:rPr>
-          <w:rFonts w:ascii="Lora SemiBold" w:hAnsi="Lora SemiBold" w:cs="Lora SemiBold" w:eastAsia="Lora SemiBold"/>
+          <w:rFonts w:ascii="Lora Medium" w:hAnsi="Lora Medium" w:cs="Lora Medium" w:eastAsia="Lora Medium"/>
         </w:rPr>
         <w:t xml:space="preserve">O refrigerador CRM50MK foi entregue em </w:t>
       </w:r>
@@ -1040,7 +1040,7 @@
       </w:r>
       <w:r>
         <w:rPr>
-          <w:rFonts w:ascii="Lora SemiBold" w:hAnsi="Lora SemiBold" w:cs="Lora SemiBold" w:eastAsia="Lora SemiBold"/>
+          <w:rFonts w:ascii="Lora Medium" w:hAnsi="Lora Medium" w:cs="Lora Medium" w:eastAsia="Lora Medium"/>
         </w:rPr>
         <w:t xml:space="preserve">. Em </w:t>
       </w:r>
@@ -1055,7 +1055,7 @@
       </w:r>
       <w:r>
         <w:rPr>
-          <w:rFonts w:ascii="Lora SemiBold" w:hAnsi="Lora SemiBold" w:cs="Lora SemiBold" w:eastAsia="Lora SemiBold"/>
+          <w:rFonts w:ascii="Lora Medium" w:hAnsi="Lora Medium" w:cs="Lora Medium" w:eastAsia="Lora Medium"/>
         </w:rPr>
         <w:t xml:space="preserve">, também ele passou a apresentar defeito </w:t>
       </w:r>
@@ -1070,7 +1070,7 @@
       </w:r>
       <w:r>
         <w:rPr>
-          <w:rFonts w:ascii="Lora SemiBold" w:hAnsi="Lora SemiBold" w:cs="Lora SemiBold" w:eastAsia="Lora SemiBold"/>
+          <w:rFonts w:ascii="Lora Medium" w:hAnsi="Lora Medium" w:cs="Lora Medium" w:eastAsia="Lora Medium"/>
         </w:rPr>
         <w:t xml:space="preserve">. A Autora acionou o atendimento oficial da Consul, que encaminhou o caso à mesma assistência técnica autorizada, Jainara da Rocha Saraiva </w:t>
       </w:r>
@@ -1085,7 +1085,7 @@
       </w:r>
       <w:r>
         <w:rPr>
-          <w:rFonts w:ascii="Lora SemiBold" w:hAnsi="Lora SemiBold" w:cs="Lora SemiBold" w:eastAsia="Lora SemiBold"/>
+          <w:rFonts w:ascii="Lora Medium" w:hAnsi="Lora Medium" w:cs="Lora Medium" w:eastAsia="Lora Medium"/>
         </w:rPr>
         <w:t xml:space="preserve">. </w:t>
       </w:r>
@@ -1100,7 +1100,7 @@
       </w:r>
       <w:r>
         <w:rPr>
-          <w:rFonts w:ascii="Lora SemiBold" w:hAnsi="Lora SemiBold" w:cs="Lora SemiBold" w:eastAsia="Lora SemiBold"/>
+          <w:rFonts w:ascii="Lora Medium" w:hAnsi="Lora Medium" w:cs="Lora Medium" w:eastAsia="Lora Medium"/>
         </w:rPr>
         <w:t xml:space="preserve">.</w:t>
       </w:r>
@@ -1113,7 +1113,7 @@
       </w:pPr>
       <w:r>
         <w:rPr>
-          <w:rFonts w:ascii="Lora SemiBold" w:hAnsi="Lora SemiBold" w:cs="Lora SemiBold" w:eastAsia="Lora SemiBold"/>
+          <w:rFonts w:ascii="Lora Medium" w:hAnsi="Lora Medium" w:cs="Lora Medium" w:eastAsia="Lora Medium"/>
         </w:rPr>
         <w:t xml:space="preserve">Atualmente, a Autora está privada de refrigerador em funcionamento e utiliza a geladeira de sua mãe para as necessidades domésticas básicas, enquanto o CRM50MK permanece sem uso em sua residência </w:t>
       </w:r>
@@ -1128,7 +1128,7 @@
       </w:r>
       <w:r>
         <w:rPr>
-          <w:rFonts w:ascii="Lora SemiBold" w:hAnsi="Lora SemiBold" w:cs="Lora SemiBold" w:eastAsia="Lora SemiBold"/>
+          <w:rFonts w:ascii="Lora Medium" w:hAnsi="Lora Medium" w:cs="Lora Medium" w:eastAsia="Lora Medium"/>
         </w:rPr>
         <w:t xml:space="preserve">.</w:t>
       </w:r>
@@ -1141,7 +1141,7 @@
       </w:pPr>
       <w:r>
         <w:rPr>
-          <w:rFonts w:ascii="Lora SemiBold" w:hAnsi="Lora SemiBold" w:cs="Lora SemiBold" w:eastAsia="Lora SemiBold"/>
+          <w:rFonts w:ascii="Lora Medium" w:hAnsi="Lora Medium" w:cs="Lora Medium" w:eastAsia="Lora Medium"/>
         </w:rPr>
         <w:t xml:space="preserve">Esgotadas as tentativas de solução administrativa, inclusive perante o PROCON, não restou à consumidora alternativa senão buscar a tutela jurisdicional.</w:t>
       </w:r>
@@ -1198,7 +1198,7 @@
       </w:pPr>
       <w:r>
         <w:rPr>
-          <w:rFonts w:ascii="Lora SemiBold" w:hAnsi="Lora SemiBold" w:cs="Lora SemiBold" w:eastAsia="Lora SemiBold"/>
+          <w:rFonts w:ascii="Lora Medium" w:hAnsi="Lora Medium" w:cs="Lora Medium" w:eastAsia="Lora Medium"/>
         </w:rPr>
         <w:t xml:space="preserve">A relação jurídica estabelecida entre as partes é inequivocamente de consumo. A Autora adquiriu, como destinatária final, um refrigerador doméstico, enquanto as Rés integram a cadeia de fornecimento do produto, sendo a primeira responsável pela comercialização e a segunda fabricante do eletrodoméstico da marca Consul.</w:t>
       </w:r>
@@ -1211,7 +1211,7 @@
       </w:pPr>
       <w:r>
         <w:rPr>
-          <w:rFonts w:ascii="Lora SemiBold" w:hAnsi="Lora SemiBold" w:cs="Lora SemiBold" w:eastAsia="Lora SemiBold"/>
+          <w:rFonts w:ascii="Lora Medium" w:hAnsi="Lora Medium" w:cs="Lora Medium" w:eastAsia="Lora Medium"/>
         </w:rPr>
         <w:t xml:space="preserve">O art. 18 do Código de Defesa do Consumidor estabelece expressamente a </w:t>
       </w:r>
@@ -1225,7 +1225,7 @@
       </w:r>
       <w:r>
         <w:rPr>
-          <w:rFonts w:ascii="Lora SemiBold" w:hAnsi="Lora SemiBold" w:cs="Lora SemiBold" w:eastAsia="Lora SemiBold"/>
+          <w:rFonts w:ascii="Lora Medium" w:hAnsi="Lora Medium" w:cs="Lora Medium" w:eastAsia="Lora Medium"/>
         </w:rPr>
         <w:t xml:space="preserve"> pelos vícios de qualidade que tornem o produto impróprio ou inadequado ao consumo ou diminuam seu valor. </w:t>
       </w:r>
@@ -1238,7 +1238,7 @@
       </w:pPr>
       <w:r>
         <w:rPr>
-          <w:rFonts w:ascii="Lora SemiBold" w:hAnsi="Lora SemiBold" w:cs="Lora SemiBold" w:eastAsia="Lora SemiBold"/>
+          <w:rFonts w:ascii="Lora Medium" w:hAnsi="Lora Medium" w:cs="Lora Medium" w:eastAsia="Lora Medium"/>
         </w:rPr>
         <w:t xml:space="preserve">A solidariedade decorre da própria estrutura da relação de consumo, não sendo admissível que comerciante e fabricante transfiram entre si a responsabilidade pela solução de um vício apresentado pelo produto colocado no mercado.</w:t>
       </w:r>
@@ -1251,7 +1251,7 @@
       </w:pPr>
       <w:r>
         <w:rPr>
-          <w:rFonts w:ascii="Lora SemiBold" w:hAnsi="Lora SemiBold" w:cs="Lora SemiBold" w:eastAsia="Lora SemiBold"/>
+          <w:rFonts w:ascii="Lora Medium" w:hAnsi="Lora Medium" w:cs="Lora Medium" w:eastAsia="Lora Medium"/>
         </w:rPr>
         <w:t xml:space="preserve">No caso concreto, a responsabilidade da fabricante é ainda mais evidente: a venda foi realizada pela loja Consul, e a própria Whirlpool S.A. conduziu a troca em garantia (NF-e nº 000.263.479) e firmou o acordo perante o PROCON.</w:t>
       </w:r>
@@ -1264,7 +1264,7 @@
       </w:pPr>
       <w:r>
         <w:rPr>
-          <w:rFonts w:ascii="Lora SemiBold" w:hAnsi="Lora SemiBold" w:cs="Lora SemiBold" w:eastAsia="Lora SemiBold"/>
+          <w:rFonts w:ascii="Lora Medium" w:hAnsi="Lora Medium" w:cs="Lora Medium" w:eastAsia="Lora Medium"/>
         </w:rPr>
         <w:t xml:space="preserve">Também não socorre a comerciante eventual invocação do art. 13 do CDC, que disciplina a responsabilidade pelo fato do produto (acidente de consumo), e não o vício do produto, regido pelo art. 18. Nesse sentido, o Tribunal de Justiça do Piauí:</w:t>
       </w:r>
@@ -1281,7 +1281,7 @@
       </w:pPr>
       <w:r>
         <w:rPr>
-          <w:rFonts w:ascii="Lora SemiBold" w:hAnsi="Lora SemiBold" w:cs="Lora SemiBold" w:eastAsia="Lora SemiBold"/>
+          <w:rFonts w:ascii="Lora Medium" w:hAnsi="Lora Medium" w:cs="Lora Medium" w:eastAsia="Lora Medium"/>
           <w:sz w:val="18"/>
           <w:szCs w:val="18"/>
         </w:rPr>
@@ -1299,7 +1299,7 @@
       </w:r>
       <w:r>
         <w:rPr>
-          <w:rFonts w:ascii="Lora SemiBold" w:hAnsi="Lora SemiBold" w:cs="Lora SemiBold" w:eastAsia="Lora SemiBold"/>
+          <w:rFonts w:ascii="Lora Medium" w:hAnsi="Lora Medium" w:cs="Lora Medium" w:eastAsia="Lora Medium"/>
           <w:sz w:val="18"/>
           <w:szCs w:val="18"/>
         </w:rPr>
@@ -1318,7 +1318,7 @@
       </w:pPr>
       <w:r>
         <w:rPr>
-          <w:rFonts w:ascii="Lora SemiBold" w:hAnsi="Lora SemiBold" w:cs="Lora SemiBold" w:eastAsia="Lora SemiBold"/>
+          <w:rFonts w:ascii="Lora Medium" w:hAnsi="Lora Medium" w:cs="Lora Medium" w:eastAsia="Lora Medium"/>
           <w:sz w:val="18"/>
           <w:szCs w:val="18"/>
         </w:rPr>
@@ -1333,7 +1333,7 @@
       </w:pPr>
       <w:r>
         <w:rPr>
-          <w:rFonts w:ascii="Lora SemiBold" w:hAnsi="Lora SemiBold" w:cs="Lora SemiBold" w:eastAsia="Lora SemiBold"/>
+          <w:rFonts w:ascii="Lora Medium" w:hAnsi="Lora Medium" w:cs="Lora Medium" w:eastAsia="Lora Medium"/>
         </w:rPr>
         <w:t xml:space="preserve">No mesmo sentido é a pacífica jurisprudência do Superior Tribunal de Justiça:</w:t>
       </w:r>
@@ -1350,7 +1350,7 @@
       </w:pPr>
       <w:r>
         <w:rPr>
-          <w:rFonts w:ascii="Lora SemiBold" w:hAnsi="Lora SemiBold" w:cs="Lora SemiBold" w:eastAsia="Lora SemiBold"/>
+          <w:rFonts w:ascii="Lora Medium" w:hAnsi="Lora Medium" w:cs="Lora Medium" w:eastAsia="Lora Medium"/>
           <w:sz w:val="18"/>
           <w:szCs w:val="18"/>
         </w:rPr>
@@ -1368,7 +1368,7 @@
       </w:r>
       <w:r>
         <w:rPr>
-          <w:rFonts w:ascii="Lora SemiBold" w:hAnsi="Lora SemiBold" w:cs="Lora SemiBold" w:eastAsia="Lora SemiBold"/>
+          <w:rFonts w:ascii="Lora Medium" w:hAnsi="Lora Medium" w:cs="Lora Medium" w:eastAsia="Lora Medium"/>
           <w:sz w:val="18"/>
           <w:szCs w:val="18"/>
         </w:rPr>
@@ -1386,7 +1386,7 @@
       </w:r>
       <w:r>
         <w:rPr>
-          <w:rFonts w:ascii="Lora SemiBold" w:hAnsi="Lora SemiBold" w:cs="Lora SemiBold" w:eastAsia="Lora SemiBold"/>
+          <w:rFonts w:ascii="Lora Medium" w:hAnsi="Lora Medium" w:cs="Lora Medium" w:eastAsia="Lora Medium"/>
           <w:sz w:val="18"/>
           <w:szCs w:val="18"/>
         </w:rPr>
@@ -1423,7 +1423,7 @@
       </w:pPr>
       <w:r>
         <w:rPr>
-          <w:rFonts w:ascii="Lora SemiBold" w:hAnsi="Lora SemiBold" w:cs="Lora SemiBold" w:eastAsia="Lora SemiBold"/>
+          <w:rFonts w:ascii="Lora Medium" w:hAnsi="Lora Medium" w:cs="Lora Medium" w:eastAsia="Lora Medium"/>
         </w:rPr>
         <w:t xml:space="preserve">O acordo firmado no PROCON em 03 de março de 2026 e homologado em 08 de março de 2026 (processo nº 0812504-87.2026.8.18.0140) não impede a presente demanda. Seu objeto restringiu-se à troca do produto pelo modelo CRM50MK, sem renúncia de direitos e sem quitação geral quanto aos fatos anteriores.</w:t>
       </w:r>
@@ -1436,7 +1436,7 @@
       </w:pPr>
       <w:r>
         <w:rPr>
-          <w:rFonts w:ascii="Lora SemiBold" w:hAnsi="Lora SemiBold" w:cs="Lora SemiBold" w:eastAsia="Lora SemiBold"/>
+          <w:rFonts w:ascii="Lora Medium" w:hAnsi="Lora Medium" w:cs="Lora Medium" w:eastAsia="Lora Medium"/>
         </w:rPr>
         <w:t xml:space="preserve">A transação interpreta-se restritivamente (art. 843 do Código Civil), e a coisa julgada decorrente da homologação alcança apenas a questão efetivamente resolvida, ou seja, a obrigação de troca (art. 503 do CPC). Essa obrigação foi cumprida. O novo refrigerador passou então a estar coberto pela mesma garantia legal, e o defeito que nele surgiu constitui </w:t>
       </w:r>
@@ -1450,7 +1450,7 @@
       </w:r>
       <w:r>
         <w:rPr>
-          <w:rFonts w:ascii="Lora SemiBold" w:hAnsi="Lora SemiBold" w:cs="Lora SemiBold" w:eastAsia="Lora SemiBold"/>
+          <w:rFonts w:ascii="Lora Medium" w:hAnsi="Lora Medium" w:cs="Lora Medium" w:eastAsia="Lora Medium"/>
         </w:rPr>
         <w:t xml:space="preserve">, com causa de pedir própria, não abrangida pela transação nem pela sentença homologatória.</w:t>
       </w:r>
@@ -1463,7 +1463,7 @@
       </w:pPr>
       <w:r>
         <w:rPr>
-          <w:rFonts w:ascii="Lora SemiBold" w:hAnsi="Lora SemiBold" w:cs="Lora SemiBold" w:eastAsia="Lora SemiBold"/>
+          <w:rFonts w:ascii="Lora Medium" w:hAnsi="Lora Medium" w:cs="Lora Medium" w:eastAsia="Lora Medium"/>
         </w:rPr>
         <w:t xml:space="preserve">Não há, portanto, coisa julgada a ser reconhecida. Nos termos do art. 337, §§ 2º e 4º, do CPC, só há coisa julgada quando se repete ação idêntica, com as mesmas partes, a </w:t>
       </w:r>
@@ -1477,7 +1477,7 @@
       </w:r>
       <w:r>
         <w:rPr>
-          <w:rFonts w:ascii="Lora SemiBold" w:hAnsi="Lora SemiBold" w:cs="Lora SemiBold" w:eastAsia="Lora SemiBold"/>
+          <w:rFonts w:ascii="Lora Medium" w:hAnsi="Lora Medium" w:cs="Lora Medium" w:eastAsia="Lora Medium"/>
         </w:rPr>
         <w:t xml:space="preserve"> e o </w:t>
       </w:r>
@@ -1491,7 +1491,7 @@
       </w:r>
       <w:r>
         <w:rPr>
-          <w:rFonts w:ascii="Lora SemiBold" w:hAnsi="Lora SemiBold" w:cs="Lora SemiBold" w:eastAsia="Lora SemiBold"/>
+          <w:rFonts w:ascii="Lora Medium" w:hAnsi="Lora Medium" w:cs="Lora Medium" w:eastAsia="Lora Medium"/>
         </w:rPr>
         <w:t xml:space="preserve">. A homologação teve por causa de pedir o vício do refrigerador CRM44AKBNA e por pedido a sua substituição. A presente ação funda-se no vício superveniente do refrigerador CRM50MK e pede a resolução do contrato, a restituição do preço e a indenização dos danos. Faltam, assim, dois dos três elementos de identidade.</w:t>
       </w:r>
@@ -1504,7 +1504,7 @@
       </w:pPr>
       <w:r>
         <w:rPr>
-          <w:rFonts w:ascii="Lora SemiBold" w:hAnsi="Lora SemiBold" w:cs="Lora SemiBold" w:eastAsia="Lora SemiBold"/>
+          <w:rFonts w:ascii="Lora Medium" w:hAnsi="Lora Medium" w:cs="Lora Medium" w:eastAsia="Lora Medium"/>
         </w:rPr>
         <w:t xml:space="preserve">O histórico anterior, por sua vez, não é rediscutido como obrigação autônoma. Ele demonstra a reiteração do vício e o tempo despendido pela consumidora, elementos relevantes para a escolha da restituição (art. 18, §§1º e 3º, do CDC) e para a configuração do dano moral.</w:t>
       </w:r>
@@ -1539,7 +1539,7 @@
       </w:pPr>
       <w:r>
         <w:rPr>
-          <w:rFonts w:ascii="Lora SemiBold" w:hAnsi="Lora SemiBold" w:cs="Lora SemiBold" w:eastAsia="Lora SemiBold"/>
+          <w:rFonts w:ascii="Lora Medium" w:hAnsi="Lora Medium" w:cs="Lora Medium" w:eastAsia="Lora Medium"/>
         </w:rPr>
         <w:t xml:space="preserve">O caso não se resume a um defeito pontual apresentado por um produto recém-adquirido.</w:t>
       </w:r>
@@ -1552,7 +1552,7 @@
       </w:pPr>
       <w:r>
         <w:rPr>
-          <w:rFonts w:ascii="Lora SemiBold" w:hAnsi="Lora SemiBold" w:cs="Lora SemiBold" w:eastAsia="Lora SemiBold"/>
+          <w:rFonts w:ascii="Lora Medium" w:hAnsi="Lora Medium" w:cs="Lora Medium" w:eastAsia="Lora Medium"/>
         </w:rPr>
         <w:t xml:space="preserve">O que existe é uma </w:t>
       </w:r>
@@ -1566,7 +1566,7 @@
       </w:r>
       <w:r>
         <w:rPr>
-          <w:rFonts w:ascii="Lora SemiBold" w:hAnsi="Lora SemiBold" w:cs="Lora SemiBold" w:eastAsia="Lora SemiBold"/>
+          <w:rFonts w:ascii="Lora Medium" w:hAnsi="Lora Medium" w:cs="Lora Medium" w:eastAsia="Lora Medium"/>
         </w:rPr>
         <w:t xml:space="preserve">, sem que a consumidora tenha conseguido obter um produto adequado e funcional.</w:t>
       </w:r>
@@ -1579,7 +1579,7 @@
       </w:pPr>
       <w:r>
         <w:rPr>
-          <w:rFonts w:ascii="Lora SemiBold" w:hAnsi="Lora SemiBold" w:cs="Lora SemiBold" w:eastAsia="Lora SemiBold"/>
+          <w:rFonts w:ascii="Lora Medium" w:hAnsi="Lora Medium" w:cs="Lora Medium" w:eastAsia="Lora Medium"/>
         </w:rPr>
         <w:t xml:space="preserve">O art. 18 do CDC estabelece:</w:t>
       </w:r>
@@ -1596,11 +1596,26 @@
       </w:pPr>
       <w:r>
         <w:rPr>
-          <w:rFonts w:ascii="Lora SemiBold" w:hAnsi="Lora SemiBold" w:cs="Lora SemiBold" w:eastAsia="Lora SemiBold"/>
-          <w:sz w:val="18"/>
-          <w:szCs w:val="18"/>
-        </w:rPr>
-        <w:t xml:space="preserve">“Os fornecedores de produtos de consumo duráveis ou não duráveis respondem solidariamente pelos vícios de qualidade ou quantidade que os tornem impróprios ou inadequados ao consumo a que se destinam ou lhes diminuam o valor (...)”.</w:t>
+          <w:rFonts w:ascii="Lora Medium" w:hAnsi="Lora Medium" w:cs="Lora Medium" w:eastAsia="Lora Medium"/>
+          <w:i/>
+          <w:iCs/>
+          <w:sz w:val="18"/>
+          <w:szCs w:val="18"/>
+        </w:rPr>
+        <w:t xml:space="preserve">“Art. 18. Os fornecedores de produtos de consumo duráveis ou não duráveis respondem solidariamente pelos vícios de qualidade ou quantidade que os tornem impróprios ou inadequados ao consumo a que se destinam ou lhes diminuam o valor (...)”</w:t>
+      </w:r>
+    </w:p>
+    <w:p>
+      <w:pPr>
+        <w:spacing w:after="60" w:line="360"/>
+        <w:ind w:firstLine="850"/>
+        <w:jc w:val="both"/>
+      </w:pPr>
+      <w:r>
+        <w:rPr>
+          <w:rFonts w:ascii="Lora Medium" w:hAnsi="Lora Medium" w:cs="Lora Medium" w:eastAsia="Lora Medium"/>
+        </w:rPr>
+        <w:t xml:space="preserve">E estabelece, em seu § 1º:</w:t>
       </w:r>
     </w:p>
     <w:p>
@@ -1611,40 +1626,36 @@
         </w:pBdr>
         <w:spacing w:before="160" w:after="200" w:line="240"/>
         <w:ind w:left="2270" w:right="570"/>
-        <w:jc w:val="both"/>
-      </w:pPr>
-      <w:r>
-        <w:rPr>
-          <w:rFonts w:ascii="Lora SemiBold" w:hAnsi="Lora SemiBold" w:cs="Lora SemiBold" w:eastAsia="Lora SemiBold"/>
-          <w:sz w:val="18"/>
-          <w:szCs w:val="18"/>
-        </w:rPr>
-        <w:t xml:space="preserve">E estabelece, em seu §1º, que, não sendo o vício sanado no prazo máximo de 30 dias, o consumidor poderá escolher entre:</w:t>
-      </w:r>
-    </w:p>
-    <w:p>
-      <w:pPr>
-        <w:tabs>
-          <w:tab w:val="left" w:pos="1000"/>
-        </w:tabs>
-        <w:spacing w:after="60" w:line="360"/>
-        <w:ind w:left="1000" w:hanging="400"/>
-        <w:jc w:val="both"/>
-      </w:pPr>
-      <w:r>
-        <w:rPr>
-          <w:rFonts w:ascii="Lora SemiBold" w:hAnsi="Lora SemiBold" w:cs="Lora SemiBold" w:eastAsia="Lora SemiBold"/>
-        </w:rPr>
-        <w:t xml:space="preserve">1.</w:t>
-        <w:tab/>
-      </w:r>
-      <w:r>
-        <w:rPr>
-          <w:rFonts w:ascii="Lora SemiBold" w:hAnsi="Lora SemiBold" w:cs="Lora SemiBold" w:eastAsia="Lora SemiBold"/>
+        <w:jc w:val="left"/>
+      </w:pPr>
+      <w:r>
+        <w:rPr>
+          <w:rFonts w:ascii="Lora Medium" w:hAnsi="Lora Medium" w:cs="Lora Medium" w:eastAsia="Lora Medium"/>
           <w:i/>
           <w:iCs/>
-        </w:rPr>
-        <w:t xml:space="preserve">a substituição do produto;</w:t>
+          <w:sz w:val="18"/>
+          <w:szCs w:val="18"/>
+        </w:rPr>
+        <w:t xml:space="preserve">§ 1º Não sendo o vício sanado no prazo máximo de trinta dias, pode o consumidor exigir, alternativamente e à sua escolha:</w:t>
+        <w:br/>
+        <w:t xml:space="preserve">I - a substituição do produto por outro da mesma espécie, em perfeitas condições de uso;</w:t>
+        <w:br/>
+        <w:t xml:space="preserve">II - a restituição imediata da quantia paga, monetariamente atualizada, sem prejuízo de eventuais perdas e danos;</w:t>
+        <w:br/>
+        <w:t xml:space="preserve">III - o abatimento proporcional do preço.</w:t>
+      </w:r>
+    </w:p>
+    <w:p>
+      <w:pPr>
+        <w:spacing w:after="60" w:line="360"/>
+        <w:ind w:firstLine="850"/>
+        <w:jc w:val="both"/>
+      </w:pPr>
+      <w:r>
+        <w:rPr>
+          <w:rFonts w:ascii="Lora Medium" w:hAnsi="Lora Medium" w:cs="Lora Medium" w:eastAsia="Lora Medium"/>
+        </w:rPr>
+        <w:t xml:space="preserve">A situação é ainda mais grave porque a primeira troca sequer atendeu à lei: o aparelho entregue em 11/12/2025 era recuperado, com amassados, ruptura da borda da porta e remendos com cola, quando o art. 18, §1º, I, do CDC exige a substituição “por outro da mesma espécie, em perfeitas condições de uso”. O Superior Tribunal de Justiça é claro ao exigir que a substituição se dê por produto novo:</w:t>
       </w:r>
     </w:p>
     <w:p>
@@ -1659,11 +1670,42 @@
       </w:pPr>
       <w:r>
         <w:rPr>
-          <w:rFonts w:ascii="Lora SemiBold" w:hAnsi="Lora SemiBold" w:cs="Lora SemiBold" w:eastAsia="Lora SemiBold"/>
-          <w:sz w:val="18"/>
-          <w:szCs w:val="18"/>
-        </w:rPr>
-        <w:t xml:space="preserve">a restituição imediata da quantia paga, monetariamente atualizada;</w:t>
+          <w:rFonts w:ascii="Lora Medium" w:hAnsi="Lora Medium" w:cs="Lora Medium" w:eastAsia="Lora Medium"/>
+          <w:sz w:val="18"/>
+          <w:szCs w:val="18"/>
+        </w:rPr>
+        <w:t xml:space="preserve">“6- Na hipótese de responsabilidade pelo vício, </w:t>
+      </w:r>
+      <w:r>
+        <w:rPr>
+          <w:rFonts w:ascii="Lora" w:hAnsi="Lora" w:cs="Lora" w:eastAsia="Lora"/>
+          <w:b/>
+          <w:bCs/>
+          <w:sz w:val="18"/>
+          <w:szCs w:val="18"/>
+        </w:rPr>
+        <w:t xml:space="preserve">a substituição do produto “por outro da mesma espécie” – prevista no inciso I, do § 1º, do art. 18, do CDC – implica a substituição por outro produto novo na data da substituição</w:t>
+      </w:r>
+      <w:r>
+        <w:rPr>
+          <w:rFonts w:ascii="Lora Medium" w:hAnsi="Lora Medium" w:cs="Lora Medium" w:eastAsia="Lora Medium"/>
+          <w:sz w:val="18"/>
+          <w:szCs w:val="18"/>
+        </w:rPr>
+        <w:t xml:space="preserve">.” (STJ – REsp 1.982.739/MT – Rel. Ministra NANCY ANDRIGHI – Terceira Turma – julgado em 15/03/2022 – DJe 21/03/2022) (grifo nosso)</w:t>
+      </w:r>
+    </w:p>
+    <w:p>
+      <w:pPr>
+        <w:spacing w:after="60" w:line="360"/>
+        <w:ind w:firstLine="850"/>
+        <w:jc w:val="both"/>
+      </w:pPr>
+      <w:r>
+        <w:rPr>
+          <w:rFonts w:ascii="Lora Medium" w:hAnsi="Lora Medium" w:cs="Lora Medium" w:eastAsia="Lora Medium"/>
+        </w:rPr>
+        <w:t xml:space="preserve">Antes disso, o defeito original não foi sanado pela assistência técnica no prazo de 30 dias, como reconheceu a própria fabricante em sua resposta ao PROCON. E a segunda troca, acordada no PROCON, também não solucionou o problema. O prazo legal, ademais, não se renova a cada nova tentativa de reparo:</w:t>
       </w:r>
     </w:p>
     <w:p>
@@ -1678,24 +1720,69 @@
       </w:pPr>
       <w:r>
         <w:rPr>
-          <w:rFonts w:ascii="Lora SemiBold" w:hAnsi="Lora SemiBold" w:cs="Lora SemiBold" w:eastAsia="Lora SemiBold"/>
-          <w:sz w:val="18"/>
-          <w:szCs w:val="18"/>
-        </w:rPr>
-        <w:t xml:space="preserve">ou o abatimento proporcional do preço. </w:t>
-      </w:r>
-    </w:p>
-    <w:p>
-      <w:pPr>
-        <w:spacing w:after="60" w:line="360"/>
-        <w:ind w:firstLine="850"/>
-        <w:jc w:val="both"/>
-      </w:pPr>
-      <w:r>
-        <w:rPr>
-          <w:rFonts w:ascii="Lora SemiBold" w:hAnsi="Lora SemiBold" w:cs="Lora SemiBold" w:eastAsia="Lora SemiBold"/>
-        </w:rPr>
-        <w:t xml:space="preserve">A situação é ainda mais grave porque a primeira troca sequer atendeu à lei: o aparelho entregue em 11/12/2025 era recuperado, com amassados, ruptura da borda da porta e remendos com cola, quando o art. 18, §1º, I, do CDC exige a substituição “por outro da mesma espécie, em perfeitas condições de uso”. O Superior Tribunal de Justiça é claro ao exigir que a substituição se dê por produto novo:</w:t>
+          <w:rFonts w:ascii="Lora Medium" w:hAnsi="Lora Medium" w:cs="Lora Medium" w:eastAsia="Lora Medium"/>
+          <w:sz w:val="18"/>
+          <w:szCs w:val="18"/>
+        </w:rPr>
+        <w:t xml:space="preserve">“6. </w:t>
+      </w:r>
+      <w:r>
+        <w:rPr>
+          <w:rFonts w:ascii="Lora" w:hAnsi="Lora" w:cs="Lora" w:eastAsia="Lora"/>
+          <w:b/>
+          <w:bCs/>
+          <w:sz w:val="18"/>
+          <w:szCs w:val="18"/>
+        </w:rPr>
+        <w:t xml:space="preserve">Em havendo sucessiva manifestação do mesmo vício no produto, o trintídio legal é computado de forma corrida</w:t>
+      </w:r>
+      <w:r>
+        <w:rPr>
+          <w:rFonts w:ascii="Lora Medium" w:hAnsi="Lora Medium" w:cs="Lora Medium" w:eastAsia="Lora Medium"/>
+          <w:sz w:val="18"/>
+          <w:szCs w:val="18"/>
+        </w:rPr>
+        <w:t xml:space="preserve">, isto é, sem que haja o reinício do prazo toda vez que o bem for entregue ao fornecedor para a resolução de idêntico problema, nem a suspensão quando devolvido o produto ao consumidor sem o devido reparo. 7. Hipótese em que o aludido prazo foi excedido pelas fornecedoras, circunstância que legitima a pretensão de devolução da quantia paga pelo veículo.” (STJ – REsp 1.684.132/CE – Rel. Ministra NANCY ANDRIGHI – Terceira Turma – julgado em 02/10/2018 – DJe 04/10/2018) (grifo nosso)</w:t>
+      </w:r>
+    </w:p>
+    <w:p>
+      <w:pPr>
+        <w:spacing w:after="60" w:line="360"/>
+        <w:ind w:firstLine="850"/>
+        <w:jc w:val="both"/>
+      </w:pPr>
+      <w:r>
+        <w:rPr>
+          <w:rFonts w:ascii="Lora Medium" w:hAnsi="Lora Medium" w:cs="Lora Medium" w:eastAsia="Lora Medium"/>
+        </w:rPr>
+        <w:t xml:space="preserve">Não se mostra razoável exigir que a consumidora continue indefinidamente submetida a novas trocas, reparos e procedimentos administrativos para obter aquilo que já deveria ter recebido desde a primeira entrega: </w:t>
+      </w:r>
+      <w:r>
+        <w:rPr>
+          <w:rFonts w:ascii="Lora" w:hAnsi="Lora" w:cs="Lora" w:eastAsia="Lora"/>
+          <w:b/>
+          <w:bCs/>
+        </w:rPr>
+        <w:t xml:space="preserve">um refrigerador em perfeitas condições de funcionamento</w:t>
+      </w:r>
+      <w:r>
+        <w:rPr>
+          <w:rFonts w:ascii="Lora Medium" w:hAnsi="Lora Medium" w:cs="Lora Medium" w:eastAsia="Lora Medium"/>
+        </w:rPr>
+        <w:t xml:space="preserve">.</w:t>
+      </w:r>
+    </w:p>
+    <w:p>
+      <w:pPr>
+        <w:spacing w:after="60" w:line="360"/>
+        <w:ind w:firstLine="850"/>
+        <w:jc w:val="both"/>
+      </w:pPr>
+      <w:r>
+        <w:rPr>
+          <w:rFonts w:ascii="Lora Medium" w:hAnsi="Lora Medium" w:cs="Lora Medium" w:eastAsia="Lora Medium"/>
+        </w:rPr>
+        <w:t xml:space="preserve">O Tribunal de Justiça do Piauí, em caso envolvendo refrigerador comercializado pela própria 1ª Ré, BUD Comércio de Eletrodomésticos Ltda., assim decidiu:</w:t>
       </w:r>
     </w:p>
     <w:p>
@@ -1710,42 +1797,42 @@
       </w:pPr>
       <w:r>
         <w:rPr>
-          <w:rFonts w:ascii="Lora SemiBold" w:hAnsi="Lora SemiBold" w:cs="Lora SemiBold" w:eastAsia="Lora SemiBold"/>
-          <w:sz w:val="18"/>
-          <w:szCs w:val="18"/>
-        </w:rPr>
-        <w:t xml:space="preserve">“6- Na hipótese de responsabilidade pelo vício, </w:t>
-      </w:r>
-      <w:r>
-        <w:rPr>
-          <w:rFonts w:ascii="Lora" w:hAnsi="Lora" w:cs="Lora" w:eastAsia="Lora"/>
-          <w:b/>
-          <w:bCs/>
-          <w:sz w:val="18"/>
-          <w:szCs w:val="18"/>
-        </w:rPr>
-        <w:t xml:space="preserve">a substituição do produto “por outro da mesma espécie” – prevista no inciso I, do § 1º, do art. 18, do CDC – implica a substituição por outro produto novo na data da substituição</w:t>
-      </w:r>
-      <w:r>
-        <w:rPr>
-          <w:rFonts w:ascii="Lora SemiBold" w:hAnsi="Lora SemiBold" w:cs="Lora SemiBold" w:eastAsia="Lora SemiBold"/>
-          <w:sz w:val="18"/>
-          <w:szCs w:val="18"/>
-        </w:rPr>
-        <w:t xml:space="preserve">.” (STJ – REsp 1.982.739/MT – Rel. Ministra NANCY ANDRIGHI – Terceira Turma – julgado em 15/03/2022 – DJe 21/03/2022) (grifo nosso)</w:t>
-      </w:r>
-    </w:p>
-    <w:p>
-      <w:pPr>
-        <w:spacing w:after="60" w:line="360"/>
-        <w:ind w:firstLine="850"/>
-        <w:jc w:val="both"/>
-      </w:pPr>
-      <w:r>
-        <w:rPr>
-          <w:rFonts w:ascii="Lora SemiBold" w:hAnsi="Lora SemiBold" w:cs="Lora SemiBold" w:eastAsia="Lora SemiBold"/>
-        </w:rPr>
-        <w:t xml:space="preserve">Antes disso, o defeito original não foi sanado pela assistência técnica no prazo de 30 dias, como reconheceu a própria fabricante em sua resposta ao PROCON. E a segunda troca, acordada no PROCON, também não solucionou o problema. O prazo legal, ademais, não se renova a cada nova tentativa de reparo:</w:t>
+          <w:rFonts w:ascii="Lora Medium" w:hAnsi="Lora Medium" w:cs="Lora Medium" w:eastAsia="Lora Medium"/>
+          <w:sz w:val="18"/>
+          <w:szCs w:val="18"/>
+        </w:rPr>
+        <w:t xml:space="preserve">“5. Não há nos autos qualquer comprovação de que tenha havido o efeito reparo/substituição do produto objeto da demanda no prazo de 30 dias previsto no art. 18 do CDC, restando evidenciada a falha na prestação do serviço. 6. Neste cenário, </w:t>
+      </w:r>
+      <w:r>
+        <w:rPr>
+          <w:rFonts w:ascii="Lora" w:hAnsi="Lora" w:cs="Lora" w:eastAsia="Lora"/>
+          <w:b/>
+          <w:bCs/>
+          <w:sz w:val="18"/>
+          <w:szCs w:val="18"/>
+        </w:rPr>
+        <w:t xml:space="preserve">não atendidas as reclamações da autora/apelante, em tempo e de forma satisfatória, é plenamente viável o reembolso dos valores despendidos para a aquisição do produto</w:t>
+      </w:r>
+      <w:r>
+        <w:rPr>
+          <w:rFonts w:ascii="Lora Medium" w:hAnsi="Lora Medium" w:cs="Lora Medium" w:eastAsia="Lora Medium"/>
+          <w:sz w:val="18"/>
+          <w:szCs w:val="18"/>
+        </w:rPr>
+        <w:t xml:space="preserve">. 7. Com efeito, resta demonstrada a responsabilidade do apelante no caso em apreço, inclusive o dever de indenizar a autora pelos danos morais sofridos, haja vista que a inadimplência quanto ao reparo ou substituição do produto ensejou reclamação, sem sucesso, junto ao PROCON [...], fatos estes que ultrapassam o mero aborrecimento e dissabor.” (TJPI – APELAÇÃO CÍVEL 0000693-24.2017.8.18.0062 – Relator: Des. OTON MÁRIO JOSÉ LUSTOSA TORRES – 4ª Câmara Especializada Cível – Data de publicação 31/05/2021) (grifo nosso)</w:t>
+      </w:r>
+    </w:p>
+    <w:p>
+      <w:pPr>
+        <w:spacing w:after="60" w:line="360"/>
+        <w:ind w:firstLine="850"/>
+        <w:jc w:val="both"/>
+      </w:pPr>
+      <w:r>
+        <w:rPr>
+          <w:rFonts w:ascii="Lora Medium" w:hAnsi="Lora Medium" w:cs="Lora Medium" w:eastAsia="Lora Medium"/>
+        </w:rPr>
+        <w:t xml:space="preserve">No mesmo sentido, a 1ª Turma Recursal do TJPI, em caso de refrigerador com vício não solucionado:</w:t>
       </w:r>
     </w:p>
     <w:p>
@@ -1760,69 +1847,132 @@
       </w:pPr>
       <w:r>
         <w:rPr>
-          <w:rFonts w:ascii="Lora SemiBold" w:hAnsi="Lora SemiBold" w:cs="Lora SemiBold" w:eastAsia="Lora SemiBold"/>
-          <w:sz w:val="18"/>
-          <w:szCs w:val="18"/>
-        </w:rPr>
-        <w:t xml:space="preserve">“6. </w:t>
-      </w:r>
-      <w:r>
-        <w:rPr>
-          <w:rFonts w:ascii="Lora" w:hAnsi="Lora" w:cs="Lora" w:eastAsia="Lora"/>
-          <w:b/>
-          <w:bCs/>
-          <w:sz w:val="18"/>
-          <w:szCs w:val="18"/>
-        </w:rPr>
-        <w:t xml:space="preserve">Em havendo sucessiva manifestação do mesmo vício no produto, o trintídio legal é computado de forma corrida</w:t>
-      </w:r>
-      <w:r>
-        <w:rPr>
-          <w:rFonts w:ascii="Lora SemiBold" w:hAnsi="Lora SemiBold" w:cs="Lora SemiBold" w:eastAsia="Lora SemiBold"/>
-          <w:sz w:val="18"/>
-          <w:szCs w:val="18"/>
-        </w:rPr>
-        <w:t xml:space="preserve">, isto é, sem que haja o reinício do prazo toda vez que o bem for entregue ao fornecedor para a resolução de idêntico problema, nem a suspensão quando devolvido o produto ao consumidor sem o devido reparo. 7. Hipótese em que o aludido prazo foi excedido pelas fornecedoras, circunstância que legitima a pretensão de devolução da quantia paga pelo veículo.” (STJ – REsp 1.684.132/CE – Rel. Ministra NANCY ANDRIGHI – Terceira Turma – julgado em 02/10/2018 – DJe 04/10/2018) (grifo nosso)</w:t>
-      </w:r>
-    </w:p>
-    <w:p>
-      <w:pPr>
-        <w:spacing w:after="60" w:line="360"/>
-        <w:ind w:firstLine="850"/>
-        <w:jc w:val="both"/>
-      </w:pPr>
-      <w:r>
-        <w:rPr>
-          <w:rFonts w:ascii="Lora SemiBold" w:hAnsi="Lora SemiBold" w:cs="Lora SemiBold" w:eastAsia="Lora SemiBold"/>
-        </w:rPr>
-        <w:t xml:space="preserve">Não se mostra razoável exigir que a consumidora continue indefinidamente submetida a novas trocas, reparos e procedimentos administrativos para obter aquilo que já deveria ter recebido desde a primeira entrega: </w:t>
-      </w:r>
-      <w:r>
-        <w:rPr>
-          <w:rFonts w:ascii="Lora" w:hAnsi="Lora" w:cs="Lora" w:eastAsia="Lora"/>
-          <w:b/>
-          <w:bCs/>
-        </w:rPr>
-        <w:t xml:space="preserve">um refrigerador em perfeitas condições de funcionamento</w:t>
-      </w:r>
-      <w:r>
-        <w:rPr>
-          <w:rFonts w:ascii="Lora SemiBold" w:hAnsi="Lora SemiBold" w:cs="Lora SemiBold" w:eastAsia="Lora SemiBold"/>
-        </w:rPr>
-        <w:t xml:space="preserve">.</w:t>
-      </w:r>
-    </w:p>
-    <w:p>
-      <w:pPr>
-        <w:spacing w:after="60" w:line="360"/>
-        <w:ind w:firstLine="850"/>
-        <w:jc w:val="both"/>
-      </w:pPr>
-      <w:r>
-        <w:rPr>
-          <w:rFonts w:ascii="Lora SemiBold" w:hAnsi="Lora SemiBold" w:cs="Lora SemiBold" w:eastAsia="Lora SemiBold"/>
-        </w:rPr>
-        <w:t xml:space="preserve">O Tribunal de Justiça do Piauí, em caso envolvendo refrigerador comercializado pela própria 1ª Ré, BUD Comércio de Eletrodomésticos Ltda., assim decidiu:</w:t>
+          <w:rFonts w:ascii="Lora Medium" w:hAnsi="Lora Medium" w:cs="Lora Medium" w:eastAsia="Lora Medium"/>
+          <w:sz w:val="18"/>
+          <w:szCs w:val="18"/>
+        </w:rPr>
+        <w:t xml:space="preserve">“RECURSO INOMINADO. RELAÇÃO DE CONSUMO. [...] </w:t>
+      </w:r>
+      <w:r>
+        <w:rPr>
+          <w:rFonts w:ascii="Lora" w:hAnsi="Lora" w:cs="Lora" w:eastAsia="Lora"/>
+          <w:b/>
+          <w:bCs/>
+          <w:sz w:val="18"/>
+          <w:szCs w:val="18"/>
+        </w:rPr>
+        <w:t xml:space="preserve">COMPRA DE REFRIGERADOR. VÍCIOS OCULTOS. PRODUTO DENTRO DA GARANTIA. APLICAÇÃO DO ART. 18, II DO CDC</w:t>
+      </w:r>
+      <w:r>
+        <w:rPr>
+          <w:rFonts w:ascii="Lora Medium" w:hAnsi="Lora Medium" w:cs="Lora Medium" w:eastAsia="Lora Medium"/>
+          <w:sz w:val="18"/>
+          <w:szCs w:val="18"/>
+        </w:rPr>
+        <w:t xml:space="preserve">. [...] DANO MORAL CONFIGURADO. [...]” (TJPI – RECURSO INOMINADO CÍVEL 0800144-67.2022.8.18.0009 – Relator: LEONARDO LÚCIO FREIRE TRIGUEIRO – 1ª Turma Recursal – julgado em 27/08/2024) (grifo nosso)</w:t>
+      </w:r>
+    </w:p>
+    <w:p>
+      <w:pPr>
+        <w:keepNext/>
+        <w:tabs>
+          <w:tab w:val="left" w:pos="700"/>
+        </w:tabs>
+        <w:spacing w:before="240" w:after="160" w:line="360"/>
+        <w:ind w:left="700" w:hanging="400"/>
+      </w:pPr>
+      <w:r>
+        <w:rPr>
+          <w:rFonts w:ascii="Lora" w:hAnsi="Lora" w:cs="Lora" w:eastAsia="Lora"/>
+          <w:b/>
+          <w:bCs/>
+          <w:i/>
+          <w:iCs/>
+        </w:rPr>
+        <w:t xml:space="preserve">d.</w:t>
+        <w:tab/>
+        <w:t xml:space="preserve">Da essencialidade do bem e da inadequação de novas tentativas de reparo ou substituição:</w:t>
+      </w:r>
+    </w:p>
+    <w:p>
+      <w:pPr>
+        <w:spacing w:after="60" w:line="360"/>
+        <w:ind w:firstLine="850"/>
+        <w:jc w:val="both"/>
+      </w:pPr>
+      <w:r>
+        <w:rPr>
+          <w:rFonts w:ascii="Lora Medium" w:hAnsi="Lora Medium" w:cs="Lora Medium" w:eastAsia="Lora Medium"/>
+        </w:rPr>
+        <w:t xml:space="preserve">Uma geladeira não constitui mero objeto de conveniência. Sua finalidade está diretamente relacionada à </w:t>
+      </w:r>
+      <w:r>
+        <w:rPr>
+          <w:rFonts w:ascii="Lora" w:hAnsi="Lora" w:cs="Lora" w:eastAsia="Lora"/>
+          <w:b/>
+          <w:bCs/>
+        </w:rPr>
+        <w:t xml:space="preserve">conservação de alimentos</w:t>
+      </w:r>
+      <w:r>
+        <w:rPr>
+          <w:rFonts w:ascii="Lora Medium" w:hAnsi="Lora Medium" w:cs="Lora Medium" w:eastAsia="Lora Medium"/>
+        </w:rPr>
+        <w:t xml:space="preserve">, sendo utilizada diariamente no ambiente doméstico.</w:t>
+      </w:r>
+    </w:p>
+    <w:p>
+      <w:pPr>
+        <w:spacing w:after="60" w:line="360"/>
+        <w:ind w:firstLine="850"/>
+        <w:jc w:val="both"/>
+      </w:pPr>
+      <w:r>
+        <w:rPr>
+          <w:rFonts w:ascii="Lora Medium" w:hAnsi="Lora Medium" w:cs="Lora Medium" w:eastAsia="Lora Medium"/>
+        </w:rPr>
+        <w:t xml:space="preserve">O próprio </w:t>
+      </w:r>
+      <w:r>
+        <w:rPr>
+          <w:rFonts w:ascii="Lora" w:hAnsi="Lora" w:cs="Lora" w:eastAsia="Lora"/>
+          <w:b/>
+          <w:bCs/>
+        </w:rPr>
+        <w:t xml:space="preserve">art. 18, §3º, do CDC</w:t>
+      </w:r>
+      <w:r>
+        <w:rPr>
+          <w:rFonts w:ascii="Lora Medium" w:hAnsi="Lora Medium" w:cs="Lora Medium" w:eastAsia="Lora Medium"/>
+        </w:rPr>
+        <w:t xml:space="preserve"> prevê que o consumidor pode fazer uso imediato das alternativas previstas no §1º quando, em razão da extensão do vício, a substituição das partes puder comprometer as características do produto, diminuir seu valor ou </w:t>
+      </w:r>
+      <w:r>
+        <w:rPr>
+          <w:rFonts w:ascii="Lora" w:hAnsi="Lora" w:cs="Lora" w:eastAsia="Lora"/>
+          <w:b/>
+          <w:bCs/>
+        </w:rPr>
+        <w:t xml:space="preserve">quando se tratar de produto essencial</w:t>
+      </w:r>
+      <w:r>
+        <w:rPr>
+          <w:rFonts w:ascii="Lora Medium" w:hAnsi="Lora Medium" w:cs="Lora Medium" w:eastAsia="Lora Medium"/>
+        </w:rPr>
+        <w:t xml:space="preserve">. </w:t>
+      </w:r>
+    </w:p>
+    <w:p>
+      <w:pPr>
+        <w:spacing w:after="60" w:line="360"/>
+        <w:ind w:firstLine="850"/>
+        <w:jc w:val="both"/>
+      </w:pPr>
+      <w:r>
+        <w:rPr>
+          <w:rFonts w:ascii="Lora Medium" w:hAnsi="Lora Medium" w:cs="Lora Medium" w:eastAsia="Lora Medium"/>
+        </w:rPr>
+        <w:t xml:space="preserve">O Superior Tribunal de Justiça reconhece expressamente que, nessas hipóteses, o fornecedor não dispõe do prazo de 30 dias para o reparo:</w:t>
       </w:r>
     </w:p>
     <w:p>
@@ -1837,42 +1987,42 @@
       </w:pPr>
       <w:r>
         <w:rPr>
-          <w:rFonts w:ascii="Lora SemiBold" w:hAnsi="Lora SemiBold" w:cs="Lora SemiBold" w:eastAsia="Lora SemiBold"/>
-          <w:sz w:val="18"/>
-          <w:szCs w:val="18"/>
-        </w:rPr>
-        <w:t xml:space="preserve">“5. Não há nos autos qualquer comprovação de que tenha havido o efeito reparo/substituição do produto objeto da demanda no prazo de 30 dias previsto no art. 18 do CDC, restando evidenciada a falha na prestação do serviço. 6. Neste cenário, </w:t>
-      </w:r>
-      <w:r>
-        <w:rPr>
-          <w:rFonts w:ascii="Lora" w:hAnsi="Lora" w:cs="Lora" w:eastAsia="Lora"/>
-          <w:b/>
-          <w:bCs/>
-          <w:sz w:val="18"/>
-          <w:szCs w:val="18"/>
-        </w:rPr>
-        <w:t xml:space="preserve">não atendidas as reclamações da autora/apelante, em tempo e de forma satisfatória, é plenamente viável o reembolso dos valores despendidos para a aquisição do produto</w:t>
-      </w:r>
-      <w:r>
-        <w:rPr>
-          <w:rFonts w:ascii="Lora SemiBold" w:hAnsi="Lora SemiBold" w:cs="Lora SemiBold" w:eastAsia="Lora SemiBold"/>
-          <w:sz w:val="18"/>
-          <w:szCs w:val="18"/>
-        </w:rPr>
-        <w:t xml:space="preserve">. 7. Com efeito, resta demonstrada a responsabilidade do apelante no caso em apreço, inclusive o dever de indenizar a autora pelos danos morais sofridos, haja vista que a inadimplência quanto ao reparo ou substituição do produto ensejou reclamação, sem sucesso, junto ao PROCON [...], fatos estes que ultrapassam o mero aborrecimento e dissabor.” (TJPI – APELAÇÃO CÍVEL 0000693-24.2017.8.18.0062 – Relator: Des. OTON MÁRIO JOSÉ LUSTOSA TORRES – 4ª Câmara Especializada Cível – Data de publicação 31/05/2021) (grifo nosso)</w:t>
-      </w:r>
-    </w:p>
-    <w:p>
-      <w:pPr>
-        <w:spacing w:after="60" w:line="360"/>
-        <w:ind w:firstLine="850"/>
-        <w:jc w:val="both"/>
-      </w:pPr>
-      <w:r>
-        <w:rPr>
-          <w:rFonts w:ascii="Lora SemiBold" w:hAnsi="Lora SemiBold" w:cs="Lora SemiBold" w:eastAsia="Lora SemiBold"/>
-        </w:rPr>
-        <w:t xml:space="preserve">No mesmo sentido, a 1ª Turma Recursal do TJPI, em caso de refrigerador com vício não solucionado:</w:t>
+          <w:rFonts w:ascii="Lora Medium" w:hAnsi="Lora Medium" w:cs="Lora Medium" w:eastAsia="Lora Medium"/>
+          <w:sz w:val="18"/>
+          <w:szCs w:val="18"/>
+        </w:rPr>
+        <w:t xml:space="preserve">“Cumpre lembrar, outrossim, que o próprio CDC estabelece hipóteses em que não será concedida essa faculdade ao fornecedor, as quais estão previstas no parágrafo terceiro do dispositivo em comento: (i) quando, em razão da extensão do vício, a substituição das partes viciadas puder comprometer a qualidade ou características do produto ou diminuir-lhe o valor; </w:t>
+      </w:r>
+      <w:r>
+        <w:rPr>
+          <w:rFonts w:ascii="Lora" w:hAnsi="Lora" w:cs="Lora" w:eastAsia="Lora"/>
+          <w:b/>
+          <w:bCs/>
+          <w:sz w:val="18"/>
+          <w:szCs w:val="18"/>
+        </w:rPr>
+        <w:t xml:space="preserve">(ii) quando se tratar de produto essencial</w:t>
+      </w:r>
+      <w:r>
+        <w:rPr>
+          <w:rFonts w:ascii="Lora Medium" w:hAnsi="Lora Medium" w:cs="Lora Medium" w:eastAsia="Lora Medium"/>
+          <w:sz w:val="18"/>
+          <w:szCs w:val="18"/>
+        </w:rPr>
+        <w:t xml:space="preserve">.” (STJ – REsp 1.684.132/CE – Rel. Ministra NANCY ANDRIGHI – Terceira Turma – julgado em 02/10/2018 – DJe 04/10/2018 – trecho do voto) (grifo nosso)</w:t>
+      </w:r>
+    </w:p>
+    <w:p>
+      <w:pPr>
+        <w:spacing w:after="60" w:line="360"/>
+        <w:ind w:firstLine="850"/>
+        <w:jc w:val="both"/>
+      </w:pPr>
+      <w:r>
+        <w:rPr>
+          <w:rFonts w:ascii="Lora Medium" w:hAnsi="Lora Medium" w:cs="Lora Medium" w:eastAsia="Lora Medium"/>
+        </w:rPr>
+        <w:t xml:space="preserve">E o Tribunal de Justiça do Piauí já qualificou o refrigerador como bem essencial, em caso análogo:</w:t>
       </w:r>
     </w:p>
     <w:p>
@@ -1887,29 +2037,146 @@
       </w:pPr>
       <w:r>
         <w:rPr>
-          <w:rFonts w:ascii="Lora SemiBold" w:hAnsi="Lora SemiBold" w:cs="Lora SemiBold" w:eastAsia="Lora SemiBold"/>
-          <w:sz w:val="18"/>
-          <w:szCs w:val="18"/>
-        </w:rPr>
-        <w:t xml:space="preserve">“RECURSO INOMINADO. RELAÇÃO DE CONSUMO. [...] </w:t>
-      </w:r>
-      <w:r>
-        <w:rPr>
-          <w:rFonts w:ascii="Lora" w:hAnsi="Lora" w:cs="Lora" w:eastAsia="Lora"/>
-          <w:b/>
-          <w:bCs/>
-          <w:sz w:val="18"/>
-          <w:szCs w:val="18"/>
-        </w:rPr>
-        <w:t xml:space="preserve">COMPRA DE REFRIGERADOR. VÍCIOS OCULTOS. PRODUTO DENTRO DA GARANTIA. APLICAÇÃO DO ART. 18, II DO CDC</w:t>
-      </w:r>
-      <w:r>
-        <w:rPr>
-          <w:rFonts w:ascii="Lora SemiBold" w:hAnsi="Lora SemiBold" w:cs="Lora SemiBold" w:eastAsia="Lora SemiBold"/>
-          <w:sz w:val="18"/>
-          <w:szCs w:val="18"/>
-        </w:rPr>
-        <w:t xml:space="preserve">. [...] DANO MORAL CONFIGURADO. [...]” (TJPI – RECURSO INOMINADO CÍVEL 0800144-67.2022.8.18.0009 – Relator: LEONARDO LÚCIO FREIRE TRIGUEIRO – 1ª Turma Recursal – julgado em 27/08/2024) (grifo nosso)</w:t>
+          <w:rFonts w:ascii="Lora Medium" w:hAnsi="Lora Medium" w:cs="Lora Medium" w:eastAsia="Lora Medium"/>
+          <w:sz w:val="18"/>
+          <w:szCs w:val="18"/>
+        </w:rPr>
+        <w:t xml:space="preserve">“RECURSO INOMINADO. DIREITO DO CONSUMIDOR. VÍCIO DO PRODUTO. </w:t>
+      </w:r>
+      <w:r>
+        <w:rPr>
+          <w:rFonts w:ascii="Lora" w:hAnsi="Lora" w:cs="Lora" w:eastAsia="Lora"/>
+          <w:b/>
+          <w:bCs/>
+          <w:sz w:val="18"/>
+          <w:szCs w:val="18"/>
+        </w:rPr>
+        <w:t xml:space="preserve">BEM ESSENCIAL. AUSÊNCIA DE SUBSTITUIÇÃO DO PRODUTO NO TRINTÍDIO LEGAL. RESSARCIMENTO INTEGRAL</w:t>
+      </w:r>
+      <w:r>
+        <w:rPr>
+          <w:rFonts w:ascii="Lora Medium" w:hAnsi="Lora Medium" w:cs="Lora Medium" w:eastAsia="Lora Medium"/>
+          <w:sz w:val="18"/>
+          <w:szCs w:val="18"/>
+        </w:rPr>
+        <w:t xml:space="preserve">. [...]” (TJPI – RECURSO INOMINADO CÍVEL 0800464-66.2022.8.18.0123 – Relator: JOÃO HENRIQUE SOUSA GOMES – 2ª Turma Recursal – julgado em 15/08/2024) (grifo nosso)</w:t>
+      </w:r>
+    </w:p>
+    <w:p>
+      <w:pPr>
+        <w:spacing w:after="60" w:line="360"/>
+        <w:ind w:firstLine="850"/>
+        <w:jc w:val="both"/>
+      </w:pPr>
+      <w:r>
+        <w:rPr>
+          <w:rFonts w:ascii="Lora Medium" w:hAnsi="Lora Medium" w:cs="Lora Medium" w:eastAsia="Lora Medium"/>
+        </w:rPr>
+        <w:t xml:space="preserve">Portanto, ainda que não se pretenda estabelecer uma regra abstrata de que toda e qualquer geladeira seja automaticamente considerada produto essencial, </w:t>
+      </w:r>
+      <w:r>
+        <w:rPr>
+          <w:rFonts w:ascii="Lora" w:hAnsi="Lora" w:cs="Lora" w:eastAsia="Lora"/>
+          <w:b/>
+          <w:bCs/>
+        </w:rPr>
+        <w:t xml:space="preserve">as circunstâncias específicas desta demanda demonstram que a privação de um refrigerador funcional produz impacto concreto na vida cotidiana da consumidora</w:t>
+      </w:r>
+      <w:r>
+        <w:rPr>
+          <w:rFonts w:ascii="Lora Medium" w:hAnsi="Lora Medium" w:cs="Lora Medium" w:eastAsia="Lora Medium"/>
+        </w:rPr>
+        <w:t xml:space="preserve">.</w:t>
+      </w:r>
+    </w:p>
+    <w:p>
+      <w:pPr>
+        <w:spacing w:after="60" w:line="360"/>
+        <w:ind w:firstLine="850"/>
+        <w:jc w:val="both"/>
+      </w:pPr>
+      <w:r>
+        <w:rPr>
+          <w:rFonts w:ascii="Lora Medium" w:hAnsi="Lora Medium" w:cs="Lora Medium" w:eastAsia="Lora Medium"/>
+        </w:rPr>
+        <w:t xml:space="preserve">Mais importante ainda, aqui não se discute apenas a necessidade de aguardar uma primeira tentativa de reparo. A Autora </w:t>
+      </w:r>
+      <w:r>
+        <w:rPr>
+          <w:rFonts w:ascii="Lora" w:hAnsi="Lora" w:cs="Lora" w:eastAsia="Lora"/>
+          <w:b/>
+          <w:bCs/>
+        </w:rPr>
+        <w:t xml:space="preserve">já passou por sucessivas tentativas de solução e substituições</w:t>
+      </w:r>
+      <w:r>
+        <w:rPr>
+          <w:rFonts w:ascii="Lora Medium" w:hAnsi="Lora Medium" w:cs="Lora Medium" w:eastAsia="Lora Medium"/>
+        </w:rPr>
+        <w:t xml:space="preserve">, inclusive uma formalmente documentada como troca em garantia.</w:t>
+      </w:r>
+    </w:p>
+    <w:p>
+      <w:pPr>
+        <w:spacing w:after="60" w:line="360"/>
+        <w:ind w:firstLine="850"/>
+        <w:jc w:val="both"/>
+      </w:pPr>
+      <w:r>
+        <w:rPr>
+          <w:rFonts w:ascii="Lora Medium" w:hAnsi="Lora Medium" w:cs="Lora Medium" w:eastAsia="Lora Medium"/>
+        </w:rPr>
+        <w:t xml:space="preserve">A insistência em submetê-la a novos ciclos de reparo e substituição representaria, na prática, prolongar indefinidamente uma situação que já se mostrou inadequadamente solucionada.</w:t>
+      </w:r>
+    </w:p>
+    <w:p>
+      <w:pPr>
+        <w:spacing w:after="60" w:line="360"/>
+        <w:ind w:firstLine="850"/>
+        <w:jc w:val="both"/>
+      </w:pPr>
+      <w:r>
+        <w:rPr>
+          <w:rFonts w:ascii="Lora Medium" w:hAnsi="Lora Medium" w:cs="Lora Medium" w:eastAsia="Lora Medium"/>
+        </w:rPr>
+        <w:t xml:space="preserve">Por isso, ainda que se entenda que a fornecedora não dispôs do prazo de 30 dias para sanar o vício do último aparelho, a Autora pode fazer uso imediato da restituição da quantia paga, nos termos do art. 18, §3º, do CDC. Não se pode exigir da consumidora que continue submetendo o produto à assistência técnica indefinidamente, como já decidiu o TJPI:</w:t>
+      </w:r>
+    </w:p>
+    <w:p>
+      <w:pPr>
+        <w:pBdr>
+          <w:top w:val="single" w:color="9AA0A6" w:sz="4" w:space="6"/>
+          <w:bottom w:val="single" w:color="9AA0A6" w:sz="4" w:space="6"/>
+        </w:pBdr>
+        <w:spacing w:before="160" w:after="200" w:line="240"/>
+        <w:ind w:left="2270" w:right="570"/>
+        <w:jc w:val="both"/>
+      </w:pPr>
+      <w:r>
+        <w:rPr>
+          <w:rFonts w:ascii="Lora Medium" w:hAnsi="Lora Medium" w:cs="Lora Medium" w:eastAsia="Lora Medium"/>
+          <w:sz w:val="18"/>
+          <w:szCs w:val="18"/>
+        </w:rPr>
+        <w:t xml:space="preserve">“Embora a parte apelante alegue que a apelada tenha se negado a encaminhar o produto novamente para a assistência técnica, </w:t>
+      </w:r>
+      <w:r>
+        <w:rPr>
+          <w:rFonts w:ascii="Lora" w:hAnsi="Lora" w:cs="Lora" w:eastAsia="Lora"/>
+          <w:b/>
+          <w:bCs/>
+          <w:sz w:val="18"/>
+          <w:szCs w:val="18"/>
+        </w:rPr>
+        <w:t xml:space="preserve">não se pode exigir do consumidor que permaneça na posse de um produto que não presta para o fim a que se destina, necessitando ser encaminhado diversas vezes para a assistência técnica, sem que os vícios sejam efetivamente reparados</w:t>
+      </w:r>
+      <w:r>
+        <w:rPr>
+          <w:rFonts w:ascii="Lora Medium" w:hAnsi="Lora Medium" w:cs="Lora Medium" w:eastAsia="Lora Medium"/>
+          <w:sz w:val="18"/>
+          <w:szCs w:val="18"/>
+        </w:rPr>
+        <w:t xml:space="preserve">, sendo evidente a necessidade de restituição do valor desembolsado [...]” (TJPI – APELAÇÃO CÍVEL 0800277-66.2020.8.18.0046 – Relator: Des. HAROLDO OLIVEIRA REHEM – 1ª Câmara Especializada Cível – julgado em 20/11/2023 – trecho do voto) (grifo nosso)</w:t>
       </w:r>
     </w:p>
     <w:p>
@@ -1929,90 +2196,95 @@
           <w:i/>
           <w:iCs/>
         </w:rPr>
-        <w:t xml:space="preserve">d.</w:t>
+        <w:t xml:space="preserve">e.</w:t>
         <w:tab/>
-        <w:t xml:space="preserve">Da essencialidade do bem e da inadequação de novas tentativas de reparo ou substituição:</w:t>
-      </w:r>
-    </w:p>
-    <w:p>
-      <w:pPr>
-        <w:spacing w:after="60" w:line="360"/>
-        <w:ind w:firstLine="850"/>
-        <w:jc w:val="both"/>
-      </w:pPr>
-      <w:r>
-        <w:rPr>
-          <w:rFonts w:ascii="Lora SemiBold" w:hAnsi="Lora SemiBold" w:cs="Lora SemiBold" w:eastAsia="Lora SemiBold"/>
-        </w:rPr>
-        <w:t xml:space="preserve">Uma geladeira não constitui mero objeto de conveniência. Sua finalidade está diretamente relacionada à </w:t>
-      </w:r>
-      <w:r>
-        <w:rPr>
-          <w:rFonts w:ascii="Lora" w:hAnsi="Lora" w:cs="Lora" w:eastAsia="Lora"/>
-          <w:b/>
-          <w:bCs/>
-        </w:rPr>
-        <w:t xml:space="preserve">conservação de alimentos</w:t>
-      </w:r>
-      <w:r>
-        <w:rPr>
-          <w:rFonts w:ascii="Lora SemiBold" w:hAnsi="Lora SemiBold" w:cs="Lora SemiBold" w:eastAsia="Lora SemiBold"/>
-        </w:rPr>
-        <w:t xml:space="preserve">, sendo utilizada diariamente no ambiente doméstico.</w:t>
-      </w:r>
-    </w:p>
-    <w:p>
-      <w:pPr>
-        <w:spacing w:after="60" w:line="360"/>
-        <w:ind w:firstLine="850"/>
-        <w:jc w:val="both"/>
-      </w:pPr>
-      <w:r>
-        <w:rPr>
-          <w:rFonts w:ascii="Lora SemiBold" w:hAnsi="Lora SemiBold" w:cs="Lora SemiBold" w:eastAsia="Lora SemiBold"/>
-        </w:rPr>
-        <w:t xml:space="preserve">O próprio </w:t>
-      </w:r>
-      <w:r>
-        <w:rPr>
-          <w:rFonts w:ascii="Lora" w:hAnsi="Lora" w:cs="Lora" w:eastAsia="Lora"/>
-          <w:b/>
-          <w:bCs/>
-        </w:rPr>
-        <w:t xml:space="preserve">art. 18, §3º, do CDC</w:t>
-      </w:r>
-      <w:r>
-        <w:rPr>
-          <w:rFonts w:ascii="Lora SemiBold" w:hAnsi="Lora SemiBold" w:cs="Lora SemiBold" w:eastAsia="Lora SemiBold"/>
-        </w:rPr>
-        <w:t xml:space="preserve"> prevê que o consumidor pode fazer uso imediato das alternativas previstas no §1º quando, em razão da extensão do vício, a substituição das partes puder comprometer as características do produto, diminuir seu valor ou </w:t>
-      </w:r>
-      <w:r>
-        <w:rPr>
-          <w:rFonts w:ascii="Lora" w:hAnsi="Lora" w:cs="Lora" w:eastAsia="Lora"/>
-          <w:b/>
-          <w:bCs/>
-        </w:rPr>
-        <w:t xml:space="preserve">quando se tratar de produto essencial</w:t>
-      </w:r>
-      <w:r>
-        <w:rPr>
-          <w:rFonts w:ascii="Lora SemiBold" w:hAnsi="Lora SemiBold" w:cs="Lora SemiBold" w:eastAsia="Lora SemiBold"/>
-        </w:rPr>
-        <w:t xml:space="preserve">. </w:t>
-      </w:r>
-    </w:p>
-    <w:p>
-      <w:pPr>
-        <w:spacing w:after="60" w:line="360"/>
-        <w:ind w:firstLine="850"/>
-        <w:jc w:val="both"/>
-      </w:pPr>
-      <w:r>
-        <w:rPr>
-          <w:rFonts w:ascii="Lora SemiBold" w:hAnsi="Lora SemiBold" w:cs="Lora SemiBold" w:eastAsia="Lora SemiBold"/>
-        </w:rPr>
-        <w:t xml:space="preserve">O Superior Tribunal de Justiça reconhece expressamente que, nessas hipóteses, o fornecedor não dispõe do prazo de 30 dias para o reparo:</w:t>
+        <w:t xml:space="preserve">Da inexistência de decadência:</w:t>
+      </w:r>
+    </w:p>
+    <w:p>
+      <w:pPr>
+        <w:spacing w:after="60" w:line="360"/>
+        <w:ind w:firstLine="850"/>
+        <w:jc w:val="both"/>
+      </w:pPr>
+      <w:r>
+        <w:rPr>
+          <w:rFonts w:ascii="Lora Medium" w:hAnsi="Lora Medium" w:cs="Lora Medium" w:eastAsia="Lora Medium"/>
+        </w:rPr>
+        <w:t xml:space="preserve">O prazo de 90 dias para reclamar de vícios em produtos duráveis (art. 26, II, do CDC) não se consumou. O vício do último aparelho surgiu em </w:t>
+      </w:r>
+      <w:r>
+        <w:rPr>
+          <w:rFonts w:ascii="Lora" w:hAnsi="Lora" w:cs="Lora" w:eastAsia="Lora"/>
+          <w:b/>
+          <w:bCs/>
+          <w:shd w:val="clear" w:color="auto" w:fill="FFF200"/>
+        </w:rPr>
+        <w:t xml:space="preserve">[data]</w:t>
+      </w:r>
+      <w:r>
+        <w:rPr>
+          <w:rFonts w:ascii="Lora Medium" w:hAnsi="Lora Medium" w:cs="Lora Medium" w:eastAsia="Lora Medium"/>
+        </w:rPr>
+        <w:t xml:space="preserve">, e a Autora o reclamou perante a fornecedora em </w:t>
+      </w:r>
+      <w:r>
+        <w:rPr>
+          <w:rFonts w:ascii="Lora" w:hAnsi="Lora" w:cs="Lora" w:eastAsia="Lora"/>
+          <w:b/>
+          <w:bCs/>
+          <w:shd w:val="clear" w:color="auto" w:fill="FFF200"/>
+        </w:rPr>
+        <w:t xml:space="preserve">[data]</w:t>
+      </w:r>
+      <w:r>
+        <w:rPr>
+          <w:rFonts w:ascii="Lora Medium" w:hAnsi="Lora Medium" w:cs="Lora Medium" w:eastAsia="Lora Medium"/>
+        </w:rPr>
+        <w:t xml:space="preserve">, por meio do atendimento oficial da Consul </w:t>
+      </w:r>
+      <w:r>
+        <w:rPr>
+          <w:rFonts w:ascii="Lora" w:hAnsi="Lora" w:cs="Lora" w:eastAsia="Lora"/>
+          <w:b/>
+          <w:bCs/>
+          <w:shd w:val="clear" w:color="auto" w:fill="FFF200"/>
+        </w:rPr>
+        <w:t xml:space="preserve">[Doc. 12]</w:t>
+      </w:r>
+      <w:r>
+        <w:rPr>
+          <w:rFonts w:ascii="Lora Medium" w:hAnsi="Lora Medium" w:cs="Lora Medium" w:eastAsia="Lora Medium"/>
+        </w:rPr>
+        <w:t xml:space="preserve">.</w:t>
+      </w:r>
+    </w:p>
+    <w:p>
+      <w:pPr>
+        <w:spacing w:after="60" w:line="360"/>
+        <w:ind w:firstLine="850"/>
+        <w:jc w:val="both"/>
+      </w:pPr>
+      <w:r>
+        <w:rPr>
+          <w:rFonts w:ascii="Lora Medium" w:hAnsi="Lora Medium" w:cs="Lora Medium" w:eastAsia="Lora Medium"/>
+        </w:rPr>
+        <w:t xml:space="preserve">A reclamação comprovadamente formulada perante o fornecedor obsta a decadência até a resposta negativa correspondente, transmitida de forma inequívoca (art. 26, §2º, I, do CDC) </w:t>
+      </w:r>
+      <w:r>
+        <w:rPr>
+          <w:rFonts w:ascii="Lora" w:hAnsi="Lora" w:cs="Lora" w:eastAsia="Lora"/>
+          <w:b/>
+          <w:bCs/>
+          <w:shd w:val="clear" w:color="auto" w:fill="FFF200"/>
+        </w:rPr>
+        <w:t xml:space="preserve">[confirmar com a cliente se houve resposta negativa da fornecedora e em que data]</w:t>
+      </w:r>
+      <w:r>
+        <w:rPr>
+          <w:rFonts w:ascii="Lora Medium" w:hAnsi="Lora Medium" w:cs="Lora Medium" w:eastAsia="Lora Medium"/>
+        </w:rPr>
+        <w:t xml:space="preserve">. É o entendimento pacífico do Superior Tribunal de Justiça:</w:t>
       </w:r>
     </w:p>
     <w:p>
@@ -2027,42 +2299,42 @@
       </w:pPr>
       <w:r>
         <w:rPr>
-          <w:rFonts w:ascii="Lora SemiBold" w:hAnsi="Lora SemiBold" w:cs="Lora SemiBold" w:eastAsia="Lora SemiBold"/>
-          <w:sz w:val="18"/>
-          <w:szCs w:val="18"/>
-        </w:rPr>
-        <w:t xml:space="preserve">“Cumpre lembrar, outrossim, que o próprio CDC estabelece hipóteses em que não será concedida essa faculdade ao fornecedor, as quais estão previstas no parágrafo terceiro do dispositivo em comento: (i) quando, em razão da extensão do vício, a substituição das partes viciadas puder comprometer a qualidade ou características do produto ou diminuir-lhe o valor; </w:t>
-      </w:r>
-      <w:r>
-        <w:rPr>
-          <w:rFonts w:ascii="Lora" w:hAnsi="Lora" w:cs="Lora" w:eastAsia="Lora"/>
-          <w:b/>
-          <w:bCs/>
-          <w:sz w:val="18"/>
-          <w:szCs w:val="18"/>
-        </w:rPr>
-        <w:t xml:space="preserve">(ii) quando se tratar de produto essencial</w:t>
-      </w:r>
-      <w:r>
-        <w:rPr>
-          <w:rFonts w:ascii="Lora SemiBold" w:hAnsi="Lora SemiBold" w:cs="Lora SemiBold" w:eastAsia="Lora SemiBold"/>
-          <w:sz w:val="18"/>
-          <w:szCs w:val="18"/>
-        </w:rPr>
-        <w:t xml:space="preserve">.” (STJ – REsp 1.684.132/CE – Rel. Ministra NANCY ANDRIGHI – Terceira Turma – julgado em 02/10/2018 – DJe 04/10/2018 – trecho do voto) (grifo nosso)</w:t>
-      </w:r>
-    </w:p>
-    <w:p>
-      <w:pPr>
-        <w:spacing w:after="60" w:line="360"/>
-        <w:ind w:firstLine="850"/>
-        <w:jc w:val="both"/>
-      </w:pPr>
-      <w:r>
-        <w:rPr>
-          <w:rFonts w:ascii="Lora SemiBold" w:hAnsi="Lora SemiBold" w:cs="Lora SemiBold" w:eastAsia="Lora SemiBold"/>
-        </w:rPr>
-        <w:t xml:space="preserve">E o Tribunal de Justiça do Piauí já qualificou o refrigerador como bem essencial, em caso análogo:</w:t>
+          <w:rFonts w:ascii="Lora Medium" w:hAnsi="Lora Medium" w:cs="Lora Medium" w:eastAsia="Lora Medium"/>
+          <w:sz w:val="18"/>
+          <w:szCs w:val="18"/>
+        </w:rPr>
+        <w:t xml:space="preserve">“4. “Tratando-se de vício oculto do produto, o prazo decadencial tem início no momento em que evidenciado o defeito, e </w:t>
+      </w:r>
+      <w:r>
+        <w:rPr>
+          <w:rFonts w:ascii="Lora" w:hAnsi="Lora" w:cs="Lora" w:eastAsia="Lora"/>
+          <w:b/>
+          <w:bCs/>
+          <w:sz w:val="18"/>
+          <w:szCs w:val="18"/>
+        </w:rPr>
+        <w:t xml:space="preserve">a reclamação do consumidor formulada diretamente ao fornecedor obsta o prazo de decadência até a resposta negativa deste</w:t>
+      </w:r>
+      <w:r>
+        <w:rPr>
+          <w:rFonts w:ascii="Lora Medium" w:hAnsi="Lora Medium" w:cs="Lora Medium" w:eastAsia="Lora Medium"/>
+          <w:sz w:val="18"/>
+          <w:szCs w:val="18"/>
+        </w:rPr>
+        <w:t xml:space="preserve">” (REsp n. 1.303.510/SP, relator Ministro João Otávio de Noronha, Terceira Turma, DJe de 6/11/2015).” (STJ – AgInt no AREsp 2.174.028/SP – Rel. Ministro HUMBERTO MARTINS – Terceira Turma – julgado em 26/02/2024 – DJe 29/02/2024) (grifo nosso)</w:t>
+      </w:r>
+    </w:p>
+    <w:p>
+      <w:pPr>
+        <w:spacing w:after="60" w:line="360"/>
+        <w:ind w:firstLine="850"/>
+        <w:jc w:val="both"/>
+      </w:pPr>
+      <w:r>
+        <w:rPr>
+          <w:rFonts w:ascii="Lora Medium" w:hAnsi="Lora Medium" w:cs="Lora Medium" w:eastAsia="Lora Medium"/>
+        </w:rPr>
+        <w:t xml:space="preserve">A reclamação feita pelo canal oficial de atendimento da fabricante, por meio eletrônico, é plenamente válida para esse fim:</w:t>
       </w:r>
     </w:p>
     <w:p>
@@ -2077,109 +2349,144 @@
       </w:pPr>
       <w:r>
         <w:rPr>
-          <w:rFonts w:ascii="Lora SemiBold" w:hAnsi="Lora SemiBold" w:cs="Lora SemiBold" w:eastAsia="Lora SemiBold"/>
-          <w:sz w:val="18"/>
-          <w:szCs w:val="18"/>
-        </w:rPr>
-        <w:t xml:space="preserve">“RECURSO INOMINADO. DIREITO DO CONSUMIDOR. VÍCIO DO PRODUTO. </w:t>
-      </w:r>
-      <w:r>
-        <w:rPr>
-          <w:rFonts w:ascii="Lora" w:hAnsi="Lora" w:cs="Lora" w:eastAsia="Lora"/>
-          <w:b/>
-          <w:bCs/>
-          <w:sz w:val="18"/>
-          <w:szCs w:val="18"/>
-        </w:rPr>
-        <w:t xml:space="preserve">BEM ESSENCIAL. AUSÊNCIA DE SUBSTITUIÇÃO DO PRODUTO NO TRINTÍDIO LEGAL. RESSARCIMENTO INTEGRAL</w:t>
-      </w:r>
-      <w:r>
-        <w:rPr>
-          <w:rFonts w:ascii="Lora SemiBold" w:hAnsi="Lora SemiBold" w:cs="Lora SemiBold" w:eastAsia="Lora SemiBold"/>
-          <w:sz w:val="18"/>
-          <w:szCs w:val="18"/>
-        </w:rPr>
-        <w:t xml:space="preserve">. [...]” (TJPI – RECURSO INOMINADO CÍVEL 0800464-66.2022.8.18.0123 – Relator: JOÃO HENRIQUE SOUSA GOMES – 2ª Turma Recursal – julgado em 15/08/2024) (grifo nosso)</w:t>
-      </w:r>
-    </w:p>
-    <w:p>
-      <w:pPr>
-        <w:spacing w:after="60" w:line="360"/>
-        <w:ind w:firstLine="850"/>
-        <w:jc w:val="both"/>
-      </w:pPr>
-      <w:r>
-        <w:rPr>
-          <w:rFonts w:ascii="Lora SemiBold" w:hAnsi="Lora SemiBold" w:cs="Lora SemiBold" w:eastAsia="Lora SemiBold"/>
-        </w:rPr>
-        <w:t xml:space="preserve">Portanto, ainda que não se pretenda estabelecer uma regra abstrata de que toda e qualquer geladeira seja automaticamente considerada produto essencial, </w:t>
-      </w:r>
-      <w:r>
-        <w:rPr>
-          <w:rFonts w:ascii="Lora" w:hAnsi="Lora" w:cs="Lora" w:eastAsia="Lora"/>
-          <w:b/>
-          <w:bCs/>
-        </w:rPr>
-        <w:t xml:space="preserve">as circunstâncias específicas desta demanda demonstram que a privação de um refrigerador funcional produz impacto concreto na vida cotidiana da consumidora</w:t>
-      </w:r>
-      <w:r>
-        <w:rPr>
-          <w:rFonts w:ascii="Lora SemiBold" w:hAnsi="Lora SemiBold" w:cs="Lora SemiBold" w:eastAsia="Lora SemiBold"/>
-        </w:rPr>
-        <w:t xml:space="preserve">.</w:t>
-      </w:r>
-    </w:p>
-    <w:p>
-      <w:pPr>
-        <w:spacing w:after="60" w:line="360"/>
-        <w:ind w:firstLine="850"/>
-        <w:jc w:val="both"/>
-      </w:pPr>
-      <w:r>
-        <w:rPr>
-          <w:rFonts w:ascii="Lora SemiBold" w:hAnsi="Lora SemiBold" w:cs="Lora SemiBold" w:eastAsia="Lora SemiBold"/>
-        </w:rPr>
-        <w:t xml:space="preserve">Mais importante ainda, aqui não se discute apenas a necessidade de aguardar uma primeira tentativa de reparo. A Autora </w:t>
-      </w:r>
-      <w:r>
-        <w:rPr>
-          <w:rFonts w:ascii="Lora" w:hAnsi="Lora" w:cs="Lora" w:eastAsia="Lora"/>
-          <w:b/>
-          <w:bCs/>
-        </w:rPr>
-        <w:t xml:space="preserve">já passou por sucessivas tentativas de solução e substituições</w:t>
-      </w:r>
-      <w:r>
-        <w:rPr>
-          <w:rFonts w:ascii="Lora SemiBold" w:hAnsi="Lora SemiBold" w:cs="Lora SemiBold" w:eastAsia="Lora SemiBold"/>
-        </w:rPr>
-        <w:t xml:space="preserve">, inclusive uma formalmente documentada como troca em garantia.</w:t>
-      </w:r>
-    </w:p>
-    <w:p>
-      <w:pPr>
-        <w:spacing w:after="60" w:line="360"/>
-        <w:ind w:firstLine="850"/>
-        <w:jc w:val="both"/>
-      </w:pPr>
-      <w:r>
-        <w:rPr>
-          <w:rFonts w:ascii="Lora SemiBold" w:hAnsi="Lora SemiBold" w:cs="Lora SemiBold" w:eastAsia="Lora SemiBold"/>
-        </w:rPr>
-        <w:t xml:space="preserve">A insistência em submetê-la a novos ciclos de reparo e substituição representaria, na prática, prolongar indefinidamente uma situação que já se mostrou inadequadamente solucionada.</w:t>
-      </w:r>
-    </w:p>
-    <w:p>
-      <w:pPr>
-        <w:spacing w:after="60" w:line="360"/>
-        <w:ind w:firstLine="850"/>
-        <w:jc w:val="both"/>
-      </w:pPr>
-      <w:r>
-        <w:rPr>
-          <w:rFonts w:ascii="Lora SemiBold" w:hAnsi="Lora SemiBold" w:cs="Lora SemiBold" w:eastAsia="Lora SemiBold"/>
-        </w:rPr>
-        <w:t xml:space="preserve">Por isso, ainda que se entenda que a fornecedora não dispôs do prazo de 30 dias para sanar o vício do último aparelho, a Autora pode fazer uso imediato da restituição da quantia paga, nos termos do art. 18, §3º, do CDC. Não se pode exigir da consumidora que continue submetendo o produto à assistência técnica indefinidamente, como já decidiu o TJPI:</w:t>
+          <w:rFonts w:ascii="Lora Medium" w:hAnsi="Lora Medium" w:cs="Lora Medium" w:eastAsia="Lora Medium"/>
+          <w:sz w:val="18"/>
+          <w:szCs w:val="18"/>
+        </w:rPr>
+        <w:t xml:space="preserve">“3. A lei não preestabelece uma forma para a realização da reclamação, exigindo apenas comprovação de que o fornecedor tomou ciência inequívoca quanto ao propósito do consumidor de reclamar pelos vícios do produto ou serviço. 4. </w:t>
+      </w:r>
+      <w:r>
+        <w:rPr>
+          <w:rFonts w:ascii="Lora" w:hAnsi="Lora" w:cs="Lora" w:eastAsia="Lora"/>
+          <w:b/>
+          <w:bCs/>
+          <w:sz w:val="18"/>
+          <w:szCs w:val="18"/>
+        </w:rPr>
+        <w:t xml:space="preserve">A reclamação obstativa da decadência, prevista no art. 26, § 2º, I, do CDC, pode ser feita documentalmente – por meio físico ou eletrônico – ou mesmo verbalmente – pessoalmente ou por telefone</w:t>
+      </w:r>
+      <w:r>
+        <w:rPr>
+          <w:rFonts w:ascii="Lora Medium" w:hAnsi="Lora Medium" w:cs="Lora Medium" w:eastAsia="Lora Medium"/>
+          <w:sz w:val="18"/>
+          <w:szCs w:val="18"/>
+        </w:rPr>
+        <w:t xml:space="preserve"> – e, consequentemente, a sua comprovação pode dar-se por todos os meios admitidos em direito.” (STJ – REsp 1.442.597/DF – Rel. Ministra NANCY ANDRIGHI – Terceira Turma – julgado em 24/10/2017 – DJe 30/10/2017) (grifo nosso)</w:t>
+      </w:r>
+    </w:p>
+    <w:p>
+      <w:pPr>
+        <w:spacing w:after="60" w:line="360"/>
+        <w:ind w:firstLine="850"/>
+        <w:jc w:val="both"/>
+      </w:pPr>
+      <w:r>
+        <w:rPr>
+          <w:rFonts w:ascii="Lora Medium" w:hAnsi="Lora Medium" w:cs="Lora Medium" w:eastAsia="Lora Medium"/>
+        </w:rPr>
+        <w:t xml:space="preserve">Ainda que assim não fosse, a eventual decadência do direito de exigir as alternativas do art. 18, § 1º, do CDC não alcançaria as pretensões indenizatórias, sujeitas a prazo prescricional, conforme orientação do STJ registrada no mesmo AgInt no AREsp 2.174.028/SP (AgInt no REsp 1.788.020/PB, Rel. Ministro Luis Felipe Salomão, Quarta Turma, DJe de 16/10/2020).</w:t>
+      </w:r>
+    </w:p>
+    <w:p>
+      <w:pPr>
+        <w:keepNext/>
+        <w:tabs>
+          <w:tab w:val="left" w:pos="700"/>
+        </w:tabs>
+        <w:spacing w:before="240" w:after="160" w:line="360"/>
+        <w:ind w:left="700" w:hanging="400"/>
+      </w:pPr>
+      <w:r>
+        <w:rPr>
+          <w:rFonts w:ascii="Lora" w:hAnsi="Lora" w:cs="Lora" w:eastAsia="Lora"/>
+          <w:b/>
+          <w:bCs/>
+          <w:i/>
+          <w:iCs/>
+        </w:rPr>
+        <w:t xml:space="preserve">f.</w:t>
+        <w:tab/>
+        <w:t xml:space="preserve">Da restituição integral do valor pago:</w:t>
+      </w:r>
+    </w:p>
+    <w:p>
+      <w:pPr>
+        <w:spacing w:after="60" w:line="360"/>
+        <w:ind w:firstLine="850"/>
+        <w:jc w:val="both"/>
+      </w:pPr>
+      <w:r>
+        <w:rPr>
+          <w:rFonts w:ascii="Lora Medium" w:hAnsi="Lora Medium" w:cs="Lora Medium" w:eastAsia="Lora Medium"/>
+        </w:rPr>
+        <w:t xml:space="preserve">Diante da persistência do vício e da sucessão de tentativas frustradas de solução, a Autora opta pela </w:t>
+      </w:r>
+      <w:r>
+        <w:rPr>
+          <w:rFonts w:ascii="Lora" w:hAnsi="Lora" w:cs="Lora" w:eastAsia="Lora"/>
+          <w:b/>
+          <w:bCs/>
+        </w:rPr>
+        <w:t xml:space="preserve">restituição integral do valor pago</w:t>
+      </w:r>
+      <w:r>
+        <w:rPr>
+          <w:rFonts w:ascii="Lora Medium" w:hAnsi="Lora Medium" w:cs="Lora Medium" w:eastAsia="Lora Medium"/>
+        </w:rPr>
+        <w:t xml:space="preserve">, nos termos do art. 18, §1º, II, do CDC.</w:t>
+      </w:r>
+    </w:p>
+    <w:p>
+      <w:pPr>
+        <w:spacing w:after="60" w:line="360"/>
+        <w:ind w:firstLine="850"/>
+        <w:jc w:val="both"/>
+      </w:pPr>
+      <w:r>
+        <w:rPr>
+          <w:rFonts w:ascii="Lora Medium" w:hAnsi="Lora Medium" w:cs="Lora Medium" w:eastAsia="Lora Medium"/>
+        </w:rPr>
+        <w:t xml:space="preserve">O valor pago pela consumidora foi de </w:t>
+      </w:r>
+      <w:r>
+        <w:rPr>
+          <w:rFonts w:ascii="Lora" w:hAnsi="Lora" w:cs="Lora" w:eastAsia="Lora"/>
+          <w:b/>
+          <w:bCs/>
+        </w:rPr>
+        <w:t xml:space="preserve">R$ 3.438,90</w:t>
+      </w:r>
+      <w:r>
+        <w:rPr>
+          <w:rFonts w:ascii="Lora Medium" w:hAnsi="Lora Medium" w:cs="Lora Medium" w:eastAsia="Lora Medium"/>
+        </w:rPr>
+        <w:t xml:space="preserve">, conforme NF-e nº 000.496.852 (chave de acesso 2525 0662 0583 1800 1233 5500 1000 4968 5219 8186 8756).</w:t>
+      </w:r>
+    </w:p>
+    <w:p>
+      <w:pPr>
+        <w:spacing w:after="60" w:line="360"/>
+        <w:ind w:firstLine="850"/>
+        <w:jc w:val="both"/>
+      </w:pPr>
+      <w:r>
+        <w:rPr>
+          <w:rFonts w:ascii="Lora Medium" w:hAnsi="Lora Medium" w:cs="Lora Medium" w:eastAsia="Lora Medium"/>
+        </w:rPr>
+        <w:t xml:space="preserve">A restituição deve compreender o valor efetivamente desembolsado pela consumidora, devidamente atualizado, sem que lhe seja imposta qualquer redução decorrente do tempo de utilização do produto.</w:t>
+      </w:r>
+    </w:p>
+    <w:p>
+      <w:pPr>
+        <w:spacing w:after="60" w:line="360"/>
+        <w:ind w:firstLine="850"/>
+        <w:jc w:val="both"/>
+      </w:pPr>
+      <w:r>
+        <w:rPr>
+          <w:rFonts w:ascii="Lora Medium" w:hAnsi="Lora Medium" w:cs="Lora Medium" w:eastAsia="Lora Medium"/>
+        </w:rPr>
+        <w:t xml:space="preserve">O Superior Tribunal de Justiça já decidiu, em ambas as Turmas de Direito Privado, que a restituição prevista no art. 18, §1º, II, do CDC corresponde ao valor pago, corrigido desde o desembolso, sem abatimento pelo uso, e que o uso do bem não afasta os juros de mora:</w:t>
       </w:r>
     </w:p>
     <w:p>
@@ -2194,29 +2501,79 @@
       </w:pPr>
       <w:r>
         <w:rPr>
-          <w:rFonts w:ascii="Lora SemiBold" w:hAnsi="Lora SemiBold" w:cs="Lora SemiBold" w:eastAsia="Lora SemiBold"/>
-          <w:sz w:val="18"/>
-          <w:szCs w:val="18"/>
-        </w:rPr>
-        <w:t xml:space="preserve">“Embora a parte apelante alegue que a apelada tenha se negado a encaminhar o produto novamente para a assistência técnica, </w:t>
-      </w:r>
-      <w:r>
-        <w:rPr>
-          <w:rFonts w:ascii="Lora" w:hAnsi="Lora" w:cs="Lora" w:eastAsia="Lora"/>
-          <w:b/>
-          <w:bCs/>
-          <w:sz w:val="18"/>
-          <w:szCs w:val="18"/>
-        </w:rPr>
-        <w:t xml:space="preserve">não se pode exigir do consumidor que permaneça na posse de um produto que não presta para o fim a que se destina, necessitando ser encaminhado diversas vezes para a assistência técnica, sem que os vícios sejam efetivamente reparados</w:t>
-      </w:r>
-      <w:r>
-        <w:rPr>
-          <w:rFonts w:ascii="Lora SemiBold" w:hAnsi="Lora SemiBold" w:cs="Lora SemiBold" w:eastAsia="Lora SemiBold"/>
-          <w:sz w:val="18"/>
-          <w:szCs w:val="18"/>
-        </w:rPr>
-        <w:t xml:space="preserve">, sendo evidente a necessidade de restituição do valor desembolsado [...]” (TJPI – APELAÇÃO CÍVEL 0800277-66.2020.8.18.0046 – Relator: Des. HAROLDO OLIVEIRA REHEM – 1ª Câmara Especializada Cível – julgado em 20/11/2023 – trecho do voto) (grifo nosso)</w:t>
+          <w:rFonts w:ascii="Lora Medium" w:hAnsi="Lora Medium" w:cs="Lora Medium" w:eastAsia="Lora Medium"/>
+          <w:sz w:val="18"/>
+          <w:szCs w:val="18"/>
+        </w:rPr>
+        <w:t xml:space="preserve">“3- </w:t>
+      </w:r>
+      <w:r>
+        <w:rPr>
+          <w:rFonts w:ascii="Lora" w:hAnsi="Lora" w:cs="Lora" w:eastAsia="Lora"/>
+          <w:b/>
+          <w:bCs/>
+          <w:sz w:val="18"/>
+          <w:szCs w:val="18"/>
+        </w:rPr>
+        <w:t xml:space="preserve">O valor a ser restituído deve corresponder à quantia paga, devidamente corrigido monetariamente desde o desembolso</w:t>
+      </w:r>
+      <w:r>
+        <w:rPr>
+          <w:rFonts w:ascii="Lora Medium" w:hAnsi="Lora Medium" w:cs="Lora Medium" w:eastAsia="Lora Medium"/>
+          <w:sz w:val="18"/>
+          <w:szCs w:val="18"/>
+        </w:rPr>
+        <w:t xml:space="preserve">, conforme determina o inciso II, do § 1º, do art. 18, do CDC, </w:t>
+      </w:r>
+      <w:r>
+        <w:rPr>
+          <w:rFonts w:ascii="Lora" w:hAnsi="Lora" w:cs="Lora" w:eastAsia="Lora"/>
+          <w:b/>
+          <w:bCs/>
+          <w:sz w:val="18"/>
+          <w:szCs w:val="18"/>
+        </w:rPr>
+        <w:t xml:space="preserve">não sendo devido qualquer abatimento decorrente da utilização do produto pelo consumidor</w:t>
+      </w:r>
+      <w:r>
+        <w:rPr>
+          <w:rFonts w:ascii="Lora Medium" w:hAnsi="Lora Medium" w:cs="Lora Medium" w:eastAsia="Lora Medium"/>
+          <w:sz w:val="18"/>
+          <w:szCs w:val="18"/>
+        </w:rPr>
+        <w:t xml:space="preserve">. Precedente. 4- Na hipótese de restituição da quantia paga em razão da responsabilidade por vício do produto (art. 18, § 1º, II, do CDC), a utilização do bem pelo consumidor não afasta a incidência de juros de mora.” (STJ – REsp 2.025.169/RS – Rel. Ministra NANCY ANDRIGHI – Terceira Turma – julgado em 07/03/2023 – DJe 10/03/2023) (grifo nosso)</w:t>
+      </w:r>
+    </w:p>
+    <w:p>
+      <w:pPr>
+        <w:pBdr>
+          <w:top w:val="single" w:color="9AA0A6" w:sz="4" w:space="6"/>
+          <w:bottom w:val="single" w:color="9AA0A6" w:sz="4" w:space="6"/>
+        </w:pBdr>
+        <w:spacing w:before="160" w:after="200" w:line="240"/>
+        <w:ind w:left="2270" w:right="570"/>
+        <w:jc w:val="both"/>
+      </w:pPr>
+      <w:r>
+        <w:rPr>
+          <w:rFonts w:ascii="Lora Medium" w:hAnsi="Lora Medium" w:cs="Lora Medium" w:eastAsia="Lora Medium"/>
+          <w:sz w:val="18"/>
+          <w:szCs w:val="18"/>
+        </w:rPr>
+        <w:t xml:space="preserve">“5. O valor a ser restituído ao consumidor deve corresponder à quantia paga, corrigida monetariamente desde o desembolso, conforme prevê o inciso II do § 1º do art. 18 do CDC, não sendo devido abatimento decorrente da utilização do produto. Súmula 83/STJ.” (STJ – AgInt no AREsp 2.419.630/SP – Rel. Ministra MARIA ISABEL GALLOTTI – Quarta Turma – julgado em 12/08/2024 – DJe 14/08/2024)</w:t>
+      </w:r>
+    </w:p>
+    <w:p>
+      <w:pPr>
+        <w:spacing w:after="60" w:line="360"/>
+        <w:ind w:firstLine="850"/>
+        <w:jc w:val="both"/>
+      </w:pPr>
+      <w:r>
+        <w:rPr>
+          <w:rFonts w:ascii="Lora Medium" w:hAnsi="Lora Medium" w:cs="Lora Medium" w:eastAsia="Lora Medium"/>
+        </w:rPr>
+        <w:t xml:space="preserve">Assim, diante da opção da consumidora pela resolução da relação de consumo, deve ser determinada a restituição do valor pago, com o recolhimento do produto atualmente existente na residência da Autora, às expensas das Rés, em data previamente agendada com a consumidora, tal como determinado pelo TJPI em caso análogo, no qual a devolução se deu por logística reversa organizada e custeada pela fabricante (TJPI – APELAÇÃO CÍVEL 0818494-30.2024.8.18.0140, citada no tópico “a”).</w:t>
       </w:r>
     </w:p>
     <w:p>
@@ -2236,23 +2593,30 @@
           <w:i/>
           <w:iCs/>
         </w:rPr>
-        <w:t xml:space="preserve">e.</w:t>
+        <w:t xml:space="preserve">g.</w:t>
         <w:tab/>
-        <w:t xml:space="preserve">Da inexistência de decadência:</w:t>
-      </w:r>
-    </w:p>
-    <w:p>
-      <w:pPr>
-        <w:spacing w:after="60" w:line="360"/>
-        <w:ind w:firstLine="850"/>
-        <w:jc w:val="both"/>
-      </w:pPr>
-      <w:r>
-        <w:rPr>
-          <w:rFonts w:ascii="Lora SemiBold" w:hAnsi="Lora SemiBold" w:cs="Lora SemiBold" w:eastAsia="Lora SemiBold"/>
-        </w:rPr>
-        <w:t xml:space="preserve">O prazo de 90 dias para reclamar de vícios em produtos duráveis (art. 26, II, do CDC) não se consumou. O vício do último aparelho surgiu em </w:t>
-      </w:r>
+        <w:t xml:space="preserve">Dos danos materiais:</w:t>
+      </w:r>
+    </w:p>
+    <w:p>
+      <w:pPr>
+        <w:spacing w:after="60" w:line="360"/>
+        <w:ind w:firstLine="850"/>
+        <w:jc w:val="both"/>
+      </w:pPr>
+      <w:r>
+        <w:rPr>
+          <w:rFonts w:ascii="Lora Medium" w:hAnsi="Lora Medium" w:cs="Lora Medium" w:eastAsia="Lora Medium"/>
+        </w:rPr>
+        <w:t xml:space="preserve">Além da restituição do preço, a Autora suportou despesas diretamente decorrentes da sucessão de defeitos, que devem ser ressarcidas sem prejuízo da restituição (art. 18, §1º, II, do CDC – “sem prejuízo de eventuais perdas e danos”):</w:t>
+      </w:r>
+    </w:p>
+    <w:p>
+      <w:pPr>
+        <w:spacing w:after="60" w:line="360"/>
+        <w:ind w:firstLine="850"/>
+        <w:jc w:val="both"/>
+      </w:pPr>
       <w:r>
         <w:rPr>
           <w:rFonts w:ascii="Lora" w:hAnsi="Lora" w:cs="Lora" w:eastAsia="Lora"/>
@@ -2260,13 +2624,20 @@
           <w:bCs/>
           <w:shd w:val="clear" w:color="auto" w:fill="FFF200"/>
         </w:rPr>
-        <w:t xml:space="preserve">[data]</w:t>
-      </w:r>
-      <w:r>
-        <w:rPr>
-          <w:rFonts w:ascii="Lora SemiBold" w:hAnsi="Lora SemiBold" w:cs="Lora SemiBold" w:eastAsia="Lora SemiBold"/>
-        </w:rPr>
-        <w:t xml:space="preserve">, e a Autora o reclamou perante a fornecedora em </w:t>
+        <w:t xml:space="preserve">[listar cada gasto com valor e comprovante – ex.: deslocamento de Miguel Alves a Teresina para a audiência no PROCON em 03/03/2026; alimentos perdidos. Sem comprovantes, excluir este tópico e o pedido “H”, e ajustar o valor da causa]</w:t>
+      </w:r>
+    </w:p>
+    <w:p>
+      <w:pPr>
+        <w:spacing w:after="60" w:line="360"/>
+        <w:ind w:firstLine="850"/>
+        <w:jc w:val="both"/>
+      </w:pPr>
+      <w:r>
+        <w:rPr>
+          <w:rFonts w:ascii="Lora Medium" w:hAnsi="Lora Medium" w:cs="Lora Medium" w:eastAsia="Lora Medium"/>
+        </w:rPr>
+        <w:t xml:space="preserve">Os valores comprovados somam R$ </w:t>
       </w:r>
       <w:r>
         <w:rPr>
@@ -2275,13 +2646,13 @@
           <w:bCs/>
           <w:shd w:val="clear" w:color="auto" w:fill="FFF200"/>
         </w:rPr>
-        <w:t xml:space="preserve">[data]</w:t>
-      </w:r>
-      <w:r>
-        <w:rPr>
-          <w:rFonts w:ascii="Lora SemiBold" w:hAnsi="Lora SemiBold" w:cs="Lora SemiBold" w:eastAsia="Lora SemiBold"/>
-        </w:rPr>
-        <w:t xml:space="preserve">, por meio do atendimento oficial da Consul </w:t>
+        <w:t xml:space="preserve">[total]</w:t>
+      </w:r>
+      <w:r>
+        <w:rPr>
+          <w:rFonts w:ascii="Lora Medium" w:hAnsi="Lora Medium" w:cs="Lora Medium" w:eastAsia="Lora Medium"/>
+        </w:rPr>
+        <w:t xml:space="preserve"> </w:t>
       </w:r>
       <w:r>
         <w:rPr>
@@ -2290,11 +2661,327 @@
           <w:bCs/>
           <w:shd w:val="clear" w:color="auto" w:fill="FFF200"/>
         </w:rPr>
-        <w:t xml:space="preserve">[Doc. 12]</w:t>
-      </w:r>
-      <w:r>
-        <w:rPr>
-          <w:rFonts w:ascii="Lora SemiBold" w:hAnsi="Lora SemiBold" w:cs="Lora SemiBold" w:eastAsia="Lora SemiBold"/>
+        <w:t xml:space="preserve">[Doc. 14 – comprovantes das despesas]</w:t>
+      </w:r>
+      <w:r>
+        <w:rPr>
+          <w:rFonts w:ascii="Lora Medium" w:hAnsi="Lora Medium" w:cs="Lora Medium" w:eastAsia="Lora Medium"/>
+        </w:rPr>
+        <w:t xml:space="preserve">. O TJPI reconhece a indenização de despesas dessa natureza em caso de refrigerador não reparado, inclusive o aluguel de outro aparelho durante o período (TJPI – APELAÇÃO CÍVEL 0000693-24.2017.8.18.0062, citada no tópico “c”, item 8 da ementa).</w:t>
+      </w:r>
+    </w:p>
+    <w:p>
+      <w:pPr>
+        <w:keepNext/>
+        <w:tabs>
+          <w:tab w:val="left" w:pos="700"/>
+        </w:tabs>
+        <w:spacing w:before="240" w:after="160" w:line="360"/>
+        <w:ind w:left="700" w:hanging="400"/>
+      </w:pPr>
+      <w:r>
+        <w:rPr>
+          <w:rFonts w:ascii="Lora" w:hAnsi="Lora" w:cs="Lora" w:eastAsia="Lora"/>
+          <w:b/>
+          <w:bCs/>
+          <w:i/>
+          <w:iCs/>
+        </w:rPr>
+        <w:t xml:space="preserve">h.</w:t>
+        <w:tab/>
+        <w:t xml:space="preserve">Do dano moral e do desvio produtivo do consumidor:</w:t>
+      </w:r>
+    </w:p>
+    <w:p>
+      <w:pPr>
+        <w:spacing w:after="60" w:line="360"/>
+        <w:ind w:firstLine="850"/>
+        <w:jc w:val="both"/>
+      </w:pPr>
+      <w:r>
+        <w:rPr>
+          <w:rFonts w:ascii="Lora Medium" w:hAnsi="Lora Medium" w:cs="Lora Medium" w:eastAsia="Lora Medium"/>
+        </w:rPr>
+        <w:t xml:space="preserve">É importante destacar que a pretensão indenizatória não se fundamenta simplesmente no fato de o produto ter apresentado defeito.</w:t>
+      </w:r>
+    </w:p>
+    <w:p>
+      <w:pPr>
+        <w:spacing w:after="60" w:line="360"/>
+        <w:ind w:firstLine="850"/>
+        <w:jc w:val="both"/>
+      </w:pPr>
+      <w:r>
+        <w:rPr>
+          <w:rFonts w:ascii="Lora Medium" w:hAnsi="Lora Medium" w:cs="Lora Medium" w:eastAsia="Lora Medium"/>
+        </w:rPr>
+        <w:t xml:space="preserve">A Autora não pretende transformar todo e qualquer problema relacionado a um eletrodoméstico em dano moral automático.</w:t>
+      </w:r>
+    </w:p>
+    <w:p>
+      <w:pPr>
+        <w:spacing w:after="60" w:line="360"/>
+        <w:ind w:firstLine="850"/>
+        <w:jc w:val="both"/>
+      </w:pPr>
+      <w:r>
+        <w:rPr>
+          <w:rFonts w:ascii="Lora Medium" w:hAnsi="Lora Medium" w:cs="Lora Medium" w:eastAsia="Lora Medium"/>
+        </w:rPr>
+        <w:t xml:space="preserve">O que caracteriza a particularidade do presente caso é a </w:t>
+      </w:r>
+      <w:r>
+        <w:rPr>
+          <w:rFonts w:ascii="Lora" w:hAnsi="Lora" w:cs="Lora" w:eastAsia="Lora"/>
+          <w:b/>
+          <w:bCs/>
+        </w:rPr>
+        <w:t xml:space="preserve">reiteração do problema e o prolongamento da tentativa de solução</w:t>
+      </w:r>
+      <w:r>
+        <w:rPr>
+          <w:rFonts w:ascii="Lora Medium" w:hAnsi="Lora Medium" w:cs="Lora Medium" w:eastAsia="Lora Medium"/>
+        </w:rPr>
+        <w:t xml:space="preserve">, apesar das sucessivas providências adotadas pela consumidora.</w:t>
+      </w:r>
+    </w:p>
+    <w:p>
+      <w:pPr>
+        <w:spacing w:after="60" w:line="360"/>
+        <w:ind w:firstLine="850"/>
+        <w:jc w:val="both"/>
+      </w:pPr>
+      <w:r>
+        <w:rPr>
+          <w:rFonts w:ascii="Lora Medium" w:hAnsi="Lora Medium" w:cs="Lora Medium" w:eastAsia="Lora Medium"/>
+        </w:rPr>
+        <w:t xml:space="preserve">A Autora:</w:t>
+      </w:r>
+    </w:p>
+    <w:p>
+      <w:pPr>
+        <w:tabs>
+          <w:tab w:val="left" w:pos="1000"/>
+        </w:tabs>
+        <w:spacing w:after="60" w:line="360"/>
+        <w:ind w:left="1000" w:hanging="400"/>
+        <w:jc w:val="both"/>
+      </w:pPr>
+      <w:r>
+        <w:rPr>
+          <w:rFonts w:ascii="Lora Medium" w:hAnsi="Lora Medium" w:cs="Lora Medium" w:eastAsia="Lora Medium"/>
+        </w:rPr>
+        <w:t xml:space="preserve">1.</w:t>
+        <w:tab/>
+      </w:r>
+      <w:r>
+        <w:rPr>
+          <w:rFonts w:ascii="Lora Medium" w:hAnsi="Lora Medium" w:cs="Lora Medium" w:eastAsia="Lora Medium"/>
+        </w:rPr>
+        <w:t xml:space="preserve">adquiriu um produto novo, que deixou de refrigerar com pouco tempo de uso;</w:t>
+      </w:r>
+    </w:p>
+    <w:p>
+      <w:pPr>
+        <w:tabs>
+          <w:tab w:val="left" w:pos="1000"/>
+        </w:tabs>
+        <w:spacing w:after="60" w:line="360"/>
+        <w:ind w:left="1000" w:hanging="400"/>
+        <w:jc w:val="both"/>
+      </w:pPr>
+      <w:r>
+        <w:rPr>
+          <w:rFonts w:ascii="Lora Medium" w:hAnsi="Lora Medium" w:cs="Lora Medium" w:eastAsia="Lora Medium"/>
+        </w:rPr>
+        <w:t xml:space="preserve">2.</w:t>
+        <w:tab/>
+      </w:r>
+      <w:r>
+        <w:rPr>
+          <w:rFonts w:ascii="Lora Medium" w:hAnsi="Lora Medium" w:cs="Lora Medium" w:eastAsia="Lora Medium"/>
+        </w:rPr>
+        <w:t xml:space="preserve">aguardou a assistência técnica, que não sanou o defeito em 30 dias;</w:t>
+      </w:r>
+    </w:p>
+    <w:p>
+      <w:pPr>
+        <w:tabs>
+          <w:tab w:val="left" w:pos="1000"/>
+        </w:tabs>
+        <w:spacing w:after="60" w:line="360"/>
+        <w:ind w:left="1000" w:hanging="400"/>
+        <w:jc w:val="both"/>
+      </w:pPr>
+      <w:r>
+        <w:rPr>
+          <w:rFonts w:ascii="Lora Medium" w:hAnsi="Lora Medium" w:cs="Lora Medium" w:eastAsia="Lora Medium"/>
+        </w:rPr>
+        <w:t xml:space="preserve">3.</w:t>
+        <w:tab/>
+      </w:r>
+      <w:r>
+        <w:rPr>
+          <w:rFonts w:ascii="Lora Medium" w:hAnsi="Lora Medium" w:cs="Lora Medium" w:eastAsia="Lora Medium"/>
+        </w:rPr>
+        <w:t xml:space="preserve">registrou reclamação no PROCON;</w:t>
+      </w:r>
+    </w:p>
+    <w:p>
+      <w:pPr>
+        <w:tabs>
+          <w:tab w:val="left" w:pos="1000"/>
+        </w:tabs>
+        <w:spacing w:after="60" w:line="360"/>
+        <w:ind w:left="1000" w:hanging="400"/>
+        <w:jc w:val="both"/>
+      </w:pPr>
+      <w:r>
+        <w:rPr>
+          <w:rFonts w:ascii="Lora Medium" w:hAnsi="Lora Medium" w:cs="Lora Medium" w:eastAsia="Lora Medium"/>
+        </w:rPr>
+        <w:t xml:space="preserve">4.</w:t>
+        <w:tab/>
+      </w:r>
+      <w:r>
+        <w:rPr>
+          <w:rFonts w:ascii="Lora Medium" w:hAnsi="Lora Medium" w:cs="Lora Medium" w:eastAsia="Lora Medium"/>
+        </w:rPr>
+        <w:t xml:space="preserve">recebeu, na primeira troca, um aparelho recuperado, com remendos e amassados;</w:t>
+      </w:r>
+    </w:p>
+    <w:p>
+      <w:pPr>
+        <w:tabs>
+          <w:tab w:val="left" w:pos="1000"/>
+        </w:tabs>
+        <w:spacing w:after="60" w:line="360"/>
+        <w:ind w:left="1000" w:hanging="400"/>
+        <w:jc w:val="both"/>
+      </w:pPr>
+      <w:r>
+        <w:rPr>
+          <w:rFonts w:ascii="Lora Medium" w:hAnsi="Lora Medium" w:cs="Lora Medium" w:eastAsia="Lora Medium"/>
+        </w:rPr>
+        <w:t xml:space="preserve">5.</w:t>
+        <w:tab/>
+      </w:r>
+      <w:r>
+        <w:rPr>
+          <w:rFonts w:ascii="Lora Medium" w:hAnsi="Lora Medium" w:cs="Lora Medium" w:eastAsia="Lora Medium"/>
+        </w:rPr>
+        <w:t xml:space="preserve">participou de audiência no PROCON, em Teresina, e aceitou nova troca;</w:t>
+      </w:r>
+    </w:p>
+    <w:p>
+      <w:pPr>
+        <w:tabs>
+          <w:tab w:val="left" w:pos="1000"/>
+        </w:tabs>
+        <w:spacing w:after="60" w:line="360"/>
+        <w:ind w:left="1000" w:hanging="400"/>
+        <w:jc w:val="both"/>
+      </w:pPr>
+      <w:r>
+        <w:rPr>
+          <w:rFonts w:ascii="Lora Medium" w:hAnsi="Lora Medium" w:cs="Lora Medium" w:eastAsia="Lora Medium"/>
+        </w:rPr>
+        <w:t xml:space="preserve">6.</w:t>
+        <w:tab/>
+      </w:r>
+      <w:r>
+        <w:rPr>
+          <w:rFonts w:ascii="Lora Medium" w:hAnsi="Lora Medium" w:cs="Lora Medium" w:eastAsia="Lora Medium"/>
+        </w:rPr>
+        <w:t xml:space="preserve">recebeu o modelo CRM50MK, que também apresentou defeito;</w:t>
+      </w:r>
+    </w:p>
+    <w:p>
+      <w:pPr>
+        <w:tabs>
+          <w:tab w:val="left" w:pos="1000"/>
+        </w:tabs>
+        <w:spacing w:after="60" w:line="360"/>
+        <w:ind w:left="1000" w:hanging="400"/>
+        <w:jc w:val="both"/>
+      </w:pPr>
+      <w:r>
+        <w:rPr>
+          <w:rFonts w:ascii="Lora Medium" w:hAnsi="Lora Medium" w:cs="Lora Medium" w:eastAsia="Lora Medium"/>
+        </w:rPr>
+        <w:t xml:space="preserve">7.</w:t>
+        <w:tab/>
+      </w:r>
+      <w:r>
+        <w:rPr>
+          <w:rFonts w:ascii="Lora Medium" w:hAnsi="Lora Medium" w:cs="Lora Medium" w:eastAsia="Lora Medium"/>
+        </w:rPr>
+        <w:t xml:space="preserve">e, mesmo após todas essas providências, permanece sem refrigerador em funcionamento.</w:t>
+      </w:r>
+    </w:p>
+    <w:p>
+      <w:pPr>
+        <w:spacing w:after="60" w:line="360"/>
+        <w:ind w:firstLine="850"/>
+        <w:jc w:val="both"/>
+      </w:pPr>
+      <w:r>
+        <w:rPr>
+          <w:rFonts w:ascii="Lora Medium" w:hAnsi="Lora Medium" w:cs="Lora Medium" w:eastAsia="Lora Medium"/>
+        </w:rPr>
+        <w:t xml:space="preserve">Não se trata, portanto, de um simples aborrecimento cotidiano.</w:t>
+      </w:r>
+    </w:p>
+    <w:p>
+      <w:pPr>
+        <w:spacing w:after="60" w:line="360"/>
+        <w:ind w:firstLine="850"/>
+        <w:jc w:val="both"/>
+      </w:pPr>
+      <w:r>
+        <w:rPr>
+          <w:rFonts w:ascii="Lora Medium" w:hAnsi="Lora Medium" w:cs="Lora Medium" w:eastAsia="Lora Medium"/>
+        </w:rPr>
+        <w:t xml:space="preserve">A consumidora foi obrigada a </w:t>
+      </w:r>
+      <w:r>
+        <w:rPr>
+          <w:rFonts w:ascii="Lora" w:hAnsi="Lora" w:cs="Lora" w:eastAsia="Lora"/>
+          <w:b/>
+          <w:bCs/>
+        </w:rPr>
+        <w:t xml:space="preserve">desviar tempo de sua vida pessoal para solucionar problema criado pelos próprios fornecedores</w:t>
+      </w:r>
+      <w:r>
+        <w:rPr>
+          <w:rFonts w:ascii="Lora Medium" w:hAnsi="Lora Medium" w:cs="Lora Medium" w:eastAsia="Lora Medium"/>
+        </w:rPr>
+        <w:t xml:space="preserve">, realizando contatos, reclamações, acompanhamentos e deslocamentos que não deveriam existir se o produto tivesse sido adequadamente fornecido ou se o vício tivesse sido definitivamente solucionado.</w:t>
+      </w:r>
+    </w:p>
+    <w:p>
+      <w:pPr>
+        <w:spacing w:after="60" w:line="360"/>
+        <w:ind w:firstLine="850"/>
+        <w:jc w:val="both"/>
+      </w:pPr>
+      <w:r>
+        <w:rPr>
+          <w:rFonts w:ascii="Lora Medium" w:hAnsi="Lora Medium" w:cs="Lora Medium" w:eastAsia="Lora Medium"/>
+        </w:rPr>
+        <w:t xml:space="preserve">Essa situação caracteriza o chamado </w:t>
+      </w:r>
+      <w:r>
+        <w:rPr>
+          <w:rFonts w:ascii="Lora" w:hAnsi="Lora" w:cs="Lora" w:eastAsia="Lora"/>
+          <w:b/>
+          <w:bCs/>
+        </w:rPr>
+        <w:t xml:space="preserve">desvio produtivo do consumidor</w:t>
+      </w:r>
+      <w:r>
+        <w:rPr>
+          <w:rFonts w:ascii="Lora Medium" w:hAnsi="Lora Medium" w:cs="Lora Medium" w:eastAsia="Lora Medium"/>
         </w:rPr>
         <w:t xml:space="preserve">.</w:t>
       </w:r>
@@ -2307,24 +2994,9 @@
       </w:pPr>
       <w:r>
         <w:rPr>
-          <w:rFonts w:ascii="Lora SemiBold" w:hAnsi="Lora SemiBold" w:cs="Lora SemiBold" w:eastAsia="Lora SemiBold"/>
-        </w:rPr>
-        <w:t xml:space="preserve">A reclamação comprovadamente formulada perante o fornecedor obsta a decadência até a resposta negativa correspondente, transmitida de forma inequívoca (art. 26, §2º, I, do CDC) </w:t>
-      </w:r>
-      <w:r>
-        <w:rPr>
-          <w:rFonts w:ascii="Lora" w:hAnsi="Lora" w:cs="Lora" w:eastAsia="Lora"/>
-          <w:b/>
-          <w:bCs/>
-          <w:shd w:val="clear" w:color="auto" w:fill="FFF200"/>
-        </w:rPr>
-        <w:t xml:space="preserve">[confirmar com a cliente se houve resposta negativa da fornecedora e em que data]</w:t>
-      </w:r>
-      <w:r>
-        <w:rPr>
-          <w:rFonts w:ascii="Lora SemiBold" w:hAnsi="Lora SemiBold" w:cs="Lora SemiBold" w:eastAsia="Lora SemiBold"/>
-        </w:rPr>
-        <w:t xml:space="preserve">. É o entendimento pacífico do Superior Tribunal de Justiça:</w:t>
+          <w:rFonts w:ascii="Lora Medium" w:hAnsi="Lora Medium" w:cs="Lora Medium" w:eastAsia="Lora Medium"/>
+        </w:rPr>
+        <w:t xml:space="preserve">O Tribunal de Justiça do Piauí reconhece expressamente essa construção em casos de vício de produto não solucionado:</w:t>
       </w:r>
     </w:p>
     <w:p>
@@ -2339,42 +3011,29 @@
       </w:pPr>
       <w:r>
         <w:rPr>
-          <w:rFonts w:ascii="Lora SemiBold" w:hAnsi="Lora SemiBold" w:cs="Lora SemiBold" w:eastAsia="Lora SemiBold"/>
-          <w:sz w:val="18"/>
-          <w:szCs w:val="18"/>
-        </w:rPr>
-        <w:t xml:space="preserve">“4. “Tratando-se de vício oculto do produto, o prazo decadencial tem início no momento em que evidenciado o defeito, e </w:t>
-      </w:r>
-      <w:r>
-        <w:rPr>
-          <w:rFonts w:ascii="Lora" w:hAnsi="Lora" w:cs="Lora" w:eastAsia="Lora"/>
-          <w:b/>
-          <w:bCs/>
-          <w:sz w:val="18"/>
-          <w:szCs w:val="18"/>
-        </w:rPr>
-        <w:t xml:space="preserve">a reclamação do consumidor formulada diretamente ao fornecedor obsta o prazo de decadência até a resposta negativa deste</w:t>
-      </w:r>
-      <w:r>
-        <w:rPr>
-          <w:rFonts w:ascii="Lora SemiBold" w:hAnsi="Lora SemiBold" w:cs="Lora SemiBold" w:eastAsia="Lora SemiBold"/>
-          <w:sz w:val="18"/>
-          <w:szCs w:val="18"/>
-        </w:rPr>
-        <w:t xml:space="preserve">” (REsp n. 1.303.510/SP, relator Ministro João Otávio de Noronha, Terceira Turma, DJe de 6/11/2015).” (STJ – AgInt no AREsp 2.174.028/SP – Rel. Ministro HUMBERTO MARTINS – Terceira Turma – julgado em 26/02/2024 – DJe 29/02/2024) (grifo nosso)</w:t>
-      </w:r>
-    </w:p>
-    <w:p>
-      <w:pPr>
-        <w:spacing w:after="60" w:line="360"/>
-        <w:ind w:firstLine="850"/>
-        <w:jc w:val="both"/>
-      </w:pPr>
-      <w:r>
-        <w:rPr>
-          <w:rFonts w:ascii="Lora SemiBold" w:hAnsi="Lora SemiBold" w:cs="Lora SemiBold" w:eastAsia="Lora SemiBold"/>
-        </w:rPr>
-        <w:t xml:space="preserve">A reclamação feita pelo canal oficial de atendimento da fabricante, por meio eletrônico, é plenamente válida para esse fim:</w:t>
+          <w:rFonts w:ascii="Lora Medium" w:hAnsi="Lora Medium" w:cs="Lora Medium" w:eastAsia="Lora Medium"/>
+          <w:sz w:val="18"/>
+          <w:szCs w:val="18"/>
+        </w:rPr>
+        <w:t xml:space="preserve">“O dano moral resta caracterizado diante do </w:t>
+      </w:r>
+      <w:r>
+        <w:rPr>
+          <w:rFonts w:ascii="Lora" w:hAnsi="Lora" w:cs="Lora" w:eastAsia="Lora"/>
+          <w:b/>
+          <w:bCs/>
+          <w:sz w:val="18"/>
+          <w:szCs w:val="18"/>
+        </w:rPr>
+        <w:t xml:space="preserve">vício oculto, da frustração do uso do bem essencial e do desvio produtivo do consumidor</w:t>
+      </w:r>
+      <w:r>
+        <w:rPr>
+          <w:rFonts w:ascii="Lora Medium" w:hAnsi="Lora Medium" w:cs="Lora Medium" w:eastAsia="Lora Medium"/>
+          <w:sz w:val="18"/>
+          <w:szCs w:val="18"/>
+        </w:rPr>
+        <w:t xml:space="preserve">, sendo cabível a majoração da indenização.” (TJPI – APELAÇÃO CÍVEL 0835806-53.2023.8.18.0140 – Relator: Des. MÁRIO BASÍLIO DE MELO – 1ª Câmara Especializada Cível – julgado em 29/05/2026) (grifo nosso)</w:t>
       </w:r>
     </w:p>
     <w:p>
@@ -2389,42 +3048,95 @@
       </w:pPr>
       <w:r>
         <w:rPr>
-          <w:rFonts w:ascii="Lora SemiBold" w:hAnsi="Lora SemiBold" w:cs="Lora SemiBold" w:eastAsia="Lora SemiBold"/>
-          <w:sz w:val="18"/>
-          <w:szCs w:val="18"/>
-        </w:rPr>
-        <w:t xml:space="preserve">“3. A lei não preestabelece uma forma para a realização da reclamação, exigindo apenas comprovação de que o fornecedor tomou ciência inequívoca quanto ao propósito do consumidor de reclamar pelos vícios do produto ou serviço. 4. </w:t>
-      </w:r>
-      <w:r>
-        <w:rPr>
-          <w:rFonts w:ascii="Lora" w:hAnsi="Lora" w:cs="Lora" w:eastAsia="Lora"/>
-          <w:b/>
-          <w:bCs/>
-          <w:sz w:val="18"/>
-          <w:szCs w:val="18"/>
-        </w:rPr>
-        <w:t xml:space="preserve">A reclamação obstativa da decadência, prevista no art. 26, § 2º, I, do CDC, pode ser feita documentalmente – por meio físico ou eletrônico – ou mesmo verbalmente – pessoalmente ou por telefone</w:t>
-      </w:r>
-      <w:r>
-        <w:rPr>
-          <w:rFonts w:ascii="Lora SemiBold" w:hAnsi="Lora SemiBold" w:cs="Lora SemiBold" w:eastAsia="Lora SemiBold"/>
-          <w:sz w:val="18"/>
-          <w:szCs w:val="18"/>
-        </w:rPr>
-        <w:t xml:space="preserve"> – e, consequentemente, a sua comprovação pode dar-se por todos os meios admitidos em direito.” (STJ – REsp 1.442.597/DF – Rel. Ministra NANCY ANDRIGHI – Terceira Turma – julgado em 24/10/2017 – DJe 30/10/2017) (grifo nosso)</w:t>
-      </w:r>
-    </w:p>
-    <w:p>
-      <w:pPr>
-        <w:spacing w:after="60" w:line="360"/>
-        <w:ind w:firstLine="850"/>
-        <w:jc w:val="both"/>
-      </w:pPr>
-      <w:r>
-        <w:rPr>
-          <w:rFonts w:ascii="Lora SemiBold" w:hAnsi="Lora SemiBold" w:cs="Lora SemiBold" w:eastAsia="Lora SemiBold"/>
-        </w:rPr>
-        <w:t xml:space="preserve">Ainda que assim não fosse, a eventual decadência do direito de exigir as alternativas do art. 18, § 1º, do CDC não alcançaria as pretensões indenizatórias, sujeitas a prazo prescricional, conforme orientação do STJ registrada no mesmo AgInt no AREsp 2.174.028/SP (AgInt no REsp 1.788.020/PB, Rel. Ministro Luis Felipe Salomão, Quarta Turma, DJe de 16/10/2020).</w:t>
+          <w:rFonts w:ascii="Lora Medium" w:hAnsi="Lora Medium" w:cs="Lora Medium" w:eastAsia="Lora Medium"/>
+          <w:sz w:val="18"/>
+          <w:szCs w:val="18"/>
+        </w:rPr>
+        <w:t xml:space="preserve">“2. </w:t>
+      </w:r>
+      <w:r>
+        <w:rPr>
+          <w:rFonts w:ascii="Lora" w:hAnsi="Lora" w:cs="Lora" w:eastAsia="Lora"/>
+          <w:b/>
+          <w:bCs/>
+          <w:sz w:val="18"/>
+          <w:szCs w:val="18"/>
+        </w:rPr>
+        <w:t xml:space="preserve">O dano moral configura-se em razão da teoria do desvio produtivo do consumidor</w:t>
+      </w:r>
+      <w:r>
+        <w:rPr>
+          <w:rFonts w:ascii="Lora Medium" w:hAnsi="Lora Medium" w:cs="Lora Medium" w:eastAsia="Lora Medium"/>
+          <w:sz w:val="18"/>
+          <w:szCs w:val="18"/>
+        </w:rPr>
+        <w:t xml:space="preserve">, que tentou, mediante contato solucionar o problema, porém não houve a solução pela ré dentro do prazo legal.” (TJPI – RECURSO INOMINADO CÍVEL 0802863-19.2020.8.18.0162 – Relator: SEBASTIÃO FIRMINO LIMA FILHO – 2ª Turma Recursal – julgado em 29/07/2024) (grifo nosso)</w:t>
+      </w:r>
+    </w:p>
+    <w:p>
+      <w:pPr>
+        <w:spacing w:after="60" w:line="360"/>
+        <w:ind w:firstLine="850"/>
+        <w:jc w:val="both"/>
+      </w:pPr>
+      <w:r>
+        <w:rPr>
+          <w:rFonts w:ascii="Lora Medium" w:hAnsi="Lora Medium" w:cs="Lora Medium" w:eastAsia="Lora Medium"/>
+        </w:rPr>
+        <w:t xml:space="preserve">Também há precedente da 3ª Turma Recursal reconhecendo dano moral em situação de produto entregue com defeito e demora injustificada na solução do problema (TJPI – RECURSO INOMINADO CÍVEL 0801888-83.2022.8.18.0143 – Relator: REGINALDO PEREIRA LIMA DE ALENCAR – 3ª Turma Recursal – Data de publicação 02/08/2024).</w:t>
+      </w:r>
+    </w:p>
+    <w:p>
+      <w:pPr>
+        <w:spacing w:after="60" w:line="360"/>
+        <w:ind w:firstLine="850"/>
+        <w:jc w:val="both"/>
+      </w:pPr>
+      <w:r>
+        <w:rPr>
+          <w:rFonts w:ascii="Lora Medium" w:hAnsi="Lora Medium" w:cs="Lora Medium" w:eastAsia="Lora Medium"/>
+        </w:rPr>
+        <w:t xml:space="preserve">No presente caso, a reiteração das substituições, a persistência do vício e a necessidade de utilização do PROCON demonstram que o tempo e os esforços da Autora foram indevidamente consumidos na tentativa de obter uma solução que deveria ter sido fornecida espontaneamente pelas Rés.</w:t>
+      </w:r>
+    </w:p>
+    <w:p>
+      <w:pPr>
+        <w:spacing w:after="60" w:line="360"/>
+        <w:ind w:firstLine="850"/>
+        <w:jc w:val="both"/>
+      </w:pPr>
+      <w:r>
+        <w:rPr>
+          <w:rFonts w:ascii="Lora Medium" w:hAnsi="Lora Medium" w:cs="Lora Medium" w:eastAsia="Lora Medium"/>
+        </w:rPr>
+        <w:t xml:space="preserve">Quanto ao valor, a gravidade do caso concreto – vício não sanado no prazo legal, troca por aparelho recuperado, reclamação no PROCON, audiência em outra cidade e novo defeito no produto recebido em acordo – justifica indenização acima dos patamares usuais. O TJPI já considerou irrisória a indenização de R$ 3.000,00 em caso de desvio produtivo, majorando-a (AC 0835806-53.2023.8.18.0140, acima citada), e há relator que adota R$ 5.000,00 como parâmetro para vício de produto não solucionado pela assistência técnica (AC 0800277-66.2020.8.18.0046, citada no tópico “d”).</w:t>
+      </w:r>
+    </w:p>
+    <w:p>
+      <w:pPr>
+        <w:spacing w:after="60" w:line="360"/>
+        <w:ind w:firstLine="850"/>
+        <w:jc w:val="both"/>
+      </w:pPr>
+      <w:r>
+        <w:rPr>
+          <w:rFonts w:ascii="Lora Medium" w:hAnsi="Lora Medium" w:cs="Lora Medium" w:eastAsia="Lora Medium"/>
+        </w:rPr>
+        <w:t xml:space="preserve">Dessa forma, requer a condenação solidária das Rés ao pagamento de indenização por danos morais em valor a ser arbitrado pelo Juízo, sugerindo-se, considerando a extensão concreta dos transtornos, o montante de </w:t>
+      </w:r>
+      <w:r>
+        <w:rPr>
+          <w:rFonts w:ascii="Lora" w:hAnsi="Lora" w:cs="Lora" w:eastAsia="Lora"/>
+          <w:b/>
+          <w:bCs/>
+        </w:rPr>
+        <w:t xml:space="preserve">R$ 10.000,00</w:t>
+      </w:r>
+      <w:r>
+        <w:rPr>
+          <w:rFonts w:ascii="Lora Medium" w:hAnsi="Lora Medium" w:cs="Lora Medium" w:eastAsia="Lora Medium"/>
+        </w:rPr>
+        <w:t xml:space="preserve">.</w:t>
       </w:r>
     </w:p>
     <w:p>
@@ -2444,358 +3156,48 @@
           <w:i/>
           <w:iCs/>
         </w:rPr>
-        <w:t xml:space="preserve">f.</w:t>
+        <w:t xml:space="preserve">i.</w:t>
         <w:tab/>
-        <w:t xml:space="preserve">Da restituição integral do valor pago:</w:t>
-      </w:r>
-    </w:p>
-    <w:p>
-      <w:pPr>
-        <w:spacing w:after="60" w:line="360"/>
-        <w:ind w:firstLine="850"/>
-        <w:jc w:val="both"/>
-      </w:pPr>
-      <w:r>
-        <w:rPr>
-          <w:rFonts w:ascii="Lora SemiBold" w:hAnsi="Lora SemiBold" w:cs="Lora SemiBold" w:eastAsia="Lora SemiBold"/>
-        </w:rPr>
-        <w:t xml:space="preserve">Diante da persistência do vício e da sucessão de tentativas frustradas de solução, a Autora opta pela </w:t>
-      </w:r>
-      <w:r>
-        <w:rPr>
-          <w:rFonts w:ascii="Lora" w:hAnsi="Lora" w:cs="Lora" w:eastAsia="Lora"/>
-          <w:b/>
-          <w:bCs/>
-        </w:rPr>
-        <w:t xml:space="preserve">restituição integral do valor pago</w:t>
-      </w:r>
-      <w:r>
-        <w:rPr>
-          <w:rFonts w:ascii="Lora SemiBold" w:hAnsi="Lora SemiBold" w:cs="Lora SemiBold" w:eastAsia="Lora SemiBold"/>
-        </w:rPr>
-        <w:t xml:space="preserve">, nos termos do art. 18, §1º, II, do CDC.</w:t>
-      </w:r>
-    </w:p>
-    <w:p>
-      <w:pPr>
-        <w:spacing w:after="60" w:line="360"/>
-        <w:ind w:firstLine="850"/>
-        <w:jc w:val="both"/>
-      </w:pPr>
-      <w:r>
-        <w:rPr>
-          <w:rFonts w:ascii="Lora SemiBold" w:hAnsi="Lora SemiBold" w:cs="Lora SemiBold" w:eastAsia="Lora SemiBold"/>
-        </w:rPr>
-        <w:t xml:space="preserve">O valor pago pela consumidora foi de </w:t>
-      </w:r>
-      <w:r>
-        <w:rPr>
-          <w:rFonts w:ascii="Lora" w:hAnsi="Lora" w:cs="Lora" w:eastAsia="Lora"/>
-          <w:b/>
-          <w:bCs/>
-        </w:rPr>
-        <w:t xml:space="preserve">R$ 3.438,90</w:t>
-      </w:r>
-      <w:r>
-        <w:rPr>
-          <w:rFonts w:ascii="Lora SemiBold" w:hAnsi="Lora SemiBold" w:cs="Lora SemiBold" w:eastAsia="Lora SemiBold"/>
-        </w:rPr>
-        <w:t xml:space="preserve">, conforme NF-e nº 000.496.852 (chave de acesso 2525 0662 0583 1800 1233 5500 1000 4968 5219 8186 8756).</w:t>
-      </w:r>
-    </w:p>
-    <w:p>
-      <w:pPr>
-        <w:spacing w:after="60" w:line="360"/>
-        <w:ind w:firstLine="850"/>
-        <w:jc w:val="both"/>
-      </w:pPr>
-      <w:r>
-        <w:rPr>
-          <w:rFonts w:ascii="Lora SemiBold" w:hAnsi="Lora SemiBold" w:cs="Lora SemiBold" w:eastAsia="Lora SemiBold"/>
-        </w:rPr>
-        <w:t xml:space="preserve">A restituição deve compreender o valor efetivamente desembolsado pela consumidora, devidamente atualizado, sem que lhe seja imposta qualquer redução decorrente do tempo de utilização do produto.</w:t>
-      </w:r>
-    </w:p>
-    <w:p>
-      <w:pPr>
-        <w:spacing w:after="60" w:line="360"/>
-        <w:ind w:firstLine="850"/>
-        <w:jc w:val="both"/>
-      </w:pPr>
-      <w:r>
-        <w:rPr>
-          <w:rFonts w:ascii="Lora SemiBold" w:hAnsi="Lora SemiBold" w:cs="Lora SemiBold" w:eastAsia="Lora SemiBold"/>
-        </w:rPr>
-        <w:t xml:space="preserve">O Superior Tribunal de Justiça já decidiu, em ambas as Turmas de Direito Privado, que a restituição prevista no art. 18, §1º, II, do CDC corresponde ao valor pago, corrigido desde o desembolso, sem abatimento pelo uso, e que o uso do bem não afasta os juros de mora:</w:t>
-      </w:r>
-    </w:p>
-    <w:p>
-      <w:pPr>
-        <w:pBdr>
-          <w:top w:val="single" w:color="9AA0A6" w:sz="4" w:space="6"/>
-          <w:bottom w:val="single" w:color="9AA0A6" w:sz="4" w:space="6"/>
-        </w:pBdr>
-        <w:spacing w:before="160" w:after="200" w:line="240"/>
-        <w:ind w:left="2270" w:right="570"/>
-        <w:jc w:val="both"/>
-      </w:pPr>
-      <w:r>
-        <w:rPr>
-          <w:rFonts w:ascii="Lora SemiBold" w:hAnsi="Lora SemiBold" w:cs="Lora SemiBold" w:eastAsia="Lora SemiBold"/>
-          <w:sz w:val="18"/>
-          <w:szCs w:val="18"/>
-        </w:rPr>
-        <w:t xml:space="preserve">“3- </w:t>
-      </w:r>
-      <w:r>
-        <w:rPr>
-          <w:rFonts w:ascii="Lora" w:hAnsi="Lora" w:cs="Lora" w:eastAsia="Lora"/>
-          <w:b/>
-          <w:bCs/>
-          <w:sz w:val="18"/>
-          <w:szCs w:val="18"/>
-        </w:rPr>
-        <w:t xml:space="preserve">O valor a ser restituído deve corresponder à quantia paga, devidamente corrigido monetariamente desde o desembolso</w:t>
-      </w:r>
-      <w:r>
-        <w:rPr>
-          <w:rFonts w:ascii="Lora SemiBold" w:hAnsi="Lora SemiBold" w:cs="Lora SemiBold" w:eastAsia="Lora SemiBold"/>
-          <w:sz w:val="18"/>
-          <w:szCs w:val="18"/>
-        </w:rPr>
-        <w:t xml:space="preserve">, conforme determina o inciso II, do § 1º, do art. 18, do CDC, </w:t>
-      </w:r>
-      <w:r>
-        <w:rPr>
-          <w:rFonts w:ascii="Lora" w:hAnsi="Lora" w:cs="Lora" w:eastAsia="Lora"/>
-          <w:b/>
-          <w:bCs/>
-          <w:sz w:val="18"/>
-          <w:szCs w:val="18"/>
-        </w:rPr>
-        <w:t xml:space="preserve">não sendo devido qualquer abatimento decorrente da utilização do produto pelo consumidor</w:t>
-      </w:r>
-      <w:r>
-        <w:rPr>
-          <w:rFonts w:ascii="Lora SemiBold" w:hAnsi="Lora SemiBold" w:cs="Lora SemiBold" w:eastAsia="Lora SemiBold"/>
-          <w:sz w:val="18"/>
-          <w:szCs w:val="18"/>
-        </w:rPr>
-        <w:t xml:space="preserve">. Precedente. 4- Na hipótese de restituição da quantia paga em razão da responsabilidade por vício do produto (art. 18, § 1º, II, do CDC), a utilização do bem pelo consumidor não afasta a incidência de juros de mora.” (STJ – REsp 2.025.169/RS – Rel. Ministra NANCY ANDRIGHI – Terceira Turma – julgado em 07/03/2023 – DJe 10/03/2023) (grifo nosso)</w:t>
-      </w:r>
-    </w:p>
-    <w:p>
-      <w:pPr>
-        <w:pBdr>
-          <w:top w:val="single" w:color="9AA0A6" w:sz="4" w:space="6"/>
-          <w:bottom w:val="single" w:color="9AA0A6" w:sz="4" w:space="6"/>
-        </w:pBdr>
-        <w:spacing w:before="160" w:after="200" w:line="240"/>
-        <w:ind w:left="2270" w:right="570"/>
-        <w:jc w:val="both"/>
-      </w:pPr>
-      <w:r>
-        <w:rPr>
-          <w:rFonts w:ascii="Lora SemiBold" w:hAnsi="Lora SemiBold" w:cs="Lora SemiBold" w:eastAsia="Lora SemiBold"/>
-          <w:sz w:val="18"/>
-          <w:szCs w:val="18"/>
-        </w:rPr>
-        <w:t xml:space="preserve">“5. O valor a ser restituído ao consumidor deve corresponder à quantia paga, corrigida monetariamente desde o desembolso, conforme prevê o inciso II do § 1º do art. 18 do CDC, não sendo devido abatimento decorrente da utilização do produto. Súmula 83/STJ.” (STJ – AgInt no AREsp 2.419.630/SP – Rel. Ministra MARIA ISABEL GALLOTTI – Quarta Turma – julgado em 12/08/2024 – DJe 14/08/2024)</w:t>
-      </w:r>
-    </w:p>
-    <w:p>
-      <w:pPr>
-        <w:spacing w:after="60" w:line="360"/>
-        <w:ind w:firstLine="850"/>
-        <w:jc w:val="both"/>
-      </w:pPr>
-      <w:r>
-        <w:rPr>
-          <w:rFonts w:ascii="Lora SemiBold" w:hAnsi="Lora SemiBold" w:cs="Lora SemiBold" w:eastAsia="Lora SemiBold"/>
-        </w:rPr>
-        <w:t xml:space="preserve">Assim, diante da opção da consumidora pela resolução da relação de consumo, deve ser determinada a restituição do valor pago, com o recolhimento do produto atualmente existente na residência da Autora, às expensas das Rés, em data previamente agendada com a consumidora, tal como determinado pelo TJPI em caso análogo, no qual a devolução se deu por logística reversa organizada e custeada pela fabricante (TJPI – APELAÇÃO CÍVEL 0818494-30.2024.8.18.0140, citada no tópico “a”).</w:t>
-      </w:r>
-    </w:p>
-    <w:p>
-      <w:pPr>
-        <w:keepNext/>
-        <w:tabs>
-          <w:tab w:val="left" w:pos="700"/>
-        </w:tabs>
-        <w:spacing w:before="240" w:after="160" w:line="360"/>
-        <w:ind w:left="700" w:hanging="400"/>
-      </w:pPr>
-      <w:r>
-        <w:rPr>
-          <w:rFonts w:ascii="Lora" w:hAnsi="Lora" w:cs="Lora" w:eastAsia="Lora"/>
-          <w:b/>
-          <w:bCs/>
-          <w:i/>
-          <w:iCs/>
-        </w:rPr>
-        <w:t xml:space="preserve">g.</w:t>
-        <w:tab/>
-        <w:t xml:space="preserve">Dos danos materiais:</w:t>
-      </w:r>
-    </w:p>
-    <w:p>
-      <w:pPr>
-        <w:spacing w:after="60" w:line="360"/>
-        <w:ind w:firstLine="850"/>
-        <w:jc w:val="both"/>
-      </w:pPr>
-      <w:r>
-        <w:rPr>
-          <w:rFonts w:ascii="Lora SemiBold" w:hAnsi="Lora SemiBold" w:cs="Lora SemiBold" w:eastAsia="Lora SemiBold"/>
-        </w:rPr>
-        <w:t xml:space="preserve">Além da restituição do preço, a Autora suportou despesas diretamente decorrentes da sucessão de defeitos, que devem ser ressarcidas sem prejuízo da restituição (art. 18, §1º, II, do CDC – “sem prejuízo de eventuais perdas e danos”):</w:t>
-      </w:r>
-    </w:p>
-    <w:p>
-      <w:pPr>
-        <w:spacing w:after="60" w:line="360"/>
-        <w:ind w:firstLine="850"/>
-        <w:jc w:val="both"/>
-      </w:pPr>
-      <w:r>
-        <w:rPr>
-          <w:rFonts w:ascii="Lora" w:hAnsi="Lora" w:cs="Lora" w:eastAsia="Lora"/>
-          <w:b/>
-          <w:bCs/>
-          <w:shd w:val="clear" w:color="auto" w:fill="FFF200"/>
-        </w:rPr>
-        <w:t xml:space="preserve">[listar cada gasto com valor e comprovante – ex.: deslocamento de Miguel Alves a Teresina para a audiência no PROCON em 03/03/2026; alimentos perdidos. Sem comprovantes, excluir este tópico e o pedido “H”, e ajustar o valor da causa]</w:t>
-      </w:r>
-    </w:p>
-    <w:p>
-      <w:pPr>
-        <w:spacing w:after="60" w:line="360"/>
-        <w:ind w:firstLine="850"/>
-        <w:jc w:val="both"/>
-      </w:pPr>
-      <w:r>
-        <w:rPr>
-          <w:rFonts w:ascii="Lora SemiBold" w:hAnsi="Lora SemiBold" w:cs="Lora SemiBold" w:eastAsia="Lora SemiBold"/>
-        </w:rPr>
-        <w:t xml:space="preserve">Os valores comprovados somam R$ </w:t>
-      </w:r>
-      <w:r>
-        <w:rPr>
-          <w:rFonts w:ascii="Lora" w:hAnsi="Lora" w:cs="Lora" w:eastAsia="Lora"/>
-          <w:b/>
-          <w:bCs/>
-          <w:shd w:val="clear" w:color="auto" w:fill="FFF200"/>
-        </w:rPr>
-        <w:t xml:space="preserve">[total]</w:t>
-      </w:r>
-      <w:r>
-        <w:rPr>
-          <w:rFonts w:ascii="Lora SemiBold" w:hAnsi="Lora SemiBold" w:cs="Lora SemiBold" w:eastAsia="Lora SemiBold"/>
-        </w:rPr>
-        <w:t xml:space="preserve"> </w:t>
-      </w:r>
-      <w:r>
-        <w:rPr>
-          <w:rFonts w:ascii="Lora" w:hAnsi="Lora" w:cs="Lora" w:eastAsia="Lora"/>
-          <w:b/>
-          <w:bCs/>
-          <w:shd w:val="clear" w:color="auto" w:fill="FFF200"/>
-        </w:rPr>
-        <w:t xml:space="preserve">[Doc. 14 – comprovantes das despesas]</w:t>
-      </w:r>
-      <w:r>
-        <w:rPr>
-          <w:rFonts w:ascii="Lora SemiBold" w:hAnsi="Lora SemiBold" w:cs="Lora SemiBold" w:eastAsia="Lora SemiBold"/>
-        </w:rPr>
-        <w:t xml:space="preserve">. O TJPI reconhece a indenização de despesas dessa natureza em caso de refrigerador não reparado, inclusive o aluguel de outro aparelho durante o período (TJPI – APELAÇÃO CÍVEL 0000693-24.2017.8.18.0062, citada no tópico “c”, item 8 da ementa).</w:t>
-      </w:r>
-    </w:p>
-    <w:p>
-      <w:pPr>
-        <w:keepNext/>
-        <w:tabs>
-          <w:tab w:val="left" w:pos="700"/>
-        </w:tabs>
-        <w:spacing w:before="240" w:after="160" w:line="360"/>
-        <w:ind w:left="700" w:hanging="400"/>
-      </w:pPr>
-      <w:r>
-        <w:rPr>
-          <w:rFonts w:ascii="Lora" w:hAnsi="Lora" w:cs="Lora" w:eastAsia="Lora"/>
-          <w:b/>
-          <w:bCs/>
-          <w:i/>
-          <w:iCs/>
-        </w:rPr>
-        <w:t xml:space="preserve">h.</w:t>
-        <w:tab/>
-        <w:t xml:space="preserve">Do dano moral e do desvio produtivo do consumidor:</w:t>
-      </w:r>
-    </w:p>
-    <w:p>
-      <w:pPr>
-        <w:spacing w:after="60" w:line="360"/>
-        <w:ind w:firstLine="850"/>
-        <w:jc w:val="both"/>
-      </w:pPr>
-      <w:r>
-        <w:rPr>
-          <w:rFonts w:ascii="Lora SemiBold" w:hAnsi="Lora SemiBold" w:cs="Lora SemiBold" w:eastAsia="Lora SemiBold"/>
-        </w:rPr>
-        <w:t xml:space="preserve">É importante destacar que a pretensão indenizatória não se fundamenta simplesmente no fato de o produto ter apresentado defeito.</w:t>
-      </w:r>
-    </w:p>
-    <w:p>
-      <w:pPr>
-        <w:spacing w:after="60" w:line="360"/>
-        <w:ind w:firstLine="850"/>
-        <w:jc w:val="both"/>
-      </w:pPr>
-      <w:r>
-        <w:rPr>
-          <w:rFonts w:ascii="Lora SemiBold" w:hAnsi="Lora SemiBold" w:cs="Lora SemiBold" w:eastAsia="Lora SemiBold"/>
-        </w:rPr>
-        <w:t xml:space="preserve">A Autora não pretende transformar todo e qualquer problema relacionado a um eletrodoméstico em dano moral automático.</w:t>
-      </w:r>
-    </w:p>
-    <w:p>
-      <w:pPr>
-        <w:spacing w:after="60" w:line="360"/>
-        <w:ind w:firstLine="850"/>
-        <w:jc w:val="both"/>
-      </w:pPr>
-      <w:r>
-        <w:rPr>
-          <w:rFonts w:ascii="Lora SemiBold" w:hAnsi="Lora SemiBold" w:cs="Lora SemiBold" w:eastAsia="Lora SemiBold"/>
-        </w:rPr>
-        <w:t xml:space="preserve">O que caracteriza a particularidade do presente caso é a </w:t>
-      </w:r>
-      <w:r>
-        <w:rPr>
-          <w:rFonts w:ascii="Lora" w:hAnsi="Lora" w:cs="Lora" w:eastAsia="Lora"/>
-          <w:b/>
-          <w:bCs/>
-        </w:rPr>
-        <w:t xml:space="preserve">reiteração do problema e o prolongamento da tentativa de solução</w:t>
-      </w:r>
-      <w:r>
-        <w:rPr>
-          <w:rFonts w:ascii="Lora SemiBold" w:hAnsi="Lora SemiBold" w:cs="Lora SemiBold" w:eastAsia="Lora SemiBold"/>
-        </w:rPr>
-        <w:t xml:space="preserve">, apesar das sucessivas providências adotadas pela consumidora.</w:t>
-      </w:r>
-    </w:p>
-    <w:p>
-      <w:pPr>
-        <w:spacing w:after="60" w:line="360"/>
-        <w:ind w:firstLine="850"/>
-        <w:jc w:val="both"/>
-      </w:pPr>
-      <w:r>
-        <w:rPr>
-          <w:rFonts w:ascii="Lora SemiBold" w:hAnsi="Lora SemiBold" w:cs="Lora SemiBold" w:eastAsia="Lora SemiBold"/>
-        </w:rPr>
-        <w:t xml:space="preserve">A Autora:</w:t>
+        <w:t xml:space="preserve">Da inversão do ônus da prova:</w:t>
+      </w:r>
+    </w:p>
+    <w:p>
+      <w:pPr>
+        <w:spacing w:after="60" w:line="360"/>
+        <w:ind w:firstLine="850"/>
+        <w:jc w:val="both"/>
+      </w:pPr>
+      <w:r>
+        <w:rPr>
+          <w:rFonts w:ascii="Lora Medium" w:hAnsi="Lora Medium" w:cs="Lora Medium" w:eastAsia="Lora Medium"/>
+        </w:rPr>
+        <w:t xml:space="preserve">O art. 6º, VIII, do CDC assegura ao consumidor a facilitação da defesa de seus direitos, inclusive mediante inversão do ônus da prova, quando presentes a verossimilhança das alegações ou a hipossuficiência do consumidor.</w:t>
+      </w:r>
+    </w:p>
+    <w:p>
+      <w:pPr>
+        <w:spacing w:after="60" w:line="360"/>
+        <w:ind w:firstLine="850"/>
+        <w:jc w:val="both"/>
+      </w:pPr>
+      <w:r>
+        <w:rPr>
+          <w:rFonts w:ascii="Lora Medium" w:hAnsi="Lora Medium" w:cs="Lora Medium" w:eastAsia="Lora Medium"/>
+        </w:rPr>
+        <w:t xml:space="preserve">No presente caso, ambos os requisitos estão presentes.</w:t>
+      </w:r>
+    </w:p>
+    <w:p>
+      <w:pPr>
+        <w:spacing w:after="60" w:line="360"/>
+        <w:ind w:firstLine="850"/>
+        <w:jc w:val="both"/>
+      </w:pPr>
+      <w:r>
+        <w:rPr>
+          <w:rFonts w:ascii="Lora Medium" w:hAnsi="Lora Medium" w:cs="Lora Medium" w:eastAsia="Lora Medium"/>
+        </w:rPr>
+        <w:t xml:space="preserve">A verossimilhança decorre da própria documentação já existente, especialmente:</w:t>
       </w:r>
     </w:p>
     <w:p>
@@ -2809,16 +3211,16 @@
       </w:pPr>
       <w:r>
         <w:rPr>
-          <w:rFonts w:ascii="Lora SemiBold" w:hAnsi="Lora SemiBold" w:cs="Lora SemiBold" w:eastAsia="Lora SemiBold"/>
+          <w:rFonts w:ascii="Lora Medium" w:hAnsi="Lora Medium" w:cs="Lora Medium" w:eastAsia="Lora Medium"/>
         </w:rPr>
         <w:t xml:space="preserve">1.</w:t>
         <w:tab/>
       </w:r>
       <w:r>
         <w:rPr>
-          <w:rFonts w:ascii="Lora SemiBold" w:hAnsi="Lora SemiBold" w:cs="Lora SemiBold" w:eastAsia="Lora SemiBold"/>
-        </w:rPr>
-        <w:t xml:space="preserve">adquiriu um produto novo, que deixou de refrigerar com pouco tempo de uso;</w:t>
+          <w:rFonts w:ascii="Lora Medium" w:hAnsi="Lora Medium" w:cs="Lora Medium" w:eastAsia="Lora Medium"/>
+        </w:rPr>
+        <w:t xml:space="preserve">nota fiscal da aquisição;</w:t>
       </w:r>
     </w:p>
     <w:p>
@@ -2832,16 +3234,16 @@
       </w:pPr>
       <w:r>
         <w:rPr>
-          <w:rFonts w:ascii="Lora SemiBold" w:hAnsi="Lora SemiBold" w:cs="Lora SemiBold" w:eastAsia="Lora SemiBold"/>
+          <w:rFonts w:ascii="Lora Medium" w:hAnsi="Lora Medium" w:cs="Lora Medium" w:eastAsia="Lora Medium"/>
         </w:rPr>
         <w:t xml:space="preserve">2.</w:t>
         <w:tab/>
       </w:r>
       <w:r>
         <w:rPr>
-          <w:rFonts w:ascii="Lora SemiBold" w:hAnsi="Lora SemiBold" w:cs="Lora SemiBold" w:eastAsia="Lora SemiBold"/>
-        </w:rPr>
-        <w:t xml:space="preserve">aguardou a assistência técnica, que não sanou o defeito em 30 dias;</w:t>
+          <w:rFonts w:ascii="Lora Medium" w:hAnsi="Lora Medium" w:cs="Lora Medium" w:eastAsia="Lora Medium"/>
+        </w:rPr>
+        <w:t xml:space="preserve">nota fiscal de troca em garantia emitida pela fabricante;</w:t>
       </w:r>
     </w:p>
     <w:p>
@@ -2855,16 +3257,16 @@
       </w:pPr>
       <w:r>
         <w:rPr>
-          <w:rFonts w:ascii="Lora SemiBold" w:hAnsi="Lora SemiBold" w:cs="Lora SemiBold" w:eastAsia="Lora SemiBold"/>
+          <w:rFonts w:ascii="Lora Medium" w:hAnsi="Lora Medium" w:cs="Lora Medium" w:eastAsia="Lora Medium"/>
         </w:rPr>
         <w:t xml:space="preserve">3.</w:t>
         <w:tab/>
       </w:r>
       <w:r>
         <w:rPr>
-          <w:rFonts w:ascii="Lora SemiBold" w:hAnsi="Lora SemiBold" w:cs="Lora SemiBold" w:eastAsia="Lora SemiBold"/>
-        </w:rPr>
-        <w:t xml:space="preserve">registrou reclamação no PROCON;</w:t>
+          <w:rFonts w:ascii="Lora Medium" w:hAnsi="Lora Medium" w:cs="Lora Medium" w:eastAsia="Lora Medium"/>
+        </w:rPr>
+        <w:t xml:space="preserve">reclamação, resposta da fabricante e Termo de Compromisso do PROCON, além da sentença homologatória;</w:t>
       </w:r>
     </w:p>
     <w:p>
@@ -2878,16 +3280,16 @@
       </w:pPr>
       <w:r>
         <w:rPr>
-          <w:rFonts w:ascii="Lora SemiBold" w:hAnsi="Lora SemiBold" w:cs="Lora SemiBold" w:eastAsia="Lora SemiBold"/>
+          <w:rFonts w:ascii="Lora Medium" w:hAnsi="Lora Medium" w:cs="Lora Medium" w:eastAsia="Lora Medium"/>
         </w:rPr>
         <w:t xml:space="preserve">4.</w:t>
         <w:tab/>
       </w:r>
       <w:r>
         <w:rPr>
-          <w:rFonts w:ascii="Lora SemiBold" w:hAnsi="Lora SemiBold" w:cs="Lora SemiBold" w:eastAsia="Lora SemiBold"/>
-        </w:rPr>
-        <w:t xml:space="preserve">recebeu, na primeira troca, um aparelho recuperado, com remendos e amassados;</w:t>
+          <w:rFonts w:ascii="Lora Medium" w:hAnsi="Lora Medium" w:cs="Lora Medium" w:eastAsia="Lora Medium"/>
+        </w:rPr>
+        <w:t xml:space="preserve">fotografias do aparelho recuperado e do defeito atual;</w:t>
       </w:r>
     </w:p>
     <w:p>
@@ -2901,16 +3303,55 @@
       </w:pPr>
       <w:r>
         <w:rPr>
-          <w:rFonts w:ascii="Lora SemiBold" w:hAnsi="Lora SemiBold" w:cs="Lora SemiBold" w:eastAsia="Lora SemiBold"/>
+          <w:rFonts w:ascii="Lora Medium" w:hAnsi="Lora Medium" w:cs="Lora Medium" w:eastAsia="Lora Medium"/>
         </w:rPr>
         <w:t xml:space="preserve">5.</w:t>
         <w:tab/>
       </w:r>
       <w:r>
         <w:rPr>
-          <w:rFonts w:ascii="Lora SemiBold" w:hAnsi="Lora SemiBold" w:cs="Lora SemiBold" w:eastAsia="Lora SemiBold"/>
-        </w:rPr>
-        <w:t xml:space="preserve">participou de audiência no PROCON, em Teresina, e aceitou nova troca;</w:t>
+          <w:rFonts w:ascii="Lora Medium" w:hAnsi="Lora Medium" w:cs="Lora Medium" w:eastAsia="Lora Medium"/>
+        </w:rPr>
+        <w:t xml:space="preserve">registros do atendimento Consul e da assistência técnica autorizada.</w:t>
+      </w:r>
+    </w:p>
+    <w:p>
+      <w:pPr>
+        <w:spacing w:after="60" w:line="360"/>
+        <w:ind w:firstLine="850"/>
+        <w:jc w:val="both"/>
+      </w:pPr>
+      <w:r>
+        <w:rPr>
+          <w:rFonts w:ascii="Lora Medium" w:hAnsi="Lora Medium" w:cs="Lora Medium" w:eastAsia="Lora Medium"/>
+        </w:rPr>
+        <w:t xml:space="preserve">O TJPI reconhece que a nota fiscal e a reclamação no PROCON bastam para evidenciar a verossimilhança das alegações do consumidor em casos de vício de refrigerador (TJPI – RECURSO INOMINADO CÍVEL 0800464-66.2022.8.18.0123, citado no tópico “d”; e APELAÇÃO CÍVEL 0000693-24.2017.8.18.0062, item 1 da ementa, citada no tópico “c”).</w:t>
+      </w:r>
+    </w:p>
+    <w:p>
+      <w:pPr>
+        <w:spacing w:after="60" w:line="360"/>
+        <w:ind w:firstLine="850"/>
+        <w:jc w:val="both"/>
+      </w:pPr>
+      <w:r>
+        <w:rPr>
+          <w:rFonts w:ascii="Lora Medium" w:hAnsi="Lora Medium" w:cs="Lora Medium" w:eastAsia="Lora Medium"/>
+        </w:rPr>
+        <w:t xml:space="preserve">A hipossuficiência também é evidente, sobretudo porque os registros internos relativos às trocas, atendimentos, diagnósticos técnicos, números de série, histórico de reclamações e procedimentos realizados permanecem sob domínio das fornecedoras.</w:t>
+      </w:r>
+    </w:p>
+    <w:p>
+      <w:pPr>
+        <w:spacing w:after="60" w:line="360"/>
+        <w:ind w:firstLine="850"/>
+        <w:jc w:val="both"/>
+      </w:pPr>
+      <w:r>
+        <w:rPr>
+          <w:rFonts w:ascii="Lora Medium" w:hAnsi="Lora Medium" w:cs="Lora Medium" w:eastAsia="Lora Medium"/>
+        </w:rPr>
+        <w:t xml:space="preserve">As Rés possuem condições muito superiores de demonstrar:</w:t>
       </w:r>
     </w:p>
     <w:p>
@@ -2924,16 +3365,11 @@
       </w:pPr>
       <w:r>
         <w:rPr>
-          <w:rFonts w:ascii="Lora SemiBold" w:hAnsi="Lora SemiBold" w:cs="Lora SemiBold" w:eastAsia="Lora SemiBold"/>
-        </w:rPr>
-        <w:t xml:space="preserve">6.</w:t>
+          <w:rFonts w:ascii="Lora Medium" w:hAnsi="Lora Medium" w:cs="Lora Medium" w:eastAsia="Lora Medium"/>
+        </w:rPr>
+        <w:t xml:space="preserve">a)</w:t>
         <w:tab/>
-      </w:r>
-      <w:r>
-        <w:rPr>
-          <w:rFonts w:ascii="Lora SemiBold" w:hAnsi="Lora SemiBold" w:cs="Lora SemiBold" w:eastAsia="Lora SemiBold"/>
-        </w:rPr>
-        <w:t xml:space="preserve">recebeu o modelo CRM50MK, que também apresentou defeito;</w:t>
+        <w:t xml:space="preserve">os defeitos apresentados pelos equipamentos;</w:t>
       </w:r>
     </w:p>
     <w:p>
@@ -2947,297 +3383,11 @@
       </w:pPr>
       <w:r>
         <w:rPr>
-          <w:rFonts w:ascii="Lora SemiBold" w:hAnsi="Lora SemiBold" w:cs="Lora SemiBold" w:eastAsia="Lora SemiBold"/>
-        </w:rPr>
-        <w:t xml:space="preserve">7.</w:t>
+          <w:rFonts w:ascii="Lora Medium" w:hAnsi="Lora Medium" w:cs="Lora Medium" w:eastAsia="Lora Medium"/>
+        </w:rPr>
+        <w:t xml:space="preserve">b)</w:t>
         <w:tab/>
-      </w:r>
-      <w:r>
-        <w:rPr>
-          <w:rFonts w:ascii="Lora SemiBold" w:hAnsi="Lora SemiBold" w:cs="Lora SemiBold" w:eastAsia="Lora SemiBold"/>
-        </w:rPr>
-        <w:t xml:space="preserve">e, mesmo após todas essas providências, permanece sem refrigerador em funcionamento.</w:t>
-      </w:r>
-    </w:p>
-    <w:p>
-      <w:pPr>
-        <w:spacing w:after="60" w:line="360"/>
-        <w:ind w:firstLine="850"/>
-        <w:jc w:val="both"/>
-      </w:pPr>
-      <w:r>
-        <w:rPr>
-          <w:rFonts w:ascii="Lora SemiBold" w:hAnsi="Lora SemiBold" w:cs="Lora SemiBold" w:eastAsia="Lora SemiBold"/>
-        </w:rPr>
-        <w:t xml:space="preserve">Não se trata, portanto, de um simples aborrecimento cotidiano.</w:t>
-      </w:r>
-    </w:p>
-    <w:p>
-      <w:pPr>
-        <w:spacing w:after="60" w:line="360"/>
-        <w:ind w:firstLine="850"/>
-        <w:jc w:val="both"/>
-      </w:pPr>
-      <w:r>
-        <w:rPr>
-          <w:rFonts w:ascii="Lora SemiBold" w:hAnsi="Lora SemiBold" w:cs="Lora SemiBold" w:eastAsia="Lora SemiBold"/>
-        </w:rPr>
-        <w:t xml:space="preserve">A consumidora foi obrigada a </w:t>
-      </w:r>
-      <w:r>
-        <w:rPr>
-          <w:rFonts w:ascii="Lora" w:hAnsi="Lora" w:cs="Lora" w:eastAsia="Lora"/>
-          <w:b/>
-          <w:bCs/>
-        </w:rPr>
-        <w:t xml:space="preserve">desviar tempo de sua vida pessoal para solucionar problema criado pelos próprios fornecedores</w:t>
-      </w:r>
-      <w:r>
-        <w:rPr>
-          <w:rFonts w:ascii="Lora SemiBold" w:hAnsi="Lora SemiBold" w:cs="Lora SemiBold" w:eastAsia="Lora SemiBold"/>
-        </w:rPr>
-        <w:t xml:space="preserve">, realizando contatos, reclamações, acompanhamentos e deslocamentos que não deveriam existir se o produto tivesse sido adequadamente fornecido ou se o vício tivesse sido definitivamente solucionado.</w:t>
-      </w:r>
-    </w:p>
-    <w:p>
-      <w:pPr>
-        <w:spacing w:after="60" w:line="360"/>
-        <w:ind w:firstLine="850"/>
-        <w:jc w:val="both"/>
-      </w:pPr>
-      <w:r>
-        <w:rPr>
-          <w:rFonts w:ascii="Lora SemiBold" w:hAnsi="Lora SemiBold" w:cs="Lora SemiBold" w:eastAsia="Lora SemiBold"/>
-        </w:rPr>
-        <w:t xml:space="preserve">Essa situação caracteriza o chamado </w:t>
-      </w:r>
-      <w:r>
-        <w:rPr>
-          <w:rFonts w:ascii="Lora" w:hAnsi="Lora" w:cs="Lora" w:eastAsia="Lora"/>
-          <w:b/>
-          <w:bCs/>
-        </w:rPr>
-        <w:t xml:space="preserve">desvio produtivo do consumidor</w:t>
-      </w:r>
-      <w:r>
-        <w:rPr>
-          <w:rFonts w:ascii="Lora SemiBold" w:hAnsi="Lora SemiBold" w:cs="Lora SemiBold" w:eastAsia="Lora SemiBold"/>
-        </w:rPr>
-        <w:t xml:space="preserve">.</w:t>
-      </w:r>
-    </w:p>
-    <w:p>
-      <w:pPr>
-        <w:spacing w:after="60" w:line="360"/>
-        <w:ind w:firstLine="850"/>
-        <w:jc w:val="both"/>
-      </w:pPr>
-      <w:r>
-        <w:rPr>
-          <w:rFonts w:ascii="Lora SemiBold" w:hAnsi="Lora SemiBold" w:cs="Lora SemiBold" w:eastAsia="Lora SemiBold"/>
-        </w:rPr>
-        <w:t xml:space="preserve">O Tribunal de Justiça do Piauí reconhece expressamente essa construção em casos de vício de produto não solucionado:</w:t>
-      </w:r>
-    </w:p>
-    <w:p>
-      <w:pPr>
-        <w:pBdr>
-          <w:top w:val="single" w:color="9AA0A6" w:sz="4" w:space="6"/>
-          <w:bottom w:val="single" w:color="9AA0A6" w:sz="4" w:space="6"/>
-        </w:pBdr>
-        <w:spacing w:before="160" w:after="200" w:line="240"/>
-        <w:ind w:left="2270" w:right="570"/>
-        <w:jc w:val="both"/>
-      </w:pPr>
-      <w:r>
-        <w:rPr>
-          <w:rFonts w:ascii="Lora SemiBold" w:hAnsi="Lora SemiBold" w:cs="Lora SemiBold" w:eastAsia="Lora SemiBold"/>
-          <w:sz w:val="18"/>
-          <w:szCs w:val="18"/>
-        </w:rPr>
-        <w:t xml:space="preserve">“O dano moral resta caracterizado diante do </w:t>
-      </w:r>
-      <w:r>
-        <w:rPr>
-          <w:rFonts w:ascii="Lora" w:hAnsi="Lora" w:cs="Lora" w:eastAsia="Lora"/>
-          <w:b/>
-          <w:bCs/>
-          <w:sz w:val="18"/>
-          <w:szCs w:val="18"/>
-        </w:rPr>
-        <w:t xml:space="preserve">vício oculto, da frustração do uso do bem essencial e do desvio produtivo do consumidor</w:t>
-      </w:r>
-      <w:r>
-        <w:rPr>
-          <w:rFonts w:ascii="Lora SemiBold" w:hAnsi="Lora SemiBold" w:cs="Lora SemiBold" w:eastAsia="Lora SemiBold"/>
-          <w:sz w:val="18"/>
-          <w:szCs w:val="18"/>
-        </w:rPr>
-        <w:t xml:space="preserve">, sendo cabível a majoração da indenização.” (TJPI – APELAÇÃO CÍVEL 0835806-53.2023.8.18.0140 – Relator: Des. MÁRIO BASÍLIO DE MELO – 1ª Câmara Especializada Cível – julgado em 29/05/2026) (grifo nosso)</w:t>
-      </w:r>
-    </w:p>
-    <w:p>
-      <w:pPr>
-        <w:pBdr>
-          <w:top w:val="single" w:color="9AA0A6" w:sz="4" w:space="6"/>
-          <w:bottom w:val="single" w:color="9AA0A6" w:sz="4" w:space="6"/>
-        </w:pBdr>
-        <w:spacing w:before="160" w:after="200" w:line="240"/>
-        <w:ind w:left="2270" w:right="570"/>
-        <w:jc w:val="both"/>
-      </w:pPr>
-      <w:r>
-        <w:rPr>
-          <w:rFonts w:ascii="Lora SemiBold" w:hAnsi="Lora SemiBold" w:cs="Lora SemiBold" w:eastAsia="Lora SemiBold"/>
-          <w:sz w:val="18"/>
-          <w:szCs w:val="18"/>
-        </w:rPr>
-        <w:t xml:space="preserve">“2. </w:t>
-      </w:r>
-      <w:r>
-        <w:rPr>
-          <w:rFonts w:ascii="Lora" w:hAnsi="Lora" w:cs="Lora" w:eastAsia="Lora"/>
-          <w:b/>
-          <w:bCs/>
-          <w:sz w:val="18"/>
-          <w:szCs w:val="18"/>
-        </w:rPr>
-        <w:t xml:space="preserve">O dano moral configura-se em razão da teoria do desvio produtivo do consumidor</w:t>
-      </w:r>
-      <w:r>
-        <w:rPr>
-          <w:rFonts w:ascii="Lora SemiBold" w:hAnsi="Lora SemiBold" w:cs="Lora SemiBold" w:eastAsia="Lora SemiBold"/>
-          <w:sz w:val="18"/>
-          <w:szCs w:val="18"/>
-        </w:rPr>
-        <w:t xml:space="preserve">, que tentou, mediante contato solucionar o problema, porém não houve a solução pela ré dentro do prazo legal.” (TJPI – RECURSO INOMINADO CÍVEL 0802863-19.2020.8.18.0162 – Relator: SEBASTIÃO FIRMINO LIMA FILHO – 2ª Turma Recursal – julgado em 29/07/2024) (grifo nosso)</w:t>
-      </w:r>
-    </w:p>
-    <w:p>
-      <w:pPr>
-        <w:spacing w:after="60" w:line="360"/>
-        <w:ind w:firstLine="850"/>
-        <w:jc w:val="both"/>
-      </w:pPr>
-      <w:r>
-        <w:rPr>
-          <w:rFonts w:ascii="Lora SemiBold" w:hAnsi="Lora SemiBold" w:cs="Lora SemiBold" w:eastAsia="Lora SemiBold"/>
-        </w:rPr>
-        <w:t xml:space="preserve">Também há precedente da 3ª Turma Recursal reconhecendo dano moral em situação de produto entregue com defeito e demora injustificada na solução do problema (TJPI – RECURSO INOMINADO CÍVEL 0801888-83.2022.8.18.0143 – Relator: REGINALDO PEREIRA LIMA DE ALENCAR – 3ª Turma Recursal – Data de publicação 02/08/2024).</w:t>
-      </w:r>
-    </w:p>
-    <w:p>
-      <w:pPr>
-        <w:spacing w:after="60" w:line="360"/>
-        <w:ind w:firstLine="850"/>
-        <w:jc w:val="both"/>
-      </w:pPr>
-      <w:r>
-        <w:rPr>
-          <w:rFonts w:ascii="Lora SemiBold" w:hAnsi="Lora SemiBold" w:cs="Lora SemiBold" w:eastAsia="Lora SemiBold"/>
-        </w:rPr>
-        <w:t xml:space="preserve">No presente caso, a reiteração das substituições, a persistência do vício e a necessidade de utilização do PROCON demonstram que o tempo e os esforços da Autora foram indevidamente consumidos na tentativa de obter uma solução que deveria ter sido fornecida espontaneamente pelas Rés.</w:t>
-      </w:r>
-    </w:p>
-    <w:p>
-      <w:pPr>
-        <w:spacing w:after="60" w:line="360"/>
-        <w:ind w:firstLine="850"/>
-        <w:jc w:val="both"/>
-      </w:pPr>
-      <w:r>
-        <w:rPr>
-          <w:rFonts w:ascii="Lora SemiBold" w:hAnsi="Lora SemiBold" w:cs="Lora SemiBold" w:eastAsia="Lora SemiBold"/>
-        </w:rPr>
-        <w:t xml:space="preserve">Quanto ao valor, a gravidade do caso concreto – vício não sanado no prazo legal, troca por aparelho recuperado, reclamação no PROCON, audiência em outra cidade e novo defeito no produto recebido em acordo – justifica indenização acima dos patamares usuais. O TJPI já considerou irrisória a indenização de R$ 3.000,00 em caso de desvio produtivo, majorando-a (AC 0835806-53.2023.8.18.0140, acima citada), e há relator que adota R$ 5.000,00 como parâmetro para vício de produto não solucionado pela assistência técnica (AC 0800277-66.2020.8.18.0046, citada no tópico “d”).</w:t>
-      </w:r>
-    </w:p>
-    <w:p>
-      <w:pPr>
-        <w:spacing w:after="60" w:line="360"/>
-        <w:ind w:firstLine="850"/>
-        <w:jc w:val="both"/>
-      </w:pPr>
-      <w:r>
-        <w:rPr>
-          <w:rFonts w:ascii="Lora SemiBold" w:hAnsi="Lora SemiBold" w:cs="Lora SemiBold" w:eastAsia="Lora SemiBold"/>
-        </w:rPr>
-        <w:t xml:space="preserve">Dessa forma, requer a condenação solidária das Rés ao pagamento de indenização por danos morais em valor a ser arbitrado pelo Juízo, sugerindo-se, considerando a extensão concreta dos transtornos, o montante de </w:t>
-      </w:r>
-      <w:r>
-        <w:rPr>
-          <w:rFonts w:ascii="Lora" w:hAnsi="Lora" w:cs="Lora" w:eastAsia="Lora"/>
-          <w:b/>
-          <w:bCs/>
-        </w:rPr>
-        <w:t xml:space="preserve">R$ 10.000,00</w:t>
-      </w:r>
-      <w:r>
-        <w:rPr>
-          <w:rFonts w:ascii="Lora SemiBold" w:hAnsi="Lora SemiBold" w:cs="Lora SemiBold" w:eastAsia="Lora SemiBold"/>
-        </w:rPr>
-        <w:t xml:space="preserve">.</w:t>
-      </w:r>
-    </w:p>
-    <w:p>
-      <w:pPr>
-        <w:keepNext/>
-        <w:tabs>
-          <w:tab w:val="left" w:pos="700"/>
-        </w:tabs>
-        <w:spacing w:before="240" w:after="160" w:line="360"/>
-        <w:ind w:left="700" w:hanging="400"/>
-      </w:pPr>
-      <w:r>
-        <w:rPr>
-          <w:rFonts w:ascii="Lora" w:hAnsi="Lora" w:cs="Lora" w:eastAsia="Lora"/>
-          <w:b/>
-          <w:bCs/>
-          <w:i/>
-          <w:iCs/>
-        </w:rPr>
-        <w:t xml:space="preserve">i.</w:t>
-        <w:tab/>
-        <w:t xml:space="preserve">Da inversão do ônus da prova:</w:t>
-      </w:r>
-    </w:p>
-    <w:p>
-      <w:pPr>
-        <w:spacing w:after="60" w:line="360"/>
-        <w:ind w:firstLine="850"/>
-        <w:jc w:val="both"/>
-      </w:pPr>
-      <w:r>
-        <w:rPr>
-          <w:rFonts w:ascii="Lora SemiBold" w:hAnsi="Lora SemiBold" w:cs="Lora SemiBold" w:eastAsia="Lora SemiBold"/>
-        </w:rPr>
-        <w:t xml:space="preserve">O art. 6º, VIII, do CDC assegura ao consumidor a facilitação da defesa de seus direitos, inclusive mediante inversão do ônus da prova, quando presentes a verossimilhança das alegações ou a hipossuficiência do consumidor.</w:t>
-      </w:r>
-    </w:p>
-    <w:p>
-      <w:pPr>
-        <w:spacing w:after="60" w:line="360"/>
-        <w:ind w:firstLine="850"/>
-        <w:jc w:val="both"/>
-      </w:pPr>
-      <w:r>
-        <w:rPr>
-          <w:rFonts w:ascii="Lora SemiBold" w:hAnsi="Lora SemiBold" w:cs="Lora SemiBold" w:eastAsia="Lora SemiBold"/>
-        </w:rPr>
-        <w:t xml:space="preserve">No presente caso, ambos os requisitos estão presentes.</w:t>
-      </w:r>
-    </w:p>
-    <w:p>
-      <w:pPr>
-        <w:spacing w:after="60" w:line="360"/>
-        <w:ind w:firstLine="850"/>
-        <w:jc w:val="both"/>
-      </w:pPr>
-      <w:r>
-        <w:rPr>
-          <w:rFonts w:ascii="Lora SemiBold" w:hAnsi="Lora SemiBold" w:cs="Lora SemiBold" w:eastAsia="Lora SemiBold"/>
-        </w:rPr>
-        <w:t xml:space="preserve">A verossimilhança decorre da própria documentação já existente, especialmente:</w:t>
+        <w:t xml:space="preserve">as datas dos atendimentos;</w:t>
       </w:r>
     </w:p>
     <w:p>
@@ -3251,16 +3401,11 @@
       </w:pPr>
       <w:r>
         <w:rPr>
-          <w:rFonts w:ascii="Lora SemiBold" w:hAnsi="Lora SemiBold" w:cs="Lora SemiBold" w:eastAsia="Lora SemiBold"/>
-        </w:rPr>
-        <w:t xml:space="preserve">1.</w:t>
+          <w:rFonts w:ascii="Lora Medium" w:hAnsi="Lora Medium" w:cs="Lora Medium" w:eastAsia="Lora Medium"/>
+        </w:rPr>
+        <w:t xml:space="preserve">c)</w:t>
         <w:tab/>
-      </w:r>
-      <w:r>
-        <w:rPr>
-          <w:rFonts w:ascii="Lora SemiBold" w:hAnsi="Lora SemiBold" w:cs="Lora SemiBold" w:eastAsia="Lora SemiBold"/>
-        </w:rPr>
-        <w:t xml:space="preserve">nota fiscal da aquisição;</w:t>
+        <w:t xml:space="preserve">as ordens de serviço;</w:t>
       </w:r>
     </w:p>
     <w:p>
@@ -3274,16 +3419,11 @@
       </w:pPr>
       <w:r>
         <w:rPr>
-          <w:rFonts w:ascii="Lora SemiBold" w:hAnsi="Lora SemiBold" w:cs="Lora SemiBold" w:eastAsia="Lora SemiBold"/>
-        </w:rPr>
-        <w:t xml:space="preserve">2.</w:t>
+          <w:rFonts w:ascii="Lora Medium" w:hAnsi="Lora Medium" w:cs="Lora Medium" w:eastAsia="Lora Medium"/>
+        </w:rPr>
+        <w:t xml:space="preserve">d)</w:t>
         <w:tab/>
-      </w:r>
-      <w:r>
-        <w:rPr>
-          <w:rFonts w:ascii="Lora SemiBold" w:hAnsi="Lora SemiBold" w:cs="Lora SemiBold" w:eastAsia="Lora SemiBold"/>
-        </w:rPr>
-        <w:t xml:space="preserve">nota fiscal de troca em garantia emitida pela fabricante;</w:t>
+        <w:t xml:space="preserve">os produtos efetivamente fornecidos em substituição;</w:t>
       </w:r>
     </w:p>
     <w:p>
@@ -3297,16 +3437,11 @@
       </w:pPr>
       <w:r>
         <w:rPr>
-          <w:rFonts w:ascii="Lora SemiBold" w:hAnsi="Lora SemiBold" w:cs="Lora SemiBold" w:eastAsia="Lora SemiBold"/>
-        </w:rPr>
-        <w:t xml:space="preserve">3.</w:t>
+          <w:rFonts w:ascii="Lora Medium" w:hAnsi="Lora Medium" w:cs="Lora Medium" w:eastAsia="Lora Medium"/>
+        </w:rPr>
+        <w:t xml:space="preserve">e)</w:t>
         <w:tab/>
-      </w:r>
-      <w:r>
-        <w:rPr>
-          <w:rFonts w:ascii="Lora SemiBold" w:hAnsi="Lora SemiBold" w:cs="Lora SemiBold" w:eastAsia="Lora SemiBold"/>
-        </w:rPr>
-        <w:t xml:space="preserve">reclamação, resposta da fabricante e Termo de Compromisso do PROCON, além da sentença homologatória;</w:t>
+        <w:t xml:space="preserve">a origem e condição dos equipamentos entregues;</w:t>
       </w:r>
     </w:p>
     <w:p>
@@ -3320,16 +3455,11 @@
       </w:pPr>
       <w:r>
         <w:rPr>
-          <w:rFonts w:ascii="Lora SemiBold" w:hAnsi="Lora SemiBold" w:cs="Lora SemiBold" w:eastAsia="Lora SemiBold"/>
-        </w:rPr>
-        <w:t xml:space="preserve">4.</w:t>
+          <w:rFonts w:ascii="Lora Medium" w:hAnsi="Lora Medium" w:cs="Lora Medium" w:eastAsia="Lora Medium"/>
+        </w:rPr>
+        <w:t xml:space="preserve">f)</w:t>
         <w:tab/>
-      </w:r>
-      <w:r>
-        <w:rPr>
-          <w:rFonts w:ascii="Lora SemiBold" w:hAnsi="Lora SemiBold" w:cs="Lora SemiBold" w:eastAsia="Lora SemiBold"/>
-        </w:rPr>
-        <w:t xml:space="preserve">fotografias do aparelho recuperado e do defeito atual;</w:t>
+        <w:t xml:space="preserve">os números de série dos aparelhos;</w:t>
       </w:r>
     </w:p>
     <w:p>
@@ -3343,55 +3473,11 @@
       </w:pPr>
       <w:r>
         <w:rPr>
-          <w:rFonts w:ascii="Lora SemiBold" w:hAnsi="Lora SemiBold" w:cs="Lora SemiBold" w:eastAsia="Lora SemiBold"/>
-        </w:rPr>
-        <w:t xml:space="preserve">5.</w:t>
+          <w:rFonts w:ascii="Lora Medium" w:hAnsi="Lora Medium" w:cs="Lora Medium" w:eastAsia="Lora Medium"/>
+        </w:rPr>
+        <w:t xml:space="preserve">g)</w:t>
         <w:tab/>
-      </w:r>
-      <w:r>
-        <w:rPr>
-          <w:rFonts w:ascii="Lora SemiBold" w:hAnsi="Lora SemiBold" w:cs="Lora SemiBold" w:eastAsia="Lora SemiBold"/>
-        </w:rPr>
-        <w:t xml:space="preserve">registros do atendimento Consul e da assistência técnica autorizada.</w:t>
-      </w:r>
-    </w:p>
-    <w:p>
-      <w:pPr>
-        <w:spacing w:after="60" w:line="360"/>
-        <w:ind w:firstLine="850"/>
-        <w:jc w:val="both"/>
-      </w:pPr>
-      <w:r>
-        <w:rPr>
-          <w:rFonts w:ascii="Lora SemiBold" w:hAnsi="Lora SemiBold" w:cs="Lora SemiBold" w:eastAsia="Lora SemiBold"/>
-        </w:rPr>
-        <w:t xml:space="preserve">O TJPI reconhece que a nota fiscal e a reclamação no PROCON bastam para evidenciar a verossimilhança das alegações do consumidor em casos de vício de refrigerador (TJPI – RECURSO INOMINADO CÍVEL 0800464-66.2022.8.18.0123, citado no tópico “d”; e APELAÇÃO CÍVEL 0000693-24.2017.8.18.0062, item 1 da ementa, citada no tópico “c”).</w:t>
-      </w:r>
-    </w:p>
-    <w:p>
-      <w:pPr>
-        <w:spacing w:after="60" w:line="360"/>
-        <w:ind w:firstLine="850"/>
-        <w:jc w:val="both"/>
-      </w:pPr>
-      <w:r>
-        <w:rPr>
-          <w:rFonts w:ascii="Lora SemiBold" w:hAnsi="Lora SemiBold" w:cs="Lora SemiBold" w:eastAsia="Lora SemiBold"/>
-        </w:rPr>
-        <w:t xml:space="preserve">A hipossuficiência também é evidente, sobretudo porque os registros internos relativos às trocas, atendimentos, diagnósticos técnicos, números de série, histórico de reclamações e procedimentos realizados permanecem sob domínio das fornecedoras.</w:t>
-      </w:r>
-    </w:p>
-    <w:p>
-      <w:pPr>
-        <w:spacing w:after="60" w:line="360"/>
-        <w:ind w:firstLine="850"/>
-        <w:jc w:val="both"/>
-      </w:pPr>
-      <w:r>
-        <w:rPr>
-          <w:rFonts w:ascii="Lora SemiBold" w:hAnsi="Lora SemiBold" w:cs="Lora SemiBold" w:eastAsia="Lora SemiBold"/>
-        </w:rPr>
-        <w:t xml:space="preserve">As Rés possuem condições muito superiores de demonstrar:</w:t>
+        <w:t xml:space="preserve">os diagnósticos realizados;</w:t>
       </w:r>
     </w:p>
     <w:p>
@@ -3405,133 +3491,7 @@
       </w:pPr>
       <w:r>
         <w:rPr>
-          <w:rFonts w:ascii="Lora SemiBold" w:hAnsi="Lora SemiBold" w:cs="Lora SemiBold" w:eastAsia="Lora SemiBold"/>
-        </w:rPr>
-        <w:t xml:space="preserve">a)</w:t>
-        <w:tab/>
-        <w:t xml:space="preserve">os defeitos apresentados pelos equipamentos;</w:t>
-      </w:r>
-    </w:p>
-    <w:p>
-      <w:pPr>
-        <w:tabs>
-          <w:tab w:val="left" w:pos="1000"/>
-        </w:tabs>
-        <w:spacing w:after="60" w:line="360"/>
-        <w:ind w:left="1000" w:hanging="400"/>
-        <w:jc w:val="both"/>
-      </w:pPr>
-      <w:r>
-        <w:rPr>
-          <w:rFonts w:ascii="Lora SemiBold" w:hAnsi="Lora SemiBold" w:cs="Lora SemiBold" w:eastAsia="Lora SemiBold"/>
-        </w:rPr>
-        <w:t xml:space="preserve">b)</w:t>
-        <w:tab/>
-        <w:t xml:space="preserve">as datas dos atendimentos;</w:t>
-      </w:r>
-    </w:p>
-    <w:p>
-      <w:pPr>
-        <w:tabs>
-          <w:tab w:val="left" w:pos="1000"/>
-        </w:tabs>
-        <w:spacing w:after="60" w:line="360"/>
-        <w:ind w:left="1000" w:hanging="400"/>
-        <w:jc w:val="both"/>
-      </w:pPr>
-      <w:r>
-        <w:rPr>
-          <w:rFonts w:ascii="Lora SemiBold" w:hAnsi="Lora SemiBold" w:cs="Lora SemiBold" w:eastAsia="Lora SemiBold"/>
-        </w:rPr>
-        <w:t xml:space="preserve">c)</w:t>
-        <w:tab/>
-        <w:t xml:space="preserve">as ordens de serviço;</w:t>
-      </w:r>
-    </w:p>
-    <w:p>
-      <w:pPr>
-        <w:tabs>
-          <w:tab w:val="left" w:pos="1000"/>
-        </w:tabs>
-        <w:spacing w:after="60" w:line="360"/>
-        <w:ind w:left="1000" w:hanging="400"/>
-        <w:jc w:val="both"/>
-      </w:pPr>
-      <w:r>
-        <w:rPr>
-          <w:rFonts w:ascii="Lora SemiBold" w:hAnsi="Lora SemiBold" w:cs="Lora SemiBold" w:eastAsia="Lora SemiBold"/>
-        </w:rPr>
-        <w:t xml:space="preserve">d)</w:t>
-        <w:tab/>
-        <w:t xml:space="preserve">os produtos efetivamente fornecidos em substituição;</w:t>
-      </w:r>
-    </w:p>
-    <w:p>
-      <w:pPr>
-        <w:tabs>
-          <w:tab w:val="left" w:pos="1000"/>
-        </w:tabs>
-        <w:spacing w:after="60" w:line="360"/>
-        <w:ind w:left="1000" w:hanging="400"/>
-        <w:jc w:val="both"/>
-      </w:pPr>
-      <w:r>
-        <w:rPr>
-          <w:rFonts w:ascii="Lora SemiBold" w:hAnsi="Lora SemiBold" w:cs="Lora SemiBold" w:eastAsia="Lora SemiBold"/>
-        </w:rPr>
-        <w:t xml:space="preserve">e)</w:t>
-        <w:tab/>
-        <w:t xml:space="preserve">a origem e condição dos equipamentos entregues;</w:t>
-      </w:r>
-    </w:p>
-    <w:p>
-      <w:pPr>
-        <w:tabs>
-          <w:tab w:val="left" w:pos="1000"/>
-        </w:tabs>
-        <w:spacing w:after="60" w:line="360"/>
-        <w:ind w:left="1000" w:hanging="400"/>
-        <w:jc w:val="both"/>
-      </w:pPr>
-      <w:r>
-        <w:rPr>
-          <w:rFonts w:ascii="Lora SemiBold" w:hAnsi="Lora SemiBold" w:cs="Lora SemiBold" w:eastAsia="Lora SemiBold"/>
-        </w:rPr>
-        <w:t xml:space="preserve">f)</w:t>
-        <w:tab/>
-        <w:t xml:space="preserve">os números de série dos aparelhos;</w:t>
-      </w:r>
-    </w:p>
-    <w:p>
-      <w:pPr>
-        <w:tabs>
-          <w:tab w:val="left" w:pos="1000"/>
-        </w:tabs>
-        <w:spacing w:after="60" w:line="360"/>
-        <w:ind w:left="1000" w:hanging="400"/>
-        <w:jc w:val="both"/>
-      </w:pPr>
-      <w:r>
-        <w:rPr>
-          <w:rFonts w:ascii="Lora SemiBold" w:hAnsi="Lora SemiBold" w:cs="Lora SemiBold" w:eastAsia="Lora SemiBold"/>
-        </w:rPr>
-        <w:t xml:space="preserve">g)</w:t>
-        <w:tab/>
-        <w:t xml:space="preserve">os diagnósticos realizados;</w:t>
-      </w:r>
-    </w:p>
-    <w:p>
-      <w:pPr>
-        <w:tabs>
-          <w:tab w:val="left" w:pos="1000"/>
-        </w:tabs>
-        <w:spacing w:after="60" w:line="360"/>
-        <w:ind w:left="1000" w:hanging="400"/>
-        <w:jc w:val="both"/>
-      </w:pPr>
-      <w:r>
-        <w:rPr>
-          <w:rFonts w:ascii="Lora SemiBold" w:hAnsi="Lora SemiBold" w:cs="Lora SemiBold" w:eastAsia="Lora SemiBold"/>
+          <w:rFonts w:ascii="Lora Medium" w:hAnsi="Lora Medium" w:cs="Lora Medium" w:eastAsia="Lora Medium"/>
         </w:rPr>
         <w:t xml:space="preserve">h)</w:t>
         <w:tab/>
@@ -3546,7 +3506,7 @@
       </w:pPr>
       <w:r>
         <w:rPr>
-          <w:rFonts w:ascii="Lora SemiBold" w:hAnsi="Lora SemiBold" w:cs="Lora SemiBold" w:eastAsia="Lora SemiBold"/>
+          <w:rFonts w:ascii="Lora Medium" w:hAnsi="Lora Medium" w:cs="Lora Medium" w:eastAsia="Lora Medium"/>
         </w:rPr>
         <w:t xml:space="preserve">Requer-se, portanto, a </w:t>
       </w:r>
@@ -3560,7 +3520,7 @@
       </w:r>
       <w:r>
         <w:rPr>
-          <w:rFonts w:ascii="Lora SemiBold" w:hAnsi="Lora SemiBold" w:cs="Lora SemiBold" w:eastAsia="Lora SemiBold"/>
+          <w:rFonts w:ascii="Lora Medium" w:hAnsi="Lora Medium" w:cs="Lora Medium" w:eastAsia="Lora Medium"/>
         </w:rPr>
         <w:t xml:space="preserve">, nos termos do art. 6º, VIII, do CDC.</w:t>
       </w:r>
@@ -3595,7 +3555,7 @@
       </w:pPr>
       <w:r>
         <w:rPr>
-          <w:rFonts w:ascii="Lora SemiBold" w:hAnsi="Lora SemiBold" w:cs="Lora SemiBold" w:eastAsia="Lora SemiBold"/>
+          <w:rFonts w:ascii="Lora Medium" w:hAnsi="Lora Medium" w:cs="Lora Medium" w:eastAsia="Lora Medium"/>
         </w:rPr>
         <w:t xml:space="preserve">Diante do exposto, requer:</w:t>
       </w:r>
@@ -3611,14 +3571,14 @@
       </w:pPr>
       <w:r>
         <w:rPr>
-          <w:rFonts w:ascii="Lora SemiBold" w:hAnsi="Lora SemiBold" w:cs="Lora SemiBold" w:eastAsia="Lora SemiBold"/>
+          <w:rFonts w:ascii="Lora Medium" w:hAnsi="Lora Medium" w:cs="Lora Medium" w:eastAsia="Lora Medium"/>
         </w:rPr>
         <w:t xml:space="preserve">A.</w:t>
         <w:tab/>
       </w:r>
       <w:r>
         <w:rPr>
-          <w:rFonts w:ascii="Lora SemiBold" w:hAnsi="Lora SemiBold" w:cs="Lora SemiBold" w:eastAsia="Lora SemiBold"/>
+          <w:rFonts w:ascii="Lora Medium" w:hAnsi="Lora Medium" w:cs="Lora Medium" w:eastAsia="Lora Medium"/>
         </w:rPr>
         <w:t xml:space="preserve">a concessão dos benefícios da </w:t>
       </w:r>
@@ -3632,7 +3592,7 @@
       </w:r>
       <w:r>
         <w:rPr>
-          <w:rFonts w:ascii="Lora SemiBold" w:hAnsi="Lora SemiBold" w:cs="Lora SemiBold" w:eastAsia="Lora SemiBold"/>
+          <w:rFonts w:ascii="Lora Medium" w:hAnsi="Lora Medium" w:cs="Lora Medium" w:eastAsia="Lora Medium"/>
         </w:rPr>
         <w:t xml:space="preserve">, inclusive para fins de eventual recurso;</w:t>
       </w:r>
@@ -3648,14 +3608,14 @@
       </w:pPr>
       <w:r>
         <w:rPr>
-          <w:rFonts w:ascii="Lora SemiBold" w:hAnsi="Lora SemiBold" w:cs="Lora SemiBold" w:eastAsia="Lora SemiBold"/>
+          <w:rFonts w:ascii="Lora Medium" w:hAnsi="Lora Medium" w:cs="Lora Medium" w:eastAsia="Lora Medium"/>
         </w:rPr>
         <w:t xml:space="preserve">B.</w:t>
         <w:tab/>
       </w:r>
       <w:r>
         <w:rPr>
-          <w:rFonts w:ascii="Lora SemiBold" w:hAnsi="Lora SemiBold" w:cs="Lora SemiBold" w:eastAsia="Lora SemiBold"/>
+          <w:rFonts w:ascii="Lora Medium" w:hAnsi="Lora Medium" w:cs="Lora Medium" w:eastAsia="Lora Medium"/>
         </w:rPr>
         <w:t xml:space="preserve">a citação das Rés para comparecimento à audiência de conciliação e, querendo, apresentação de defesa;</w:t>
       </w:r>
@@ -3671,14 +3631,14 @@
       </w:pPr>
       <w:r>
         <w:rPr>
-          <w:rFonts w:ascii="Lora SemiBold" w:hAnsi="Lora SemiBold" w:cs="Lora SemiBold" w:eastAsia="Lora SemiBold"/>
+          <w:rFonts w:ascii="Lora Medium" w:hAnsi="Lora Medium" w:cs="Lora Medium" w:eastAsia="Lora Medium"/>
         </w:rPr>
         <w:t xml:space="preserve">C.</w:t>
         <w:tab/>
       </w:r>
       <w:r>
         <w:rPr>
-          <w:rFonts w:ascii="Lora SemiBold" w:hAnsi="Lora SemiBold" w:cs="Lora SemiBold" w:eastAsia="Lora SemiBold"/>
+          <w:rFonts w:ascii="Lora Medium" w:hAnsi="Lora Medium" w:cs="Lora Medium" w:eastAsia="Lora Medium"/>
         </w:rPr>
         <w:t xml:space="preserve">a inversão do ônus da prova, na forma do art. 6º, VIII, do CDC;</w:t>
       </w:r>
@@ -3694,14 +3654,14 @@
       </w:pPr>
       <w:r>
         <w:rPr>
-          <w:rFonts w:ascii="Lora SemiBold" w:hAnsi="Lora SemiBold" w:cs="Lora SemiBold" w:eastAsia="Lora SemiBold"/>
+          <w:rFonts w:ascii="Lora Medium" w:hAnsi="Lora Medium" w:cs="Lora Medium" w:eastAsia="Lora Medium"/>
         </w:rPr>
         <w:t xml:space="preserve">D.</w:t>
         <w:tab/>
       </w:r>
       <w:r>
         <w:rPr>
-          <w:rFonts w:ascii="Lora SemiBold" w:hAnsi="Lora SemiBold" w:cs="Lora SemiBold" w:eastAsia="Lora SemiBold"/>
+          <w:rFonts w:ascii="Lora Medium" w:hAnsi="Lora Medium" w:cs="Lora Medium" w:eastAsia="Lora Medium"/>
         </w:rPr>
         <w:t xml:space="preserve">a exibição, pelas Rés, de toda a documentação relativa às sucessivas trocas e atendimentos, incluindo ordens de serviço, protocolos, registros de assistência técnica, notas fiscais e identificação dos aparelhos (art. 396 do CPC);</w:t>
       </w:r>
@@ -3717,14 +3677,14 @@
       </w:pPr>
       <w:r>
         <w:rPr>
-          <w:rFonts w:ascii="Lora SemiBold" w:hAnsi="Lora SemiBold" w:cs="Lora SemiBold" w:eastAsia="Lora SemiBold"/>
+          <w:rFonts w:ascii="Lora Medium" w:hAnsi="Lora Medium" w:cs="Lora Medium" w:eastAsia="Lora Medium"/>
         </w:rPr>
         <w:t xml:space="preserve">E.</w:t>
         <w:tab/>
       </w:r>
       <w:r>
         <w:rPr>
-          <w:rFonts w:ascii="Lora SemiBold" w:hAnsi="Lora SemiBold" w:cs="Lora SemiBold" w:eastAsia="Lora SemiBold"/>
+          <w:rFonts w:ascii="Lora Medium" w:hAnsi="Lora Medium" w:cs="Lora Medium" w:eastAsia="Lora Medium"/>
         </w:rPr>
         <w:t xml:space="preserve">ao final, o reconhecimento da relação de consumo e da responsabilidade solidária das Rés (art. 18 do CDC), com a declaração da </w:t>
       </w:r>
@@ -3738,7 +3698,7 @@
       </w:r>
       <w:r>
         <w:rPr>
-          <w:rFonts w:ascii="Lora SemiBold" w:hAnsi="Lora SemiBold" w:cs="Lora SemiBold" w:eastAsia="Lora SemiBold"/>
+          <w:rFonts w:ascii="Lora Medium" w:hAnsi="Lora Medium" w:cs="Lora Medium" w:eastAsia="Lora Medium"/>
         </w:rPr>
         <w:t xml:space="preserve"> de compra e venda, com fundamento no art. 18, §1º, II, do CDC;</w:t>
       </w:r>
@@ -3754,14 +3714,14 @@
       </w:pPr>
       <w:r>
         <w:rPr>
-          <w:rFonts w:ascii="Lora SemiBold" w:hAnsi="Lora SemiBold" w:cs="Lora SemiBold" w:eastAsia="Lora SemiBold"/>
+          <w:rFonts w:ascii="Lora Medium" w:hAnsi="Lora Medium" w:cs="Lora Medium" w:eastAsia="Lora Medium"/>
         </w:rPr>
         <w:t xml:space="preserve">F.</w:t>
         <w:tab/>
       </w:r>
       <w:r>
         <w:rPr>
-          <w:rFonts w:ascii="Lora SemiBold" w:hAnsi="Lora SemiBold" w:cs="Lora SemiBold" w:eastAsia="Lora SemiBold"/>
+          <w:rFonts w:ascii="Lora Medium" w:hAnsi="Lora Medium" w:cs="Lora Medium" w:eastAsia="Lora Medium"/>
         </w:rPr>
         <w:t xml:space="preserve">a condenação solidária das Rés à </w:t>
       </w:r>
@@ -3775,7 +3735,7 @@
       </w:r>
       <w:r>
         <w:rPr>
-          <w:rFonts w:ascii="Lora SemiBold" w:hAnsi="Lora SemiBold" w:cs="Lora SemiBold" w:eastAsia="Lora SemiBold"/>
+          <w:rFonts w:ascii="Lora Medium" w:hAnsi="Lora Medium" w:cs="Lora Medium" w:eastAsia="Lora Medium"/>
         </w:rPr>
         <w:t xml:space="preserve">, sem abatimento pelo uso do produto, com correção monetária desde o desembolso (06/06/2025) e juros de mora desde a citação;</w:t>
       </w:r>
@@ -3791,14 +3751,14 @@
       </w:pPr>
       <w:r>
         <w:rPr>
-          <w:rFonts w:ascii="Lora SemiBold" w:hAnsi="Lora SemiBold" w:cs="Lora SemiBold" w:eastAsia="Lora SemiBold"/>
+          <w:rFonts w:ascii="Lora Medium" w:hAnsi="Lora Medium" w:cs="Lora Medium" w:eastAsia="Lora Medium"/>
         </w:rPr>
         <w:t xml:space="preserve">G.</w:t>
         <w:tab/>
       </w:r>
       <w:r>
         <w:rPr>
-          <w:rFonts w:ascii="Lora SemiBold" w:hAnsi="Lora SemiBold" w:cs="Lora SemiBold" w:eastAsia="Lora SemiBold"/>
+          <w:rFonts w:ascii="Lora Medium" w:hAnsi="Lora Medium" w:cs="Lora Medium" w:eastAsia="Lora Medium"/>
         </w:rPr>
         <w:t xml:space="preserve">a condenação das Rés a recolher, às suas expensas, o refrigerador CRM50MK que se encontra na residência da Autora, em data previamente agendada com a consumidora;</w:t>
       </w:r>
@@ -3814,14 +3774,14 @@
       </w:pPr>
       <w:r>
         <w:rPr>
-          <w:rFonts w:ascii="Lora SemiBold" w:hAnsi="Lora SemiBold" w:cs="Lora SemiBold" w:eastAsia="Lora SemiBold"/>
+          <w:rFonts w:ascii="Lora Medium" w:hAnsi="Lora Medium" w:cs="Lora Medium" w:eastAsia="Lora Medium"/>
         </w:rPr>
         <w:t xml:space="preserve">H.</w:t>
         <w:tab/>
       </w:r>
       <w:r>
         <w:rPr>
-          <w:rFonts w:ascii="Lora SemiBold" w:hAnsi="Lora SemiBold" w:cs="Lora SemiBold" w:eastAsia="Lora SemiBold"/>
+          <w:rFonts w:ascii="Lora Medium" w:hAnsi="Lora Medium" w:cs="Lora Medium" w:eastAsia="Lora Medium"/>
         </w:rPr>
         <w:t xml:space="preserve">a condenação solidária das Rés ao ressarcimento dos </w:t>
       </w:r>
@@ -3835,7 +3795,7 @@
       </w:r>
       <w:r>
         <w:rPr>
-          <w:rFonts w:ascii="Lora SemiBold" w:hAnsi="Lora SemiBold" w:cs="Lora SemiBold" w:eastAsia="Lora SemiBold"/>
+          <w:rFonts w:ascii="Lora Medium" w:hAnsi="Lora Medium" w:cs="Lora Medium" w:eastAsia="Lora Medium"/>
         </w:rPr>
         <w:t xml:space="preserve">, no valor de R$ </w:t>
       </w:r>
@@ -3850,7 +3810,7 @@
       </w:r>
       <w:r>
         <w:rPr>
-          <w:rFonts w:ascii="Lora SemiBold" w:hAnsi="Lora SemiBold" w:cs="Lora SemiBold" w:eastAsia="Lora SemiBold"/>
+          <w:rFonts w:ascii="Lora Medium" w:hAnsi="Lora Medium" w:cs="Lora Medium" w:eastAsia="Lora Medium"/>
         </w:rPr>
         <w:t xml:space="preserve">, com correção monetária desde cada desembolso e juros de mora desde a citação </w:t>
       </w:r>
@@ -3865,7 +3825,7 @@
       </w:r>
       <w:r>
         <w:rPr>
-          <w:rFonts w:ascii="Lora SemiBold" w:hAnsi="Lora SemiBold" w:cs="Lora SemiBold" w:eastAsia="Lora SemiBold"/>
+          <w:rFonts w:ascii="Lora Medium" w:hAnsi="Lora Medium" w:cs="Lora Medium" w:eastAsia="Lora Medium"/>
         </w:rPr>
         <w:t xml:space="preserve">;</w:t>
       </w:r>
@@ -3881,14 +3841,14 @@
       </w:pPr>
       <w:r>
         <w:rPr>
-          <w:rFonts w:ascii="Lora SemiBold" w:hAnsi="Lora SemiBold" w:cs="Lora SemiBold" w:eastAsia="Lora SemiBold"/>
+          <w:rFonts w:ascii="Lora Medium" w:hAnsi="Lora Medium" w:cs="Lora Medium" w:eastAsia="Lora Medium"/>
         </w:rPr>
         <w:t xml:space="preserve">I.</w:t>
         <w:tab/>
       </w:r>
       <w:r>
         <w:rPr>
-          <w:rFonts w:ascii="Lora SemiBold" w:hAnsi="Lora SemiBold" w:cs="Lora SemiBold" w:eastAsia="Lora SemiBold"/>
+          <w:rFonts w:ascii="Lora Medium" w:hAnsi="Lora Medium" w:cs="Lora Medium" w:eastAsia="Lora Medium"/>
         </w:rPr>
         <w:t xml:space="preserve">a condenação solidária das Rés ao pagamento de </w:t>
       </w:r>
@@ -3902,7 +3862,7 @@
       </w:r>
       <w:r>
         <w:rPr>
-          <w:rFonts w:ascii="Lora SemiBold" w:hAnsi="Lora SemiBold" w:cs="Lora SemiBold" w:eastAsia="Lora SemiBold"/>
+          <w:rFonts w:ascii="Lora Medium" w:hAnsi="Lora Medium" w:cs="Lora Medium" w:eastAsia="Lora Medium"/>
         </w:rPr>
         <w:t xml:space="preserve"> não inferior a R$ 10.000,00, ou em outro valor que Vossa Excelência entender adequado, com correção monetária desde o arbitramento (Súmula 362 do STJ) e juros de mora desde a citação;</w:t>
       </w:r>
@@ -3918,14 +3878,14 @@
       </w:pPr>
       <w:r>
         <w:rPr>
-          <w:rFonts w:ascii="Lora SemiBold" w:hAnsi="Lora SemiBold" w:cs="Lora SemiBold" w:eastAsia="Lora SemiBold"/>
+          <w:rFonts w:ascii="Lora Medium" w:hAnsi="Lora Medium" w:cs="Lora Medium" w:eastAsia="Lora Medium"/>
         </w:rPr>
         <w:t xml:space="preserve">J.</w:t>
         <w:tab/>
       </w:r>
       <w:r>
         <w:rPr>
-          <w:rFonts w:ascii="Lora SemiBold" w:hAnsi="Lora SemiBold" w:cs="Lora SemiBold" w:eastAsia="Lora SemiBold"/>
+          <w:rFonts w:ascii="Lora Medium" w:hAnsi="Lora Medium" w:cs="Lora Medium" w:eastAsia="Lora Medium"/>
         </w:rPr>
         <w:t xml:space="preserve">a produção de todos os meios de prova em direito admitidos, especialmente prova documental suplementar, depoimento pessoal e prova testemunhal;</w:t>
       </w:r>
@@ -3941,14 +3901,14 @@
       </w:pPr>
       <w:r>
         <w:rPr>
-          <w:rFonts w:ascii="Lora SemiBold" w:hAnsi="Lora SemiBold" w:cs="Lora SemiBold" w:eastAsia="Lora SemiBold"/>
+          <w:rFonts w:ascii="Lora Medium" w:hAnsi="Lora Medium" w:cs="Lora Medium" w:eastAsia="Lora Medium"/>
         </w:rPr>
         <w:t xml:space="preserve">K.</w:t>
         <w:tab/>
       </w:r>
       <w:r>
         <w:rPr>
-          <w:rFonts w:ascii="Lora SemiBold" w:hAnsi="Lora SemiBold" w:cs="Lora SemiBold" w:eastAsia="Lora SemiBold"/>
+          <w:rFonts w:ascii="Lora Medium" w:hAnsi="Lora Medium" w:cs="Lora Medium" w:eastAsia="Lora Medium"/>
         </w:rPr>
         <w:t xml:space="preserve">a condenação das Rés nas demais cominações legais cabíveis.</w:t>
       </w:r>
@@ -3961,7 +3921,7 @@
       </w:pPr>
       <w:r>
         <w:rPr>
-          <w:rFonts w:ascii="Lora SemiBold" w:hAnsi="Lora SemiBold" w:cs="Lora SemiBold" w:eastAsia="Lora SemiBold"/>
+          <w:rFonts w:ascii="Lora Medium" w:hAnsi="Lora Medium" w:cs="Lora Medium" w:eastAsia="Lora Medium"/>
         </w:rPr>
         <w:t xml:space="preserve">Dá-se à causa o valor de </w:t>
       </w:r>
@@ -3975,7 +3935,7 @@
       </w:r>
       <w:r>
         <w:rPr>
-          <w:rFonts w:ascii="Lora SemiBold" w:hAnsi="Lora SemiBold" w:cs="Lora SemiBold" w:eastAsia="Lora SemiBold"/>
+          <w:rFonts w:ascii="Lora Medium" w:hAnsi="Lora Medium" w:cs="Lora Medium" w:eastAsia="Lora Medium"/>
         </w:rPr>
         <w:t xml:space="preserve"> </w:t>
       </w:r>
@@ -3990,7 +3950,7 @@
       </w:r>
       <w:r>
         <w:rPr>
-          <w:rFonts w:ascii="Lora SemiBold" w:hAnsi="Lora SemiBold" w:cs="Lora SemiBold" w:eastAsia="Lora SemiBold"/>
+          <w:rFonts w:ascii="Lora Medium" w:hAnsi="Lora Medium" w:cs="Lora Medium" w:eastAsia="Lora Medium"/>
         </w:rPr>
         <w:t xml:space="preserve">.</w:t>
       </w:r>
@@ -4004,7 +3964,7 @@
       </w:pPr>
       <w:r>
         <w:rPr>
-          <w:rFonts w:ascii="Lora SemiBold" w:hAnsi="Lora SemiBold" w:cs="Lora SemiBold" w:eastAsia="Lora SemiBold"/>
+          <w:rFonts w:ascii="Lora Medium" w:hAnsi="Lora Medium" w:cs="Lora Medium" w:eastAsia="Lora Medium"/>
         </w:rPr>
         <w:t xml:space="preserve">Rol de documentos:</w:t>
       </w:r>
@@ -4255,7 +4215,7 @@
       </w:pPr>
       <w:r>
         <w:rPr>
-          <w:rFonts w:ascii="Lora SemiBold" w:hAnsi="Lora SemiBold" w:cs="Lora SemiBold" w:eastAsia="Lora SemiBold"/>
+          <w:rFonts w:ascii="Lora Medium" w:hAnsi="Lora Medium" w:cs="Lora Medium" w:eastAsia="Lora Medium"/>
         </w:rPr>
         <w:t xml:space="preserve">Nestes termos,</w:t>
       </w:r>
@@ -4267,7 +4227,7 @@
       </w:pPr>
       <w:r>
         <w:rPr>
-          <w:rFonts w:ascii="Lora SemiBold" w:hAnsi="Lora SemiBold" w:cs="Lora SemiBold" w:eastAsia="Lora SemiBold"/>
+          <w:rFonts w:ascii="Lora Medium" w:hAnsi="Lora Medium" w:cs="Lora Medium" w:eastAsia="Lora Medium"/>
         </w:rPr>
         <w:t xml:space="preserve">Pede deferimento.</w:t>
       </w:r>
@@ -4279,7 +4239,7 @@
       </w:pPr>
       <w:r>
         <w:rPr>
-          <w:rFonts w:ascii="Lora SemiBold" w:hAnsi="Lora SemiBold" w:cs="Lora SemiBold" w:eastAsia="Lora SemiBold"/>
+          <w:rFonts w:ascii="Lora Medium" w:hAnsi="Lora Medium" w:cs="Lora Medium" w:eastAsia="Lora Medium"/>
         </w:rPr>
         <w:t xml:space="preserve">Miguel Alves-PI, datado eletronicamente.</w:t>
       </w:r>
@@ -4307,7 +4267,7 @@
       </w:pPr>
       <w:r>
         <w:rPr>
-          <w:rFonts w:ascii="Lora SemiBold" w:hAnsi="Lora SemiBold" w:cs="Lora SemiBold" w:eastAsia="Lora SemiBold"/>
+          <w:rFonts w:ascii="Lora Medium" w:hAnsi="Lora Medium" w:cs="Lora Medium" w:eastAsia="Lora Medium"/>
         </w:rPr>
         <w:t xml:space="preserve">ADVOGADO - OAB/PI 21.320</w:t>
       </w:r>
@@ -4587,7 +4547,7 @@
   <w:docDefaults>
     <w:rPrDefault>
       <w:rPr>
-        <w:rFonts w:ascii="Lora SemiBold" w:cs="Lora SemiBold" w:eastAsia="Lora SemiBold" w:hAnsi="Lora SemiBold"/>
+        <w:rFonts w:ascii="Lora Medium" w:cs="Lora Medium" w:eastAsia="Lora Medium" w:hAnsi="Lora Medium"/>
         <w:sz w:val="24"/>
         <w:szCs w:val="24"/>
       </w:rPr>

</xml_diff>

<commit_message>
Petição Daniela Braga: ajusta fatos (defeito desde a entrega, entrega do CRM50MK e falta de resposta da assistência)
Co-Authored-By: Claude Opus 5.5 <noreply@anthropic.com>
Claude-Session: https://claude.ai/code/session_01HhnpasVshMdx9Pz9yR41Yv
</commit_message>
<xml_diff>
--- a/Petição inicial - Daniela Braga/Petição inicial revisada - Daniela Braga Pereira.docx
+++ b/Petição inicial - Daniela Braga/Petição inicial revisada - Daniela Braga Pereira.docx
@@ -537,21 +537,35 @@
         <w:rPr>
           <w:rFonts w:ascii="Lora Medium" w:hAnsi="Lora Medium" w:cs="Lora Medium" w:eastAsia="Lora Medium"/>
         </w:rPr>
-        <w:t xml:space="preserve">Com pouco tempo de uso, o refrigerador </w:t>
-      </w:r>
-      <w:r>
-        <w:rPr>
-          <w:rFonts w:ascii="Lora" w:hAnsi="Lora" w:cs="Lora" w:eastAsia="Lora"/>
-          <w:b/>
-          <w:bCs/>
-        </w:rPr>
-        <w:t xml:space="preserve">deixou de refrigerar</w:t>
-      </w:r>
-      <w:r>
-        <w:rPr>
-          <w:rFonts w:ascii="Lora Medium" w:hAnsi="Lora Medium" w:cs="Lora Medium" w:eastAsia="Lora Medium"/>
-        </w:rPr>
-        <w:t xml:space="preserve"> e, em 23 de outubro de 2025, foi encaminhado à assistência técnica indicada pela fabricante, a autorizada Jainara da Rocha Saraiva Ltda. A visita técnica foi realizada, mas o defeito persistiu, e o produto não foi consertado no prazo de 30 dias previsto no art. 18, §1º, do CDC.</w:t>
+        <w:t xml:space="preserve">O produto, contudo, </w:t>
+      </w:r>
+      <w:r>
+        <w:rPr>
+          <w:rFonts w:ascii="Lora" w:hAnsi="Lora" w:cs="Lora" w:eastAsia="Lora"/>
+          <w:b/>
+          <w:bCs/>
+        </w:rPr>
+        <w:t xml:space="preserve">já veio com defeito</w:t>
+      </w:r>
+      <w:r>
+        <w:rPr>
+          <w:rFonts w:ascii="Lora Medium" w:hAnsi="Lora Medium" w:cs="Lora Medium" w:eastAsia="Lora Medium"/>
+        </w:rPr>
+        <w:t xml:space="preserve">: desde os primeiros dias de uso, o refrigerador </w:t>
+      </w:r>
+      <w:r>
+        <w:rPr>
+          <w:rFonts w:ascii="Lora" w:hAnsi="Lora" w:cs="Lora" w:eastAsia="Lora"/>
+          <w:b/>
+          <w:bCs/>
+        </w:rPr>
+        <w:t xml:space="preserve">não refrigerava adequadamente</w:t>
+      </w:r>
+      <w:r>
+        <w:rPr>
+          <w:rFonts w:ascii="Lora Medium" w:hAnsi="Lora Medium" w:cs="Lora Medium" w:eastAsia="Lora Medium"/>
+        </w:rPr>
+        <w:t xml:space="preserve">. A Autora acionou a fabricante e, em 23 de outubro de 2025, o aparelho foi atendido pela assistência técnica por ela indicada, a autorizada Jainara da Rocha Saraiva Ltda. A visita técnica foi realizada, mas o defeito persistiu, e o produto não foi consertado no prazo de 30 dias previsto no art. 18, §1º, do CDC.</w:t>
       </w:r>
     </w:p>
     <w:p>
@@ -1027,7 +1041,7 @@
         <w:rPr>
           <w:rFonts w:ascii="Lora Medium" w:hAnsi="Lora Medium" w:cs="Lora Medium" w:eastAsia="Lora Medium"/>
         </w:rPr>
-        <w:t xml:space="preserve">O refrigerador CRM50MK foi entregue em </w:t>
+        <w:t xml:space="preserve">O refrigerador CRM50MK foi entregue em 15 de abril de 2026 </w:t>
       </w:r>
       <w:r>
         <w:rPr>
@@ -1036,7 +1050,7 @@
           <w:bCs/>
           <w:shd w:val="clear" w:color="auto" w:fill="FFF200"/>
         </w:rPr>
-        <w:t xml:space="preserve">[data – Doc. 11, NF de entrega]</w:t>
+        <w:t xml:space="preserve">[Doc. 11 – NF de entrega]</w:t>
       </w:r>
       <w:r>
         <w:rPr>
@@ -1072,7 +1086,7 @@
         <w:rPr>
           <w:rFonts w:ascii="Lora Medium" w:hAnsi="Lora Medium" w:cs="Lora Medium" w:eastAsia="Lora Medium"/>
         </w:rPr>
-        <w:t xml:space="preserve">. A Autora acionou o atendimento oficial da Consul, que encaminhou o caso à mesma assistência técnica autorizada, Jainara da Rocha Saraiva </w:t>
+        <w:t xml:space="preserve">. A Autora acionou o atendimento oficial da Consul, que encaminhou o caso à mesma assistência técnica autorizada, Jainara da Rocha Saraiva, informando que bastaria à consumidora entrar em contato para agendar a visita </w:t>
       </w:r>
       <w:r>
         <w:rPr>
@@ -1087,7 +1101,48 @@
         <w:rPr>
           <w:rFonts w:ascii="Lora Medium" w:hAnsi="Lora Medium" w:cs="Lora Medium" w:eastAsia="Lora Medium"/>
         </w:rPr>
-        <w:t xml:space="preserve">. </w:t>
+        <w:t xml:space="preserve">.</w:t>
+      </w:r>
+    </w:p>
+    <w:p>
+      <w:pPr>
+        <w:spacing w:after="60" w:line="360"/>
+        <w:ind w:firstLine="850"/>
+        <w:jc w:val="both"/>
+      </w:pPr>
+      <w:r>
+        <w:rPr>
+          <w:rFonts w:ascii="Lora Medium" w:hAnsi="Lora Medium" w:cs="Lora Medium" w:eastAsia="Lora Medium"/>
+        </w:rPr>
+        <w:t xml:space="preserve">A Autora tentou agendar a visita técnica, inclusive por mensagem, mas </w:t>
+      </w:r>
+      <w:r>
+        <w:rPr>
+          <w:rFonts w:ascii="Lora" w:hAnsi="Lora" w:cs="Lora" w:eastAsia="Lora"/>
+          <w:b/>
+          <w:bCs/>
+        </w:rPr>
+        <w:t xml:space="preserve">não obteve resposta da assistência autorizada</w:t>
+      </w:r>
+      <w:r>
+        <w:rPr>
+          <w:rFonts w:ascii="Lora Medium" w:hAnsi="Lora Medium" w:cs="Lora Medium" w:eastAsia="Lora Medium"/>
+        </w:rPr>
+        <w:t xml:space="preserve">. A visita jamais foi agendada e </w:t>
+      </w:r>
+      <w:r>
+        <w:rPr>
+          <w:rFonts w:ascii="Lora" w:hAnsi="Lora" w:cs="Lora" w:eastAsia="Lora"/>
+          <w:b/>
+          <w:bCs/>
+        </w:rPr>
+        <w:t xml:space="preserve">nenhuma ordem de serviço foi emitida</w:t>
+      </w:r>
+      <w:r>
+        <w:rPr>
+          <w:rFonts w:ascii="Lora Medium" w:hAnsi="Lora Medium" w:cs="Lora Medium" w:eastAsia="Lora Medium"/>
+        </w:rPr>
+        <w:t xml:space="preserve">, de modo que o reparo do novo aparelho sequer foi iniciado por inércia exclusiva da cadeia de fornecimento </w:t>
       </w:r>
       <w:r>
         <w:rPr>
@@ -1096,7 +1151,7 @@
           <w:bCs/>
           <w:shd w:val="clear" w:color="auto" w:fill="FFF200"/>
         </w:rPr>
-        <w:t xml:space="preserve">[Descrever o desfecho: se a visita foi agendada ou realizada, se houve ordem de serviço e qual o resultado – confirmar com a cliente]</w:t>
+        <w:t xml:space="preserve">[Doc. 12 – mensagens enviadas sem resposta; confirmar datas com a cliente]</w:t>
       </w:r>
       <w:r>
         <w:rPr>
@@ -2139,7 +2194,7 @@
         <w:rPr>
           <w:rFonts w:ascii="Lora Medium" w:hAnsi="Lora Medium" w:cs="Lora Medium" w:eastAsia="Lora Medium"/>
         </w:rPr>
-        <w:t xml:space="preserve">Por isso, ainda que se entenda que a fornecedora não dispôs do prazo de 30 dias para sanar o vício do último aparelho, a Autora pode fazer uso imediato da restituição da quantia paga, nos termos do art. 18, §3º, do CDC. Não se pode exigir da consumidora que continue submetendo o produto à assistência técnica indefinidamente, como já decidiu o TJPI:</w:t>
+        <w:t xml:space="preserve">Não se diga que a fornecedora não teve oportunidade de sanar o vício do último aparelho. A Autora acionou o atendimento oficial da fabricante e tentou agendar a visita técnica, mas a assistência autorizada não respondeu, não agendou o atendimento nem emitiu ordem de serviço. A ausência de reparo decorreu, portanto, exclusivamente da inércia da cadeia de fornecimento. De todo modo, ainda que assim não fosse, a Autora pode fazer uso imediato da restituição da quantia paga, nos termos do art. 18, §3º, do CDC. Não se pode exigir da consumidora que continue submetendo o produto à assistência técnica indefinidamente, como já decidiu o TJPI:</w:t>
       </w:r>
     </w:p>
     <w:p>
@@ -2778,7 +2833,7 @@
         <w:rPr>
           <w:rFonts w:ascii="Lora Medium" w:hAnsi="Lora Medium" w:cs="Lora Medium" w:eastAsia="Lora Medium"/>
         </w:rPr>
-        <w:t xml:space="preserve">adquiriu um produto novo, que deixou de refrigerar com pouco tempo de uso;</w:t>
+        <w:t xml:space="preserve">adquiriu um produto novo, que já veio com defeito e não refrigerava adequadamente;</w:t>
       </w:r>
     </w:p>
     <w:p>
@@ -2910,6 +2965,29 @@
           <w:rFonts w:ascii="Lora Medium" w:hAnsi="Lora Medium" w:cs="Lora Medium" w:eastAsia="Lora Medium"/>
         </w:rPr>
         <w:t xml:space="preserve">7.</w:t>
+        <w:tab/>
+      </w:r>
+      <w:r>
+        <w:rPr>
+          <w:rFonts w:ascii="Lora Medium" w:hAnsi="Lora Medium" w:cs="Lora Medium" w:eastAsia="Lora Medium"/>
+        </w:rPr>
+        <w:t xml:space="preserve">tentou agendar nova visita técnica, sem obter sequer resposta da assistência autorizada;</w:t>
+      </w:r>
+    </w:p>
+    <w:p>
+      <w:pPr>
+        <w:tabs>
+          <w:tab w:val="left" w:pos="1000"/>
+        </w:tabs>
+        <w:spacing w:after="60" w:line="360"/>
+        <w:ind w:left="1000" w:hanging="400"/>
+        <w:jc w:val="both"/>
+      </w:pPr>
+      <w:r>
+        <w:rPr>
+          <w:rFonts w:ascii="Lora Medium" w:hAnsi="Lora Medium" w:cs="Lora Medium" w:eastAsia="Lora Medium"/>
+        </w:rPr>
+        <w:t xml:space="preserve">8.</w:t>
         <w:tab/>
       </w:r>
       <w:r>
@@ -3109,7 +3187,7 @@
         <w:rPr>
           <w:rFonts w:ascii="Lora Medium" w:hAnsi="Lora Medium" w:cs="Lora Medium" w:eastAsia="Lora Medium"/>
         </w:rPr>
-        <w:t xml:space="preserve">Quanto ao valor, a gravidade do caso concreto – vício não sanado no prazo legal, troca por aparelho recuperado, reclamação no PROCON, audiência em outra cidade e novo defeito no produto recebido em acordo – justifica indenização acima dos patamares usuais. O TJPI já considerou irrisória a indenização de R$ 3.000,00 em caso de desvio produtivo, majorando-a (AC 0835806-53.2023.8.18.0140, acima citada), e há relator que adota R$ 5.000,00 como parâmetro para vício de produto não solucionado pela assistência técnica (AC 0800277-66.2020.8.18.0046, citada no tópico “d”).</w:t>
+        <w:t xml:space="preserve">Quanto ao valor, a gravidade do caso concreto – produto que já veio com defeito, vício não sanado no prazo legal, troca por aparelho recuperado, reclamação no PROCON, audiência em outra cidade, novo defeito no produto recebido em acordo e ausência de resposta da assistência técnica – justifica indenização acima dos patamares usuais. O TJPI já considerou irrisória a indenização de R$ 3.000,00 em caso de desvio produtivo, majorando-a (AC 0835806-53.2023.8.18.0140, acima citada), e há relator que adota R$ 5.000,00 como parâmetro para vício de produto não solucionado pela assistência técnica (AC 0800277-66.2020.8.18.0046, citada no tópico “d”).</w:t>
       </w:r>
     </w:p>
     <w:p>

</xml_diff>

<commit_message>
Petição Daniela Braga: limita o ajuste dos fatos aos pontos indicados
Co-Authored-By: Claude Opus 5.5 <noreply@anthropic.com>
Claude-Session: https://claude.ai/code/session_01HhnpasVshMdx9Pz9yR41Yv
</commit_message>
<xml_diff>
--- a/Petição inicial - Daniela Braga/Petição inicial revisada - Daniela Braga Pereira.docx
+++ b/Petição inicial - Daniela Braga/Petição inicial revisada - Daniela Braga Pereira.docx
@@ -537,7 +537,7 @@
         <w:rPr>
           <w:rFonts w:ascii="Lora Medium" w:hAnsi="Lora Medium" w:cs="Lora Medium" w:eastAsia="Lora Medium"/>
         </w:rPr>
-        <w:t xml:space="preserve">O produto, contudo, </w:t>
+        <w:t xml:space="preserve">O refrigerador, contudo, </w:t>
       </w:r>
       <w:r>
         <w:rPr>
@@ -551,21 +551,21 @@
         <w:rPr>
           <w:rFonts w:ascii="Lora Medium" w:hAnsi="Lora Medium" w:cs="Lora Medium" w:eastAsia="Lora Medium"/>
         </w:rPr>
-        <w:t xml:space="preserve">: desde os primeiros dias de uso, o refrigerador </w:t>
-      </w:r>
-      <w:r>
-        <w:rPr>
-          <w:rFonts w:ascii="Lora" w:hAnsi="Lora" w:cs="Lora" w:eastAsia="Lora"/>
-          <w:b/>
-          <w:bCs/>
-        </w:rPr>
-        <w:t xml:space="preserve">não refrigerava adequadamente</w:t>
-      </w:r>
-      <w:r>
-        <w:rPr>
-          <w:rFonts w:ascii="Lora Medium" w:hAnsi="Lora Medium" w:cs="Lora Medium" w:eastAsia="Lora Medium"/>
-        </w:rPr>
-        <w:t xml:space="preserve">. A Autora acionou a fabricante e, em 23 de outubro de 2025, o aparelho foi atendido pela assistência técnica por ela indicada, a autorizada Jainara da Rocha Saraiva Ltda. A visita técnica foi realizada, mas o defeito persistiu, e o produto não foi consertado no prazo de 30 dias previsto no art. 18, §1º, do CDC.</w:t>
+        <w:t xml:space="preserve">, pois </w:t>
+      </w:r>
+      <w:r>
+        <w:rPr>
+          <w:rFonts w:ascii="Lora" w:hAnsi="Lora" w:cs="Lora" w:eastAsia="Lora"/>
+          <w:b/>
+          <w:bCs/>
+        </w:rPr>
+        <w:t xml:space="preserve">não refrigerava</w:t>
+      </w:r>
+      <w:r>
+        <w:rPr>
+          <w:rFonts w:ascii="Lora Medium" w:hAnsi="Lora Medium" w:cs="Lora Medium" w:eastAsia="Lora Medium"/>
+        </w:rPr>
+        <w:t xml:space="preserve">, e, em 23 de outubro de 2025, foi encaminhado à assistência técnica indicada pela fabricante, a autorizada Jainara da Rocha Saraiva Ltda. A visita técnica foi realizada, mas o defeito persistiu, e o produto não foi consertado no prazo de 30 dias previsto no art. 18, §1º, do CDC.</w:t>
       </w:r>
     </w:p>
     <w:p>
@@ -1086,7 +1086,7 @@
         <w:rPr>
           <w:rFonts w:ascii="Lora Medium" w:hAnsi="Lora Medium" w:cs="Lora Medium" w:eastAsia="Lora Medium"/>
         </w:rPr>
-        <w:t xml:space="preserve">. A Autora acionou o atendimento oficial da Consul, que encaminhou o caso à mesma assistência técnica autorizada, Jainara da Rocha Saraiva, informando que bastaria à consumidora entrar em contato para agendar a visita </w:t>
+        <w:t xml:space="preserve">. A Autora acionou o atendimento oficial da Consul, que encaminhou o caso à mesma assistência técnica autorizada, Jainara da Rocha Saraiva </w:t>
       </w:r>
       <w:r>
         <w:rPr>
@@ -1101,63 +1101,7 @@
         <w:rPr>
           <w:rFonts w:ascii="Lora Medium" w:hAnsi="Lora Medium" w:cs="Lora Medium" w:eastAsia="Lora Medium"/>
         </w:rPr>
-        <w:t xml:space="preserve">.</w:t>
-      </w:r>
-    </w:p>
-    <w:p>
-      <w:pPr>
-        <w:spacing w:after="60" w:line="360"/>
-        <w:ind w:firstLine="850"/>
-        <w:jc w:val="both"/>
-      </w:pPr>
-      <w:r>
-        <w:rPr>
-          <w:rFonts w:ascii="Lora Medium" w:hAnsi="Lora Medium" w:cs="Lora Medium" w:eastAsia="Lora Medium"/>
-        </w:rPr>
-        <w:t xml:space="preserve">A Autora tentou agendar a visita técnica, inclusive por mensagem, mas </w:t>
-      </w:r>
-      <w:r>
-        <w:rPr>
-          <w:rFonts w:ascii="Lora" w:hAnsi="Lora" w:cs="Lora" w:eastAsia="Lora"/>
-          <w:b/>
-          <w:bCs/>
-        </w:rPr>
-        <w:t xml:space="preserve">não obteve resposta da assistência autorizada</w:t>
-      </w:r>
-      <w:r>
-        <w:rPr>
-          <w:rFonts w:ascii="Lora Medium" w:hAnsi="Lora Medium" w:cs="Lora Medium" w:eastAsia="Lora Medium"/>
-        </w:rPr>
-        <w:t xml:space="preserve">. A visita jamais foi agendada e </w:t>
-      </w:r>
-      <w:r>
-        <w:rPr>
-          <w:rFonts w:ascii="Lora" w:hAnsi="Lora" w:cs="Lora" w:eastAsia="Lora"/>
-          <w:b/>
-          <w:bCs/>
-        </w:rPr>
-        <w:t xml:space="preserve">nenhuma ordem de serviço foi emitida</w:t>
-      </w:r>
-      <w:r>
-        <w:rPr>
-          <w:rFonts w:ascii="Lora Medium" w:hAnsi="Lora Medium" w:cs="Lora Medium" w:eastAsia="Lora Medium"/>
-        </w:rPr>
-        <w:t xml:space="preserve">, de modo que o reparo do novo aparelho sequer foi iniciado por inércia exclusiva da cadeia de fornecimento </w:t>
-      </w:r>
-      <w:r>
-        <w:rPr>
-          <w:rFonts w:ascii="Lora" w:hAnsi="Lora" w:cs="Lora" w:eastAsia="Lora"/>
-          <w:b/>
-          <w:bCs/>
-          <w:shd w:val="clear" w:color="auto" w:fill="FFF200"/>
-        </w:rPr>
-        <w:t xml:space="preserve">[Doc. 12 – mensagens enviadas sem resposta; confirmar datas com a cliente]</w:t>
-      </w:r>
-      <w:r>
-        <w:rPr>
-          <w:rFonts w:ascii="Lora Medium" w:hAnsi="Lora Medium" w:cs="Lora Medium" w:eastAsia="Lora Medium"/>
-        </w:rPr>
-        <w:t xml:space="preserve">.</w:t>
+        <w:t xml:space="preserve">. A visita técnica não foi agendada: a Autora não conseguiu agendá-la, enviou mensagem à assistência, mas não obteve resposta, e nenhuma ordem de serviço foi emitida.</w:t>
       </w:r>
     </w:p>
     <w:p>
@@ -2194,7 +2138,7 @@
         <w:rPr>
           <w:rFonts w:ascii="Lora Medium" w:hAnsi="Lora Medium" w:cs="Lora Medium" w:eastAsia="Lora Medium"/>
         </w:rPr>
-        <w:t xml:space="preserve">Não se diga que a fornecedora não teve oportunidade de sanar o vício do último aparelho. A Autora acionou o atendimento oficial da fabricante e tentou agendar a visita técnica, mas a assistência autorizada não respondeu, não agendou o atendimento nem emitiu ordem de serviço. A ausência de reparo decorreu, portanto, exclusivamente da inércia da cadeia de fornecimento. De todo modo, ainda que assim não fosse, a Autora pode fazer uso imediato da restituição da quantia paga, nos termos do art. 18, §3º, do CDC. Não se pode exigir da consumidora que continue submetendo o produto à assistência técnica indefinidamente, como já decidiu o TJPI:</w:t>
+        <w:t xml:space="preserve">Por isso, ainda que se entenda que a fornecedora não dispôs do prazo de 30 dias para sanar o vício do último aparelho, a Autora pode fazer uso imediato da restituição da quantia paga, nos termos do art. 18, §3º, do CDC. Não se pode exigir da consumidora que continue submetendo o produto à assistência técnica indefinidamente, como já decidiu o TJPI:</w:t>
       </w:r>
     </w:p>
     <w:p>
@@ -2833,7 +2777,7 @@
         <w:rPr>
           <w:rFonts w:ascii="Lora Medium" w:hAnsi="Lora Medium" w:cs="Lora Medium" w:eastAsia="Lora Medium"/>
         </w:rPr>
-        <w:t xml:space="preserve">adquiriu um produto novo, que já veio com defeito e não refrigerava adequadamente;</w:t>
+        <w:t xml:space="preserve">adquiriu um produto novo, que deixou de refrigerar com pouco tempo de uso;</w:t>
       </w:r>
     </w:p>
     <w:p>
@@ -2965,29 +2909,6 @@
           <w:rFonts w:ascii="Lora Medium" w:hAnsi="Lora Medium" w:cs="Lora Medium" w:eastAsia="Lora Medium"/>
         </w:rPr>
         <w:t xml:space="preserve">7.</w:t>
-        <w:tab/>
-      </w:r>
-      <w:r>
-        <w:rPr>
-          <w:rFonts w:ascii="Lora Medium" w:hAnsi="Lora Medium" w:cs="Lora Medium" w:eastAsia="Lora Medium"/>
-        </w:rPr>
-        <w:t xml:space="preserve">tentou agendar nova visita técnica, sem obter sequer resposta da assistência autorizada;</w:t>
-      </w:r>
-    </w:p>
-    <w:p>
-      <w:pPr>
-        <w:tabs>
-          <w:tab w:val="left" w:pos="1000"/>
-        </w:tabs>
-        <w:spacing w:after="60" w:line="360"/>
-        <w:ind w:left="1000" w:hanging="400"/>
-        <w:jc w:val="both"/>
-      </w:pPr>
-      <w:r>
-        <w:rPr>
-          <w:rFonts w:ascii="Lora Medium" w:hAnsi="Lora Medium" w:cs="Lora Medium" w:eastAsia="Lora Medium"/>
-        </w:rPr>
-        <w:t xml:space="preserve">8.</w:t>
         <w:tab/>
       </w:r>
       <w:r>
@@ -3187,7 +3108,7 @@
         <w:rPr>
           <w:rFonts w:ascii="Lora Medium" w:hAnsi="Lora Medium" w:cs="Lora Medium" w:eastAsia="Lora Medium"/>
         </w:rPr>
-        <w:t xml:space="preserve">Quanto ao valor, a gravidade do caso concreto – produto que já veio com defeito, vício não sanado no prazo legal, troca por aparelho recuperado, reclamação no PROCON, audiência em outra cidade, novo defeito no produto recebido em acordo e ausência de resposta da assistência técnica – justifica indenização acima dos patamares usuais. O TJPI já considerou irrisória a indenização de R$ 3.000,00 em caso de desvio produtivo, majorando-a (AC 0835806-53.2023.8.18.0140, acima citada), e há relator que adota R$ 5.000,00 como parâmetro para vício de produto não solucionado pela assistência técnica (AC 0800277-66.2020.8.18.0046, citada no tópico “d”).</w:t>
+        <w:t xml:space="preserve">Quanto ao valor, a gravidade do caso concreto – vício não sanado no prazo legal, troca por aparelho recuperado, reclamação no PROCON, audiência em outra cidade e novo defeito no produto recebido em acordo – justifica indenização acima dos patamares usuais. O TJPI já considerou irrisória a indenização de R$ 3.000,00 em caso de desvio produtivo, majorando-a (AC 0835806-53.2023.8.18.0140, acima citada), e há relator que adota R$ 5.000,00 como parâmetro para vício de produto não solucionado pela assistência técnica (AC 0800277-66.2020.8.18.0046, citada no tópico “d”).</w:t>
       </w:r>
     </w:p>
     <w:p>

</xml_diff>

<commit_message>
Petição Daniela Braga: rebate alegação de recusa de reparo (Docs. 15 e 16)
Co-Authored-By: Claude Opus 5.5 <noreply@anthropic.com>
Claude-Session: https://claude.ai/code/session_01HhnpasVshMdx9Pz9yR41Yv
</commit_message>
<xml_diff>
--- a/Petição inicial - Daniela Braga/Petição inicial revisada - Daniela Braga Pereira.docx
+++ b/Petição inicial - Daniela Braga/Petição inicial revisada - Daniela Braga Pereira.docx
@@ -636,6 +636,77 @@
           <w:rFonts w:ascii="Lora Medium" w:hAnsi="Lora Medium" w:cs="Lora Medium" w:eastAsia="Lora Medium"/>
         </w:rPr>
         <w:t xml:space="preserve">.</w:t>
+      </w:r>
+    </w:p>
+    <w:p>
+      <w:pPr>
+        <w:spacing w:after="60" w:line="360"/>
+        <w:ind w:firstLine="850"/>
+        <w:jc w:val="both"/>
+      </w:pPr>
+      <w:r>
+        <w:rPr>
+          <w:rFonts w:ascii="Lora Medium" w:hAnsi="Lora Medium" w:cs="Lora Medium" w:eastAsia="Lora Medium"/>
+        </w:rPr>
+        <w:t xml:space="preserve">Perante o PROCON, a Whirlpool S.A. chegou a alegar que a consumidora teria recusado o reparo </w:t>
+      </w:r>
+      <w:r>
+        <w:rPr>
+          <w:rFonts w:ascii="Lora" w:hAnsi="Lora" w:cs="Lora" w:eastAsia="Lora"/>
+          <w:b/>
+          <w:bCs/>
+          <w:shd w:val="clear" w:color="auto" w:fill="FFF200"/>
+        </w:rPr>
+        <w:t xml:space="preserve">[Doc. 16 – defesa da Whirlpool no PROCON]</w:t>
+      </w:r>
+      <w:r>
+        <w:rPr>
+          <w:rFonts w:ascii="Lora Medium" w:hAnsi="Lora Medium" w:cs="Lora Medium" w:eastAsia="Lora Medium"/>
+        </w:rPr>
+        <w:t xml:space="preserve">. A alegação, além de contrariada pelos próprios registros da fabricante, é irrelevante. O sistema anexado pela própria Whirlpool à sua defesa aponta que a “</w:t>
+      </w:r>
+      <w:r>
+        <w:rPr>
+          <w:rFonts w:ascii="Lora" w:hAnsi="Lora" w:cs="Lora" w:eastAsia="Lora"/>
+          <w:b/>
+          <w:bCs/>
+        </w:rPr>
+        <w:t xml:space="preserve">autorizada não solucionou na primeira visita</w:t>
+      </w:r>
+      <w:r>
+        <w:rPr>
+          <w:rFonts w:ascii="Lora Medium" w:hAnsi="Lora Medium" w:cs="Lora Medium" w:eastAsia="Lora Medium"/>
+        </w:rPr>
+        <w:t xml:space="preserve">”, e a ordem de serviço da assistência técnica registra, em 06/11/2025, que as “</w:t>
+      </w:r>
+      <w:r>
+        <w:rPr>
+          <w:rFonts w:ascii="Lora" w:hAnsi="Lora" w:cs="Lora" w:eastAsia="Lora"/>
+          <w:b/>
+          <w:bCs/>
+        </w:rPr>
+        <w:t xml:space="preserve">peças estão pendentes na fábrica</w:t>
+      </w:r>
+      <w:r>
+        <w:rPr>
+          <w:rFonts w:ascii="Lora Medium" w:hAnsi="Lora Medium" w:cs="Lora Medium" w:eastAsia="Lora Medium"/>
+        </w:rPr>
+        <w:t xml:space="preserve">” </w:t>
+      </w:r>
+      <w:r>
+        <w:rPr>
+          <w:rFonts w:ascii="Lora" w:hAnsi="Lora" w:cs="Lora" w:eastAsia="Lora"/>
+          <w:b/>
+          <w:bCs/>
+          <w:shd w:val="clear" w:color="auto" w:fill="FFF200"/>
+        </w:rPr>
+        <w:t xml:space="preserve">[Doc. 15 – ordem de serviço nº 7014975280]</w:t>
+      </w:r>
+      <w:r>
+        <w:rPr>
+          <w:rFonts w:ascii="Lora Medium" w:hAnsi="Lora Medium" w:cs="Lora Medium" w:eastAsia="Lora Medium"/>
+        </w:rPr>
+        <w:t xml:space="preserve">. Ademais, esgotado o prazo de 30 dias sem que o vício fosse sanado, cabia à consumidora escolher entre as alternativas do art. 18, §1º, do CDC, não lhe podendo ser imposto novo reparo. Tanto assim que a própria fabricante, em seguida, promoveu a troca do produto “em garantia”.</w:t>
       </w:r>
     </w:p>
     <w:p>
@@ -1704,7 +1775,7 @@
         <w:rPr>
           <w:rFonts w:ascii="Lora Medium" w:hAnsi="Lora Medium" w:cs="Lora Medium" w:eastAsia="Lora Medium"/>
         </w:rPr>
-        <w:t xml:space="preserve">Antes disso, o defeito original não foi sanado pela assistência técnica no prazo de 30 dias, como reconheceu a própria fabricante em sua resposta ao PROCON. E a segunda troca, acordada no PROCON, também não solucionou o problema. O prazo legal, ademais, não se renova a cada nova tentativa de reparo:</w:t>
+        <w:t xml:space="preserve">Antes disso, o defeito original não foi sanado pela assistência técnica no prazo de 30 dias, como reconheceu a própria fabricante em sua resposta ao PROCON, o que decorreu da falta de peças na fábrica, e não de qualquer conduta da consumidora (Doc. 15). E a segunda troca, acordada no PROCON, também não solucionou o problema. O prazo legal, ademais, não se renova a cada nova tentativa de reparo:</w:t>
       </w:r>
     </w:p>
     <w:p>
@@ -4203,7 +4274,41 @@
           <w:szCs w:val="22"/>
           <w:shd w:val="clear" w:color="auto" w:fill="FFF200"/>
         </w:rPr>
-        <w:t xml:space="preserve">[Doc. 14 – Comprovantes das despesas (se mantido o pedido de danos materiais).]</w:t>
+        <w:t xml:space="preserve">[Doc. 14 – Comprovantes das despesas (se mantido o pedido de danos materiais);]</w:t>
+      </w:r>
+    </w:p>
+    <w:p>
+      <w:pPr>
+        <w:spacing w:after="0" w:line="300"/>
+        <w:ind w:left="850"/>
+      </w:pPr>
+      <w:r>
+        <w:rPr>
+          <w:rFonts w:ascii="Lora" w:hAnsi="Lora" w:cs="Lora" w:eastAsia="Lora"/>
+          <w:b/>
+          <w:bCs/>
+          <w:sz w:val="22"/>
+          <w:szCs w:val="22"/>
+          <w:shd w:val="clear" w:color="auto" w:fill="FFF200"/>
+        </w:rPr>
+        <w:t xml:space="preserve">[Doc. 15 – Ordem de serviço nº 7014975280 (Jainara da Rocha Saraiva);]</w:t>
+      </w:r>
+    </w:p>
+    <w:p>
+      <w:pPr>
+        <w:spacing w:after="0" w:line="300"/>
+        <w:ind w:left="850"/>
+      </w:pPr>
+      <w:r>
+        <w:rPr>
+          <w:rFonts w:ascii="Lora" w:hAnsi="Lora" w:cs="Lora" w:eastAsia="Lora"/>
+          <w:b/>
+          <w:bCs/>
+          <w:sz w:val="22"/>
+          <w:szCs w:val="22"/>
+          <w:shd w:val="clear" w:color="auto" w:fill="FFF200"/>
+        </w:rPr>
+        <w:t xml:space="preserve">[Doc. 16 – Defesa da Whirlpool S.A. no PROCON (02/03/2026).]</w:t>
       </w:r>
     </w:p>
     <w:p/>

</xml_diff>